<commit_message>
revert: remove logout feature as requested, keep clean original spec
</commit_message>
<xml_diff>
--- a/B24DCCC157_Do_Quoc_Khanh_BaoCao_Flutter.docx
+++ b/B24DCCC157_Do_Quoc_Khanh_BaoCao_Flutter.docx
@@ -1,6 +1,6 @@
 
 <file path=word/document.xml><?xml version="1.0" encoding="utf-8"?>
-<w:document xmlns:w="http://schemas.openxmlformats.org/wordprocessingml/2006/main" xmlns:r="http://schemas.openxmlformats.org/officeDocument/2006/relationships" xmlns:m="http://schemas.openxmlformats.org/officeDocument/2006/math" xmlns:v="urn:schemas-microsoft-com:vml" xmlns:wp="http://schemas.openxmlformats.org/drawingml/2006/wordprocessingDrawing" xmlns:w10="urn:schemas-microsoft-com:office:word" xmlns:a="http://schemas.openxmlformats.org/drawingml/2006/main" xmlns:pic="http://schemas.openxmlformats.org/drawingml/2006/picture">
+<w:document xmlns:wpc="http://schemas.microsoft.com/office/word/2010/wordprocessingCanvas" xmlns:cx="http://schemas.microsoft.com/office/drawing/2014/chartex" xmlns:cx1="http://schemas.microsoft.com/office/drawing/2015/9/8/chartex" xmlns:cx2="http://schemas.microsoft.com/office/drawing/2015/10/21/chartex" xmlns:cx3="http://schemas.microsoft.com/office/drawing/2016/5/9/chartex" xmlns:cx4="http://schemas.microsoft.com/office/drawing/2016/5/10/chartex" xmlns:cx5="http://schemas.microsoft.com/office/drawing/2016/5/11/chartex" xmlns:cx6="http://schemas.microsoft.com/office/drawing/2016/5/12/chartex" xmlns:cx7="http://schemas.microsoft.com/office/drawing/2016/5/13/chartex" xmlns:cx8="http://schemas.microsoft.com/office/drawing/2016/5/14/chartex" xmlns:mc="http://schemas.openxmlformats.org/markup-compatibility/2006" xmlns:o="urn:schemas-microsoft-com:office:office" xmlns:r="http://schemas.openxmlformats.org/officeDocument/2006/relationships" xmlns:m="http://schemas.openxmlformats.org/officeDocument/2006/math" xmlns:v="urn:schemas-microsoft-com:vml" xmlns:wp14="http://schemas.microsoft.com/office/word/2010/wordprocessingDrawing" xmlns:wp="http://schemas.openxmlformats.org/drawingml/2006/wordprocessingDrawing" xmlns:w="http://schemas.openxmlformats.org/wordprocessingml/2006/main" xmlns:w14="http://schemas.microsoft.com/office/word/2010/wordml" xmlns:w10="urn:schemas-microsoft-com:office:word" xmlns:w15="http://schemas.microsoft.com/office/word/2012/wordml" xmlns:wpg="http://schemas.microsoft.com/office/word/2010/wordprocessingGroup" xmlns:wpi="http://schemas.microsoft.com/office/word/2010/wordprocessingInk" xmlns:wne="http://schemas.microsoft.com/office/word/2006/wordml" xmlns:wps="http://schemas.microsoft.com/office/word/2010/wordprocessingShape" xmlns:wpsCustomData="http://www.wps.cn/officeDocument/2013/wpsCustomData" mc:Ignorable="w14 w15 wp14">
   <w:body>
     <w:p>
       <w:pPr>
@@ -10,13 +10,13 @@
       <w:r>
         <w:rPr>
           <w:rFonts w:ascii="Arial" w:hAnsi="Arial" w:cs="Arial"/>
+          <w:b/>
+          <w:bCs/>
+          <w:color w:val="1A56DB"/>
           <w:sz w:val="28"/>
           <w:szCs w:val="28"/>
-          <w:b/>
-          <w:bCs/>
-          <w:color w:val="1A56DB"/>
-        </w:rPr>
-        <w:t xml:space="preserve">HỌC VIỆN CÔNG NGHỆ BƯU CHÍNH VIỄN THÔNG</w:t>
+        </w:rPr>
+        <w:t>HỌC VIỆN CÔNG NGHỆ BƯU CHÍNH VIỄN THÔNG</w:t>
       </w:r>
     </w:p>
     <w:p>
@@ -27,13 +27,13 @@
       <w:r>
         <w:rPr>
           <w:rFonts w:ascii="Arial" w:hAnsi="Arial" w:cs="Arial"/>
+          <w:b/>
+          <w:bCs/>
+          <w:color w:val="64748B"/>
           <w:sz w:val="22"/>
           <w:szCs w:val="22"/>
-          <w:b/>
-          <w:bCs/>
-          <w:color w:val="64748B"/>
-        </w:rPr>
-        <w:t xml:space="preserve">KHOA CÔNG NGHỆ THÔNG TIN - BỘ MÔN CÔNG NGHỆ PHẦN MỀM</w:t>
+        </w:rPr>
+        <w:t>KHOA CÔNG NGHỆ THÔNG TIN - BỘ MÔN CÔNG NGHỆ PHẦN MỀM</w:t>
       </w:r>
     </w:p>
     <w:p>
@@ -44,13 +44,13 @@
       <w:r>
         <w:rPr>
           <w:rFonts w:ascii="Arial" w:hAnsi="Arial" w:cs="Arial"/>
+          <w:b/>
+          <w:bCs/>
+          <w:color w:val="1E429F"/>
           <w:sz w:val="38"/>
           <w:szCs w:val="38"/>
-          <w:b/>
-          <w:bCs/>
-          <w:color w:val="1E429F"/>
-        </w:rPr>
-        <w:t xml:space="preserve">BÁO CÁO BÀI TẬP LẬP TRÌNH DI ĐỘNG</w:t>
+        </w:rPr>
+        <w:t>BÁO CÁO BÀI TẬP LẬP TRÌNH DI ĐỘNG</w:t>
       </w:r>
     </w:p>
     <w:p>
@@ -61,31 +61,60 @@
       <w:r>
         <w:rPr>
           <w:rFonts w:ascii="Arial" w:hAnsi="Arial" w:cs="Arial"/>
+          <w:b/>
+          <w:bCs/>
+          <w:color w:val="0E9F6E"/>
           <w:sz w:val="28"/>
           <w:szCs w:val="28"/>
-          <w:b/>
-          <w:bCs/>
-          <w:color w:val="0E9F6E"/>
-        </w:rPr>
-        <w:t xml:space="preserve">ĐỀ TÀI: XÂY DỰNG ỨNG DỤNG QUẢN LÝ DANH BẠ LIÊN HỆ</w:t>
+        </w:rPr>
+        <w:t>ĐỀ TÀI: XÂY DỰNG ỨNG DỤNG QUẢN LÝ DANH BẠ LIÊN HỆ</w:t>
       </w:r>
     </w:p>
     <w:tbl>
       <w:tblPr>
+        <w:tblStyle w:val="9"/>
         <w:tblW w:w="9360" w:type="dxa"/>
+        <w:jc w:val="center"/>
         <w:tblBorders>
-          <w:top w:val="single" w:sz="4" w:space="0" w:color="CCCCCC"/>
-          <w:left w:val="single" w:sz="4" w:space="0" w:color="CCCCCC"/>
-          <w:bottom w:val="single" w:sz="4" w:space="0" w:color="CCCCCC"/>
-          <w:right w:val="single" w:sz="4" w:space="0" w:color="CCCCCC"/>
-          <w:insideH w:val="single" w:sz="4" w:space="0" w:color="E2E8F0"/>
-          <w:insideV w:val="single" w:sz="4" w:space="0" w:color="E2E8F0"/>
+          <w:top w:val="single" w:color="CCCCCC" w:sz="4" w:space="0"/>
+          <w:left w:val="single" w:color="CCCCCC" w:sz="4" w:space="0"/>
+          <w:bottom w:val="single" w:color="CCCCCC" w:sz="4" w:space="0"/>
+          <w:right w:val="single" w:color="CCCCCC" w:sz="4" w:space="0"/>
+          <w:insideH w:val="single" w:color="E2E8F0" w:sz="4" w:space="0"/>
+          <w:insideV w:val="single" w:color="E2E8F0" w:sz="4" w:space="0"/>
         </w:tblBorders>
-        <w:jc w:val="center"/>
+        <w:tblLayout w:type="autofit"/>
+        <w:tblCellMar>
+          <w:top w:w="0" w:type="dxa"/>
+          <w:left w:w="10" w:type="dxa"/>
+          <w:bottom w:w="0" w:type="dxa"/>
+          <w:right w:w="10" w:type="dxa"/>
+        </w:tblCellMar>
       </w:tblPr>
+      <w:tblGrid>
+        <w:gridCol w:w="3000"/>
+        <w:gridCol w:w="6360"/>
+      </w:tblGrid>
       <w:tr>
+        <w:tblPrEx>
+          <w:tblBorders>
+            <w:top w:val="single" w:color="CCCCCC" w:sz="4" w:space="0"/>
+            <w:left w:val="single" w:color="CCCCCC" w:sz="4" w:space="0"/>
+            <w:bottom w:val="single" w:color="CCCCCC" w:sz="4" w:space="0"/>
+            <w:right w:val="single" w:color="CCCCCC" w:sz="4" w:space="0"/>
+            <w:insideH w:val="single" w:color="E2E8F0" w:sz="4" w:space="0"/>
+            <w:insideV w:val="single" w:color="E2E8F0" w:sz="4" w:space="0"/>
+          </w:tblBorders>
+          <w:tblCellMar>
+            <w:top w:w="0" w:type="dxa"/>
+            <w:left w:w="10" w:type="dxa"/>
+            <w:bottom w:w="0" w:type="dxa"/>
+            <w:right w:w="10" w:type="dxa"/>
+          </w:tblCellMar>
+        </w:tblPrEx>
         <w:trPr>
           <w:tblHeader/>
+          <w:jc w:val="center"/>
         </w:trPr>
         <w:tc>
           <w:tcPr>
@@ -93,24 +122,24 @@
             <w:shd w:val="clear" w:color="auto" w:fill="E1EFFE"/>
             <w:tcMar>
               <w:top w:w="120" w:type="dxa"/>
+              <w:left w:w="160" w:type="dxa"/>
               <w:bottom w:w="120" w:type="dxa"/>
-              <w:left w:w="160" w:type="dxa"/>
               <w:right w:w="160" w:type="dxa"/>
             </w:tcMar>
           </w:tcPr>
           <w:p>
             <w:pPr>
+              <w:spacing w:before="60" w:after="60"/>
               <w:jc w:val="center"/>
-              <w:spacing w:before="60" w:after="60"/>
             </w:pPr>
             <w:r>
               <w:rPr>
                 <w:rFonts w:ascii="Arial" w:hAnsi="Arial"/>
                 <w:b/>
                 <w:bCs/>
-                <w:sz w:val="22"/>
-                <w:szCs w:val="22"/>
                 <w:color w:val="1E429F"/>
+                <w:sz w:val="22"/>
+                <w:szCs w:val="22"/>
               </w:rPr>
               <w:t>Thông tin</w:t>
             </w:r>
@@ -122,24 +151,24 @@
             <w:shd w:val="clear" w:color="auto" w:fill="E1EFFE"/>
             <w:tcMar>
               <w:top w:w="120" w:type="dxa"/>
+              <w:left w:w="160" w:type="dxa"/>
               <w:bottom w:w="120" w:type="dxa"/>
-              <w:left w:w="160" w:type="dxa"/>
               <w:right w:w="160" w:type="dxa"/>
             </w:tcMar>
           </w:tcPr>
           <w:p>
             <w:pPr>
+              <w:spacing w:before="60" w:after="60"/>
               <w:jc w:val="center"/>
-              <w:spacing w:before="60" w:after="60"/>
             </w:pPr>
             <w:r>
               <w:rPr>
                 <w:rFonts w:ascii="Arial" w:hAnsi="Arial"/>
                 <w:b/>
                 <w:bCs/>
-                <w:sz w:val="22"/>
-                <w:szCs w:val="22"/>
                 <w:color w:val="1E429F"/>
+                <w:sz w:val="22"/>
+                <w:szCs w:val="22"/>
               </w:rPr>
               <w:t>Chi tiết</w:t>
             </w:r>
@@ -147,14 +176,33 @@
         </w:tc>
       </w:tr>
       <w:tr>
+        <w:tblPrEx>
+          <w:tblBorders>
+            <w:top w:val="single" w:color="CCCCCC" w:sz="4" w:space="0"/>
+            <w:left w:val="single" w:color="CCCCCC" w:sz="4" w:space="0"/>
+            <w:bottom w:val="single" w:color="CCCCCC" w:sz="4" w:space="0"/>
+            <w:right w:val="single" w:color="CCCCCC" w:sz="4" w:space="0"/>
+            <w:insideH w:val="single" w:color="E2E8F0" w:sz="4" w:space="0"/>
+            <w:insideV w:val="single" w:color="E2E8F0" w:sz="4" w:space="0"/>
+          </w:tblBorders>
+          <w:tblCellMar>
+            <w:top w:w="0" w:type="dxa"/>
+            <w:left w:w="10" w:type="dxa"/>
+            <w:bottom w:w="0" w:type="dxa"/>
+            <w:right w:w="10" w:type="dxa"/>
+          </w:tblCellMar>
+        </w:tblPrEx>
+        <w:trPr>
+          <w:jc w:val="center"/>
+        </w:trPr>
         <w:tc>
           <w:tcPr>
             <w:tcW w:w="3000" w:type="dxa"/>
             <w:shd w:val="clear" w:color="auto" w:fill="FFFFFF"/>
             <w:tcMar>
               <w:top w:w="100" w:type="dxa"/>
+              <w:left w:w="140" w:type="dxa"/>
               <w:bottom w:w="100" w:type="dxa"/>
-              <w:left w:w="140" w:type="dxa"/>
               <w:right w:w="140" w:type="dxa"/>
             </w:tcMar>
           </w:tcPr>
@@ -165,9 +213,9 @@
             <w:r>
               <w:rPr>
                 <w:rFonts w:ascii="Arial" w:hAnsi="Arial"/>
-                <w:sz w:val="22"/>
-                <w:szCs w:val="22"/>
                 <w:color w:val="0F172A"/>
+                <w:sz w:val="22"/>
+                <w:szCs w:val="22"/>
               </w:rPr>
               <w:t>Họ và tên sinh viên</w:t>
             </w:r>
@@ -179,8 +227,8 @@
             <w:shd w:val="clear" w:color="auto" w:fill="FFFFFF"/>
             <w:tcMar>
               <w:top w:w="100" w:type="dxa"/>
+              <w:left w:w="140" w:type="dxa"/>
               <w:bottom w:w="100" w:type="dxa"/>
-              <w:left w:w="140" w:type="dxa"/>
               <w:right w:w="140" w:type="dxa"/>
             </w:tcMar>
           </w:tcPr>
@@ -191,9 +239,9 @@
             <w:r>
               <w:rPr>
                 <w:rFonts w:ascii="Arial" w:hAnsi="Arial"/>
-                <w:sz w:val="22"/>
-                <w:szCs w:val="22"/>
                 <w:color w:val="0F172A"/>
+                <w:sz w:val="22"/>
+                <w:szCs w:val="22"/>
               </w:rPr>
               <w:t>Đỗ Quốc Khánh</w:t>
             </w:r>
@@ -201,14 +249,33 @@
         </w:tc>
       </w:tr>
       <w:tr>
+        <w:tblPrEx>
+          <w:tblBorders>
+            <w:top w:val="single" w:color="CCCCCC" w:sz="4" w:space="0"/>
+            <w:left w:val="single" w:color="CCCCCC" w:sz="4" w:space="0"/>
+            <w:bottom w:val="single" w:color="CCCCCC" w:sz="4" w:space="0"/>
+            <w:right w:val="single" w:color="CCCCCC" w:sz="4" w:space="0"/>
+            <w:insideH w:val="single" w:color="E2E8F0" w:sz="4" w:space="0"/>
+            <w:insideV w:val="single" w:color="E2E8F0" w:sz="4" w:space="0"/>
+          </w:tblBorders>
+          <w:tblCellMar>
+            <w:top w:w="0" w:type="dxa"/>
+            <w:left w:w="10" w:type="dxa"/>
+            <w:bottom w:w="0" w:type="dxa"/>
+            <w:right w:w="10" w:type="dxa"/>
+          </w:tblCellMar>
+        </w:tblPrEx>
+        <w:trPr>
+          <w:jc w:val="center"/>
+        </w:trPr>
         <w:tc>
           <w:tcPr>
             <w:tcW w:w="3000" w:type="dxa"/>
             <w:shd w:val="clear" w:color="auto" w:fill="F8FAFC"/>
             <w:tcMar>
               <w:top w:w="100" w:type="dxa"/>
+              <w:left w:w="140" w:type="dxa"/>
               <w:bottom w:w="100" w:type="dxa"/>
-              <w:left w:w="140" w:type="dxa"/>
               <w:right w:w="140" w:type="dxa"/>
             </w:tcMar>
           </w:tcPr>
@@ -219,9 +286,9 @@
             <w:r>
               <w:rPr>
                 <w:rFonts w:ascii="Arial" w:hAnsi="Arial"/>
-                <w:sz w:val="22"/>
-                <w:szCs w:val="22"/>
                 <w:color w:val="0F172A"/>
+                <w:sz w:val="22"/>
+                <w:szCs w:val="22"/>
               </w:rPr>
               <w:t>Mã sinh viên (MSSV)</w:t>
             </w:r>
@@ -233,8 +300,8 @@
             <w:shd w:val="clear" w:color="auto" w:fill="F8FAFC"/>
             <w:tcMar>
               <w:top w:w="100" w:type="dxa"/>
+              <w:left w:w="140" w:type="dxa"/>
               <w:bottom w:w="100" w:type="dxa"/>
-              <w:left w:w="140" w:type="dxa"/>
               <w:right w:w="140" w:type="dxa"/>
             </w:tcMar>
           </w:tcPr>
@@ -245,9 +312,9 @@
             <w:r>
               <w:rPr>
                 <w:rFonts w:ascii="Arial" w:hAnsi="Arial"/>
-                <w:sz w:val="22"/>
-                <w:szCs w:val="22"/>
                 <w:color w:val="0F172A"/>
+                <w:sz w:val="22"/>
+                <w:szCs w:val="22"/>
               </w:rPr>
               <w:t>B24DCCC157</w:t>
             </w:r>
@@ -255,14 +322,33 @@
         </w:tc>
       </w:tr>
       <w:tr>
+        <w:tblPrEx>
+          <w:tblBorders>
+            <w:top w:val="single" w:color="CCCCCC" w:sz="4" w:space="0"/>
+            <w:left w:val="single" w:color="CCCCCC" w:sz="4" w:space="0"/>
+            <w:bottom w:val="single" w:color="CCCCCC" w:sz="4" w:space="0"/>
+            <w:right w:val="single" w:color="CCCCCC" w:sz="4" w:space="0"/>
+            <w:insideH w:val="single" w:color="E2E8F0" w:sz="4" w:space="0"/>
+            <w:insideV w:val="single" w:color="E2E8F0" w:sz="4" w:space="0"/>
+          </w:tblBorders>
+          <w:tblCellMar>
+            <w:top w:w="0" w:type="dxa"/>
+            <w:left w:w="10" w:type="dxa"/>
+            <w:bottom w:w="0" w:type="dxa"/>
+            <w:right w:w="10" w:type="dxa"/>
+          </w:tblCellMar>
+        </w:tblPrEx>
+        <w:trPr>
+          <w:jc w:val="center"/>
+        </w:trPr>
         <w:tc>
           <w:tcPr>
             <w:tcW w:w="3000" w:type="dxa"/>
             <w:shd w:val="clear" w:color="auto" w:fill="FFFFFF"/>
             <w:tcMar>
               <w:top w:w="100" w:type="dxa"/>
+              <w:left w:w="140" w:type="dxa"/>
               <w:bottom w:w="100" w:type="dxa"/>
-              <w:left w:w="140" w:type="dxa"/>
               <w:right w:w="140" w:type="dxa"/>
             </w:tcMar>
           </w:tcPr>
@@ -273,9 +359,9 @@
             <w:r>
               <w:rPr>
                 <w:rFonts w:ascii="Arial" w:hAnsi="Arial"/>
-                <w:sz w:val="22"/>
-                <w:szCs w:val="22"/>
                 <w:color w:val="0F172A"/>
+                <w:sz w:val="22"/>
+                <w:szCs w:val="22"/>
               </w:rPr>
               <w:t>Lớp học phần</w:t>
             </w:r>
@@ -287,8 +373,8 @@
             <w:shd w:val="clear" w:color="auto" w:fill="FFFFFF"/>
             <w:tcMar>
               <w:top w:w="100" w:type="dxa"/>
+              <w:left w:w="140" w:type="dxa"/>
               <w:bottom w:w="100" w:type="dxa"/>
-              <w:left w:w="140" w:type="dxa"/>
               <w:right w:w="140" w:type="dxa"/>
             </w:tcMar>
           </w:tcPr>
@@ -299,9 +385,9 @@
             <w:r>
               <w:rPr>
                 <w:rFonts w:ascii="Arial" w:hAnsi="Arial"/>
-                <w:sz w:val="22"/>
-                <w:szCs w:val="22"/>
                 <w:color w:val="0F172A"/>
+                <w:sz w:val="22"/>
+                <w:szCs w:val="22"/>
               </w:rPr>
               <w:t>Lập trình ứng dụng di động</w:t>
             </w:r>
@@ -309,14 +395,33 @@
         </w:tc>
       </w:tr>
       <w:tr>
+        <w:tblPrEx>
+          <w:tblBorders>
+            <w:top w:val="single" w:color="CCCCCC" w:sz="4" w:space="0"/>
+            <w:left w:val="single" w:color="CCCCCC" w:sz="4" w:space="0"/>
+            <w:bottom w:val="single" w:color="CCCCCC" w:sz="4" w:space="0"/>
+            <w:right w:val="single" w:color="CCCCCC" w:sz="4" w:space="0"/>
+            <w:insideH w:val="single" w:color="E2E8F0" w:sz="4" w:space="0"/>
+            <w:insideV w:val="single" w:color="E2E8F0" w:sz="4" w:space="0"/>
+          </w:tblBorders>
+          <w:tblCellMar>
+            <w:top w:w="0" w:type="dxa"/>
+            <w:left w:w="10" w:type="dxa"/>
+            <w:bottom w:w="0" w:type="dxa"/>
+            <w:right w:w="10" w:type="dxa"/>
+          </w:tblCellMar>
+        </w:tblPrEx>
+        <w:trPr>
+          <w:jc w:val="center"/>
+        </w:trPr>
         <w:tc>
           <w:tcPr>
             <w:tcW w:w="3000" w:type="dxa"/>
             <w:shd w:val="clear" w:color="auto" w:fill="F8FAFC"/>
             <w:tcMar>
               <w:top w:w="100" w:type="dxa"/>
+              <w:left w:w="140" w:type="dxa"/>
               <w:bottom w:w="100" w:type="dxa"/>
-              <w:left w:w="140" w:type="dxa"/>
               <w:right w:w="140" w:type="dxa"/>
             </w:tcMar>
           </w:tcPr>
@@ -327,9 +432,9 @@
             <w:r>
               <w:rPr>
                 <w:rFonts w:ascii="Arial" w:hAnsi="Arial"/>
-                <w:sz w:val="22"/>
-                <w:szCs w:val="22"/>
                 <w:color w:val="0F172A"/>
+                <w:sz w:val="22"/>
+                <w:szCs w:val="22"/>
               </w:rPr>
               <w:t>Nền tảng phát triển</w:t>
             </w:r>
@@ -341,8 +446,8 @@
             <w:shd w:val="clear" w:color="auto" w:fill="F8FAFC"/>
             <w:tcMar>
               <w:top w:w="100" w:type="dxa"/>
+              <w:left w:w="140" w:type="dxa"/>
               <w:bottom w:w="100" w:type="dxa"/>
-              <w:left w:w="140" w:type="dxa"/>
               <w:right w:w="140" w:type="dxa"/>
             </w:tcMar>
           </w:tcPr>
@@ -353,9 +458,9 @@
             <w:r>
               <w:rPr>
                 <w:rFonts w:ascii="Arial" w:hAnsi="Arial"/>
-                <w:sz w:val="22"/>
-                <w:szCs w:val="22"/>
                 <w:color w:val="0F172A"/>
+                <w:sz w:val="22"/>
+                <w:szCs w:val="22"/>
               </w:rPr>
               <w:t>Flutter (Dart 3.13, Material 3, Cross-platform)</w:t>
             </w:r>
@@ -363,14 +468,33 @@
         </w:tc>
       </w:tr>
       <w:tr>
+        <w:tblPrEx>
+          <w:tblBorders>
+            <w:top w:val="single" w:color="CCCCCC" w:sz="4" w:space="0"/>
+            <w:left w:val="single" w:color="CCCCCC" w:sz="4" w:space="0"/>
+            <w:bottom w:val="single" w:color="CCCCCC" w:sz="4" w:space="0"/>
+            <w:right w:val="single" w:color="CCCCCC" w:sz="4" w:space="0"/>
+            <w:insideH w:val="single" w:color="E2E8F0" w:sz="4" w:space="0"/>
+            <w:insideV w:val="single" w:color="E2E8F0" w:sz="4" w:space="0"/>
+          </w:tblBorders>
+          <w:tblCellMar>
+            <w:top w:w="0" w:type="dxa"/>
+            <w:left w:w="10" w:type="dxa"/>
+            <w:bottom w:w="0" w:type="dxa"/>
+            <w:right w:w="10" w:type="dxa"/>
+          </w:tblCellMar>
+        </w:tblPrEx>
+        <w:trPr>
+          <w:jc w:val="center"/>
+        </w:trPr>
         <w:tc>
           <w:tcPr>
             <w:tcW w:w="3000" w:type="dxa"/>
             <w:shd w:val="clear" w:color="auto" w:fill="FFFFFF"/>
             <w:tcMar>
               <w:top w:w="100" w:type="dxa"/>
+              <w:left w:w="140" w:type="dxa"/>
               <w:bottom w:w="100" w:type="dxa"/>
-              <w:left w:w="140" w:type="dxa"/>
               <w:right w:w="140" w:type="dxa"/>
             </w:tcMar>
           </w:tcPr>
@@ -381,9 +505,9 @@
             <w:r>
               <w:rPr>
                 <w:rFonts w:ascii="Arial" w:hAnsi="Arial"/>
-                <w:sz w:val="22"/>
-                <w:szCs w:val="22"/>
                 <w:color w:val="0F172A"/>
+                <w:sz w:val="22"/>
+                <w:szCs w:val="22"/>
               </w:rPr>
               <w:t>Git Repository</w:t>
             </w:r>
@@ -395,8 +519,8 @@
             <w:shd w:val="clear" w:color="auto" w:fill="FFFFFF"/>
             <w:tcMar>
               <w:top w:w="100" w:type="dxa"/>
+              <w:left w:w="140" w:type="dxa"/>
               <w:bottom w:w="100" w:type="dxa"/>
-              <w:left w:w="140" w:type="dxa"/>
               <w:right w:w="140" w:type="dxa"/>
             </w:tcMar>
           </w:tcPr>
@@ -407,9 +531,9 @@
             <w:r>
               <w:rPr>
                 <w:rFonts w:ascii="Arial" w:hAnsi="Arial"/>
-                <w:sz w:val="22"/>
-                <w:szCs w:val="22"/>
                 <w:color w:val="0F172A"/>
+                <w:sz w:val="22"/>
+                <w:szCs w:val="22"/>
               </w:rPr>
               <w:t>https://github.com/khanhdo-ptit/B24DCCC157_Do_Quoc_Khanh_QuanLyDanhBa</w:t>
             </w:r>
@@ -417,14 +541,33 @@
         </w:tc>
       </w:tr>
       <w:tr>
+        <w:tblPrEx>
+          <w:tblBorders>
+            <w:top w:val="single" w:color="CCCCCC" w:sz="4" w:space="0"/>
+            <w:left w:val="single" w:color="CCCCCC" w:sz="4" w:space="0"/>
+            <w:bottom w:val="single" w:color="CCCCCC" w:sz="4" w:space="0"/>
+            <w:right w:val="single" w:color="CCCCCC" w:sz="4" w:space="0"/>
+            <w:insideH w:val="single" w:color="E2E8F0" w:sz="4" w:space="0"/>
+            <w:insideV w:val="single" w:color="E2E8F0" w:sz="4" w:space="0"/>
+          </w:tblBorders>
+          <w:tblCellMar>
+            <w:top w:w="0" w:type="dxa"/>
+            <w:left w:w="10" w:type="dxa"/>
+            <w:bottom w:w="0" w:type="dxa"/>
+            <w:right w:w="10" w:type="dxa"/>
+          </w:tblCellMar>
+        </w:tblPrEx>
+        <w:trPr>
+          <w:jc w:val="center"/>
+        </w:trPr>
         <w:tc>
           <w:tcPr>
             <w:tcW w:w="3000" w:type="dxa"/>
             <w:shd w:val="clear" w:color="auto" w:fill="F8FAFC"/>
             <w:tcMar>
               <w:top w:w="100" w:type="dxa"/>
+              <w:left w:w="140" w:type="dxa"/>
               <w:bottom w:w="100" w:type="dxa"/>
-              <w:left w:w="140" w:type="dxa"/>
               <w:right w:w="140" w:type="dxa"/>
             </w:tcMar>
           </w:tcPr>
@@ -435,9 +578,9 @@
             <w:r>
               <w:rPr>
                 <w:rFonts w:ascii="Arial" w:hAnsi="Arial"/>
-                <w:sz w:val="22"/>
-                <w:szCs w:val="22"/>
                 <w:color w:val="0F172A"/>
+                <w:sz w:val="22"/>
+                <w:szCs w:val="22"/>
               </w:rPr>
               <w:t>Ngày hoàn thành</w:t>
             </w:r>
@@ -449,8 +592,8 @@
             <w:shd w:val="clear" w:color="auto" w:fill="F8FAFC"/>
             <w:tcMar>
               <w:top w:w="100" w:type="dxa"/>
+              <w:left w:w="140" w:type="dxa"/>
               <w:bottom w:w="100" w:type="dxa"/>
-              <w:left w:w="140" w:type="dxa"/>
               <w:right w:w="140" w:type="dxa"/>
             </w:tcMar>
           </w:tcPr>
@@ -461,9 +604,9 @@
             <w:r>
               <w:rPr>
                 <w:rFonts w:ascii="Arial" w:hAnsi="Arial"/>
-                <w:sz w:val="22"/>
-                <w:szCs w:val="22"/>
                 <w:color w:val="0F172A"/>
+                <w:sz w:val="22"/>
+                <w:szCs w:val="22"/>
               </w:rPr>
               <w:t>28/10/2026</w:t>
             </w:r>
@@ -475,30 +618,21 @@
       <w:pPr>
         <w:spacing w:before="200" w:after="200"/>
       </w:pPr>
+    </w:p>
+    <w:p>
+      <w:pPr>
+        <w:spacing w:before="360" w:after="180"/>
+      </w:pPr>
       <w:r>
         <w:rPr>
           <w:rFonts w:ascii="Arial" w:hAnsi="Arial" w:cs="Arial"/>
-          <w:sz w:val="24"/>
-          <w:szCs w:val="24"/>
-          <w:color w:val="000000"/>
-        </w:rPr>
-        <w:t xml:space="preserve"/>
-      </w:r>
-    </w:p>
-    <w:p>
-      <w:pPr>
-        <w:spacing w:before="360" w:after="180"/>
-      </w:pPr>
-      <w:r>
-        <w:rPr>
-          <w:rFonts w:ascii="Arial" w:hAnsi="Arial" w:cs="Arial"/>
+          <w:b/>
+          <w:bCs/>
+          <w:color w:val="1A56DB"/>
           <w:sz w:val="32"/>
           <w:szCs w:val="32"/>
-          <w:b/>
-          <w:bCs/>
-          <w:color w:val="1A56DB"/>
-        </w:rPr>
-        <w:t xml:space="preserve">1. TỔNG QUAN BÀI TOÁN &amp; KIẾN TRÚC FLUTTER</w:t>
+        </w:rPr>
+        <w:t>1. TỔNG QUAN BÀI TOÁN &amp; KIẾN TRÚC FLUTTER</w:t>
       </w:r>
     </w:p>
     <w:p>
@@ -508,11 +642,11 @@
       <w:r>
         <w:rPr>
           <w:rFonts w:ascii="Arial" w:hAnsi="Arial" w:cs="Arial"/>
-          <w:sz w:val="24"/>
-          <w:szCs w:val="24"/>
           <w:color w:val="000000"/>
-        </w:rPr>
-        <w:t xml:space="preserve">Ứng dụng 'Quản lý danh bạ liên hệ' được xây dựng hoàn toàn bằng nền tảng Flutter (ngôn ngữ Dart) với hệ thống thiết kế Material 3 hiện đại, sắc nét. Hệ thống bao gồm 4 màn hình chính: Đăng nhập, Danh sách liên hệ kèm Khối thống kê, Thêm liên hệ mới và Chi tiết liên hệ.</w:t>
+          <w:sz w:val="24"/>
+          <w:szCs w:val="24"/>
+        </w:rPr>
+        <w:t>Ứng dụng 'Quản lý danh bạ liên hệ' được xây dựng hoàn toàn bằng nền tảng Flutter (ngôn ngữ Dart) với hệ thống thiết kế Material 3 hiện đại, sắc nét. Hệ thống bao gồm 4 màn hình chính: Đăng nhập, Danh sách liên hệ kèm Khối thống kê, Thêm liên hệ mới và Chi tiết liên hệ.</w:t>
       </w:r>
     </w:p>
     <w:p>
@@ -522,13 +656,13 @@
       <w:r>
         <w:rPr>
           <w:rFonts w:ascii="Arial" w:hAnsi="Arial" w:cs="Arial"/>
+          <w:b/>
+          <w:bCs/>
+          <w:color w:val="1E429F"/>
           <w:sz w:val="28"/>
           <w:szCs w:val="28"/>
-          <w:b/>
-          <w:bCs/>
-          <w:color w:val="1E429F"/>
-        </w:rPr>
-        <w:t xml:space="preserve">1.1. Kiến trúc Quản lý Dữ liệu In-Memory &amp; State Management</w:t>
+        </w:rPr>
+        <w:t>1.1. Kiến trúc Quản lý Dữ liệu In-Memory &amp; State Management</w:t>
       </w:r>
     </w:p>
     <w:p>
@@ -545,9 +679,9 @@
           <w:rFonts w:ascii="Arial" w:hAnsi="Arial"/>
           <w:b/>
           <w:bCs/>
-          <w:sz w:val="24"/>
-          <w:szCs w:val="24"/>
           <w:color w:val="0F172A"/>
+          <w:sz w:val="24"/>
+          <w:szCs w:val="24"/>
         </w:rPr>
         <w:t xml:space="preserve">• </w:t>
       </w:r>
@@ -557,7 +691,7 @@
           <w:sz w:val="24"/>
           <w:szCs w:val="24"/>
         </w:rPr>
-        <w:t xml:space="preserve">Mô hình Single Source of Truth: Sử dụng lớp Singleton ContactRepository bọc danh sách List&lt;Contact&gt;. Tất cả các màn hình (MainScreen, AddContactScreen, ContactDetailScreen) đều tương tác trực tiếp với kho dữ liệu này.</w:t>
+        <w:t>Mô hình Single Source of Truth: Sử dụng lớp Singleton ContactRepository bọc danh sách List&lt;Contact&gt;. Tất cả các màn hình (MainScreen, AddContactScreen, ContactDetailScreen) đều tương tác trực tiếp với kho dữ liệu này.</w:t>
       </w:r>
     </w:p>
     <w:p>
@@ -574,9 +708,9 @@
           <w:rFonts w:ascii="Arial" w:hAnsi="Arial"/>
           <w:b/>
           <w:bCs/>
-          <w:sz w:val="24"/>
-          <w:szCs w:val="24"/>
           <w:color w:val="0F172A"/>
+          <w:sz w:val="24"/>
+          <w:szCs w:val="24"/>
         </w:rPr>
         <w:t xml:space="preserve">• </w:t>
       </w:r>
@@ -586,7 +720,7 @@
           <w:sz w:val="24"/>
           <w:szCs w:val="24"/>
         </w:rPr>
-        <w:t xml:space="preserve">Đồng bộ trạng thái: Khi người dùng thêm liên hệ, xóa liên hệ hoặc đánh dấu/hủy yêu thích, dữ liệu được cập nhật tức thì. Khi quay lại màn hình chính bằng cả nút Quay lại trên giao diện lẫn phím Back vật lý của điện thoại, hàm setState() đảm bảo danh sách và khối thống kê luôn đồng bộ 100%.</w:t>
+        <w:t>Đồng bộ trạng thái: Khi người dùng thêm liên hệ, xóa liên hệ hoặc đánh dấu/hủy yêu thích, dữ liệu được cập nhật tức thì. Khi quay lại màn hình chính bằng cả nút Quay lại trên giao diện lẫn phím Back vật lý của điện thoại, hàm setState() đảm bảo danh sách và khối thống kê luôn đồng bộ 100%.</w:t>
       </w:r>
     </w:p>
     <w:p>
@@ -603,9 +737,9 @@
           <w:rFonts w:ascii="Arial" w:hAnsi="Arial"/>
           <w:b/>
           <w:bCs/>
-          <w:sz w:val="24"/>
-          <w:szCs w:val="24"/>
           <w:color w:val="0F172A"/>
+          <w:sz w:val="24"/>
+          <w:szCs w:val="24"/>
         </w:rPr>
         <w:t xml:space="preserve">• </w:t>
       </w:r>
@@ -615,7 +749,7 @@
           <w:sz w:val="24"/>
           <w:szCs w:val="24"/>
         </w:rPr>
-        <w:t xml:space="preserve">Điều hướng Navigator: Dùng Navigator.pushReplacement khi đăng nhập thành công để hủy route Login khỏi ngăn xếp (ngăn nút Back quay lại đăng nhập); dùng Navigator.push và Navigator.pop cho các màn hình còn lại.</w:t>
+        <w:t>Điều hướng Navigator: Dùng Navigator.pushReplacement khi đăng nhập thành công để hủy route Login khỏi ngăn xếp (ngăn nút Back quay lại đăng nhập); dùng Navigator.push và Navigator.pop cho các màn hình còn lại.</w:t>
       </w:r>
     </w:p>
     <w:p>
@@ -632,9 +766,9 @@
           <w:rFonts w:ascii="Arial" w:hAnsi="Arial"/>
           <w:b/>
           <w:bCs/>
-          <w:sz w:val="24"/>
-          <w:szCs w:val="24"/>
           <w:color w:val="0F172A"/>
+          <w:sz w:val="24"/>
+          <w:szCs w:val="24"/>
         </w:rPr>
         <w:t xml:space="preserve">• </w:t>
       </w:r>
@@ -644,7 +778,7 @@
           <w:sz w:val="24"/>
           <w:szCs w:val="24"/>
         </w:rPr>
-        <w:t xml:space="preserve">Tự động sinh Avatar: Chữ cái đầu viết hoa của tên được trích xuất từ từ cuối cùng trong họ tên (VD: Nguyễn Văn An -&gt; 'A', Trần Thị Bình -&gt; 'B') với màu nền ngẫu nhiên sinh động.</w:t>
+        <w:t>Tự động sinh Avatar: Chữ cái đầu viết hoa của tên được trích xuất từ từ cuối cùng trong họ tên (VD: Nguyễn Văn An -&gt; 'A', Trần Thị Bình -&gt; 'B') với màu nền ngẫu nhiên sinh động.</w:t>
       </w:r>
     </w:p>
     <w:p>
@@ -654,13 +788,13 @@
       <w:r>
         <w:rPr>
           <w:rFonts w:ascii="Arial" w:hAnsi="Arial" w:cs="Arial"/>
+          <w:b/>
+          <w:bCs/>
+          <w:color w:val="1A56DB"/>
           <w:sz w:val="32"/>
           <w:szCs w:val="32"/>
-          <w:b/>
-          <w:bCs/>
-          <w:color w:val="1A56DB"/>
-        </w:rPr>
-        <w:t xml:space="preserve">2. NỘI DUNG BÁO CÁO CHI TIẾT: HÌNH ẢNH THẬT &amp; MÔ TẢ KỸ THUẬT</w:t>
+        </w:rPr>
+        <w:t>2. NỘI DUNG BÁO CÁO CHI TIẾT: HÌNH ẢNH THẬT &amp; MÔ TẢ KỸ THUẬT</w:t>
       </w:r>
     </w:p>
     <w:p>
@@ -670,11 +804,11 @@
       <w:r>
         <w:rPr>
           <w:rFonts w:ascii="Arial" w:hAnsi="Arial" w:cs="Arial"/>
-          <w:sz w:val="24"/>
-          <w:szCs w:val="24"/>
           <w:color w:val="000000"/>
-        </w:rPr>
-        <w:t xml:space="preserve">Toàn bộ các hình ảnh dưới đây là ẢNH CHỤP THẬT từ ứng dụng Flutter đang chạy (được kết xuất trực tiếp từ engine đồ họa Flutter). Mô tả chi tiết các widget, lớp, hàm, xử lý sự kiện và đoạn mã tiêu biểu được trình bày cho từng màn hình.</w:t>
+          <w:sz w:val="24"/>
+          <w:szCs w:val="24"/>
+        </w:rPr>
+        <w:t>Toàn bộ các hình ảnh dưới đây là ẢNH CHỤP THẬT từ ứng dụng Flutter đang chạy (được kết xuất trực tiếp từ engine đồ họa Flutter). Mô tả chi tiết các widget, lớp, hàm, xử lý sự kiện và đoạn mã tiêu biểu được trình bày cho từng màn hình.</w:t>
       </w:r>
     </w:p>
     <w:p>
@@ -684,26 +818,26 @@
       <w:r>
         <w:rPr>
           <w:rFonts w:ascii="Arial" w:hAnsi="Arial" w:cs="Arial"/>
+          <w:b/>
+          <w:bCs/>
+          <w:color w:val="1E429F"/>
           <w:sz w:val="28"/>
           <w:szCs w:val="28"/>
-          <w:b/>
-          <w:bCs/>
-          <w:color w:val="1E429F"/>
-        </w:rPr>
-        <w:t xml:space="preserve">2.1. Màn hình 1: Đăng nhập (LoginScreen)</w:t>
-      </w:r>
-    </w:p>
-    <w:p>
-      <w:pPr>
+        </w:rPr>
+        <w:t>2.1. Màn hình 1: Đăng nhập (LoginScreen)</w:t>
+      </w:r>
+    </w:p>
+    <w:p>
+      <w:pPr>
+        <w:spacing w:before="180" w:after="80"/>
         <w:jc w:val="center"/>
-        <w:spacing w:before="180" w:after="80"/>
       </w:pPr>
       <w:r>
         <w:drawing>
-          <wp:inline xmlns:wp="http://schemas.openxmlformats.org/drawingml/2006/wordprocessingDrawing" distT="0" distB="0" distL="0" distR="0">
-            <wp:extent cx="2400000" cy="4800000"/>
-            <wp:effectExtent t="0" r="0" b="0" l="0"/>
-            <wp:docPr id="rId10" name="image_rId10"/>
+          <wp:inline distT="0" distB="0" distL="114300" distR="114300">
+            <wp:extent cx="2066925" cy="4410075"/>
+            <wp:effectExtent l="0" t="0" r="0" b="0"/>
+            <wp:docPr id="7" name="Picture 1"/>
             <wp:cNvGraphicFramePr>
               <a:graphicFrameLocks xmlns:a="http://schemas.openxmlformats.org/drawingml/2006/main" noChangeAspect="1"/>
             </wp:cNvGraphicFramePr>
@@ -711,13 +845,13 @@
               <a:graphicData uri="http://schemas.openxmlformats.org/drawingml/2006/picture">
                 <pic:pic xmlns:pic="http://schemas.openxmlformats.org/drawingml/2006/picture">
                   <pic:nvPicPr>
-                    <pic:cNvPr id="0" name=""/>
+                    <pic:cNvPr id="7" name="Picture 1"/>
                     <pic:cNvPicPr>
-                      <a:picLocks noChangeAspect="1" noChangeArrowheads="1"/>
+                      <a:picLocks noChangeAspect="1"/>
                     </pic:cNvPicPr>
                   </pic:nvPicPr>
                   <pic:blipFill>
-                    <a:blip xmlns:r="http://schemas.openxmlformats.org/officeDocument/2006/relationships" r:embed="rId10"/>
+                    <a:blip r:embed="rId6"/>
                     <a:stretch>
                       <a:fillRect/>
                     </a:stretch>
@@ -725,11 +859,15 @@
                   <pic:spPr>
                     <a:xfrm>
                       <a:off x="0" y="0"/>
-                      <a:ext cx="2400000" cy="4800000"/>
+                      <a:ext cx="2066925" cy="4410075"/>
                     </a:xfrm>
                     <a:prstGeom prst="rect">
                       <a:avLst/>
                     </a:prstGeom>
+                    <a:noFill/>
+                    <a:ln>
+                      <a:noFill/>
+                    </a:ln>
                   </pic:spPr>
                 </pic:pic>
               </a:graphicData>
@@ -746,26 +884,26 @@
       <w:r>
         <w:rPr>
           <w:rFonts w:ascii="Arial" w:hAnsi="Arial" w:cs="Arial"/>
-          <w:sz w:val="20"/>
-          <w:szCs w:val="20"/>
           <w:i/>
           <w:iCs/>
           <w:color w:val="64748B"/>
-        </w:rPr>
-        <w:t xml:space="preserve">Hình 1. Giao diện Đăng nhập chuẩn của ứng dụng (LoginScreen)</w:t>
-      </w:r>
-    </w:p>
-    <w:p>
-      <w:pPr>
+          <w:sz w:val="20"/>
+          <w:szCs w:val="20"/>
+        </w:rPr>
+        <w:t>Hình 1. Giao diện Đăng nhập chuẩn của ứng dụng (LoginScreen)</w:t>
+      </w:r>
+    </w:p>
+    <w:p>
+      <w:pPr>
+        <w:spacing w:before="180" w:after="80"/>
         <w:jc w:val="center"/>
-        <w:spacing w:before="180" w:after="80"/>
       </w:pPr>
       <w:r>
         <w:drawing>
-          <wp:inline xmlns:wp="http://schemas.openxmlformats.org/drawingml/2006/wordprocessingDrawing" distT="0" distB="0" distL="0" distR="0">
-            <wp:extent cx="2400000" cy="4800000"/>
-            <wp:effectExtent t="0" r="0" b="0" l="0"/>
-            <wp:docPr id="rId10b" name="image_rId10b"/>
+          <wp:inline distT="0" distB="0" distL="114300" distR="114300">
+            <wp:extent cx="2038350" cy="4400550"/>
+            <wp:effectExtent l="0" t="0" r="0" b="0"/>
+            <wp:docPr id="8" name="Picture 2"/>
             <wp:cNvGraphicFramePr>
               <a:graphicFrameLocks xmlns:a="http://schemas.openxmlformats.org/drawingml/2006/main" noChangeAspect="1"/>
             </wp:cNvGraphicFramePr>
@@ -773,13 +911,13 @@
               <a:graphicData uri="http://schemas.openxmlformats.org/drawingml/2006/picture">
                 <pic:pic xmlns:pic="http://schemas.openxmlformats.org/drawingml/2006/picture">
                   <pic:nvPicPr>
-                    <pic:cNvPr id="0" name=""/>
+                    <pic:cNvPr id="8" name="Picture 2"/>
                     <pic:cNvPicPr>
-                      <a:picLocks noChangeAspect="1" noChangeArrowheads="1"/>
+                      <a:picLocks noChangeAspect="1"/>
                     </pic:cNvPicPr>
                   </pic:nvPicPr>
                   <pic:blipFill>
-                    <a:blip xmlns:r="http://schemas.openxmlformats.org/officeDocument/2006/relationships" r:embed="rId10b"/>
+                    <a:blip r:embed="rId7"/>
                     <a:stretch>
                       <a:fillRect/>
                     </a:stretch>
@@ -787,11 +925,15 @@
                   <pic:spPr>
                     <a:xfrm>
                       <a:off x="0" y="0"/>
-                      <a:ext cx="2400000" cy="4800000"/>
+                      <a:ext cx="2038350" cy="4400550"/>
                     </a:xfrm>
                     <a:prstGeom prst="rect">
                       <a:avLst/>
                     </a:prstGeom>
+                    <a:noFill/>
+                    <a:ln>
+                      <a:noFill/>
+                    </a:ln>
                   </pic:spPr>
                 </pic:pic>
               </a:graphicData>
@@ -808,13 +950,13 @@
       <w:r>
         <w:rPr>
           <w:rFonts w:ascii="Arial" w:hAnsi="Arial" w:cs="Arial"/>
-          <w:sz w:val="20"/>
-          <w:szCs w:val="20"/>
           <w:i/>
           <w:iCs/>
           <w:color w:val="64748B"/>
-        </w:rPr>
-        <w:t xml:space="preserve">Hình 2. Giao diện Đăng nhập khi báo lỗi validation (bỏ trống / sai tài khoản)</w:t>
+          <w:sz w:val="20"/>
+          <w:szCs w:val="20"/>
+        </w:rPr>
+        <w:t>Hình 2. Giao diện Đăng nhập khi báo lỗi validation (bỏ trống / sai tài khoản)</w:t>
       </w:r>
     </w:p>
     <w:p>
@@ -824,13 +966,13 @@
       <w:r>
         <w:rPr>
           <w:rFonts w:ascii="Arial" w:hAnsi="Arial" w:cs="Arial"/>
-          <w:sz w:val="24"/>
-          <w:szCs w:val="24"/>
           <w:b/>
           <w:bCs/>
           <w:color w:val="0F172A"/>
-        </w:rPr>
-        <w:t xml:space="preserve">Mô tả nội dung kỹ thuật đã thực hiện:</w:t>
+          <w:sz w:val="24"/>
+          <w:szCs w:val="24"/>
+        </w:rPr>
+        <w:t>Mô tả nội dung kỹ thuật đã thực hiện:</w:t>
       </w:r>
     </w:p>
     <w:p>
@@ -847,9 +989,9 @@
           <w:rFonts w:ascii="Arial" w:hAnsi="Arial"/>
           <w:b/>
           <w:bCs/>
-          <w:sz w:val="24"/>
-          <w:szCs w:val="24"/>
           <w:color w:val="0F172A"/>
+          <w:sz w:val="24"/>
+          <w:szCs w:val="24"/>
         </w:rPr>
         <w:t xml:space="preserve">• </w:t>
       </w:r>
@@ -859,7 +1001,7 @@
           <w:sz w:val="24"/>
           <w:szCs w:val="24"/>
         </w:rPr>
-        <w:t xml:space="preserve">Widget đã tạo: Giao diện căn giữa sử dụng Card bo góc 20dp, Icon biểu tượng danh bạ (Contacts), TextField Tên đăng nhập (_usernameController), TextField Mật khẩu (_passwordController, obscureText với nút IconButton bật/tắt hiển thị mật khẩu), Hộp cảnh báo lỗi màu đỏ (Container viền F8B4B4, icon error và chữ đỏ) và ElevatedButton ĐĂNG NHẬP màu Indigo nổi bật.</w:t>
+        <w:t>Widget đã tạo: Giao diện căn giữa sử dụng Card bo góc 20dp, Icon biểu tượng danh bạ (Contacts), TextField Tên đăng nhập (_usernameController), TextField Mật khẩu (_passwordController, obscureText với nút IconButton bật/tắt hiển thị mật khẩu), Hộp cảnh báo lỗi màu đỏ (Container viền F8B4B4, icon error và chữ đỏ) và ElevatedButton ĐĂNG NHẬP màu Indigo nổi bật.</w:t>
       </w:r>
     </w:p>
     <w:p>
@@ -876,9 +1018,9 @@
           <w:rFonts w:ascii="Arial" w:hAnsi="Arial"/>
           <w:b/>
           <w:bCs/>
-          <w:sz w:val="24"/>
-          <w:szCs w:val="24"/>
           <w:color w:val="0F172A"/>
+          <w:sz w:val="24"/>
+          <w:szCs w:val="24"/>
         </w:rPr>
         <w:t xml:space="preserve">• </w:t>
       </w:r>
@@ -888,7 +1030,7 @@
           <w:sz w:val="24"/>
           <w:szCs w:val="24"/>
         </w:rPr>
-        <w:t xml:space="preserve">Khai báo tài khoản cố định: Được khai báo dạng hằng số tĩnh static const String _hardcodedUsername = 'admin'; và static const String _hardcodedPassword = '123456';</w:t>
+        <w:t>Khai báo tài khoản cố định: Được khai báo dạng hằng số tĩnh static const String _hardcodedUsername = 'admin'; và static const String _hardcodedPassword = '123456';</w:t>
       </w:r>
     </w:p>
     <w:p>
@@ -905,9 +1047,9 @@
           <w:rFonts w:ascii="Arial" w:hAnsi="Arial"/>
           <w:b/>
           <w:bCs/>
-          <w:sz w:val="24"/>
-          <w:szCs w:val="24"/>
           <w:color w:val="0F172A"/>
+          <w:sz w:val="24"/>
+          <w:szCs w:val="24"/>
         </w:rPr>
         <w:t xml:space="preserve">• </w:t>
       </w:r>
@@ -917,7 +1059,7 @@
           <w:sz w:val="24"/>
           <w:szCs w:val="24"/>
         </w:rPr>
-        <w:t xml:space="preserve">Xử lý kiểm tra bỏ trống: Hàm _handleLogin() gọi .trim(). Nếu một trong 2 trường rỗng thì gán _errorMessage = 'Vui lòng nhập đầy đủ tên đăng nhập và mật khẩu!' và gọi setState() để hiển thị thông báo cảnh báo đỏ.</w:t>
+        <w:t>Xử lý kiểm tra bỏ trống: Hàm _handleLogin() gọi .trim(). Nếu một trong 2 trường rỗng thì gán _errorMessage = 'Vui lòng nhập đầy đủ tên đăng nhập và mật khẩu!' và gọi setState() để hiển thị thông báo cảnh báo đỏ.</w:t>
       </w:r>
     </w:p>
     <w:p>
@@ -934,9 +1076,9 @@
           <w:rFonts w:ascii="Arial" w:hAnsi="Arial"/>
           <w:b/>
           <w:bCs/>
-          <w:sz w:val="24"/>
-          <w:szCs w:val="24"/>
           <w:color w:val="0F172A"/>
+          <w:sz w:val="24"/>
+          <w:szCs w:val="24"/>
         </w:rPr>
         <w:t xml:space="preserve">• </w:t>
       </w:r>
@@ -946,7 +1088,7 @@
           <w:sz w:val="24"/>
           <w:szCs w:val="24"/>
         </w:rPr>
-        <w:t xml:space="preserve">Xử lý sai thông tin: Nếu username hoặc password không trùng khớp với tài khoản cố định, gán _errorMessage = 'Sai tên đăng nhập hoặc mật khẩu!', tự động xóa trắng ô mật khẩu để người dùng nhập lại.</w:t>
+        <w:t>Xử lý sai thông tin: Nếu username hoặc password không trùng khớp với tài khoản cố định, gán _errorMessage = 'Sai tên đăng nhập hoặc mật khẩu!', tự động xóa trắng ô mật khẩu để người dùng nhập lại.</w:t>
       </w:r>
     </w:p>
     <w:p>
@@ -963,9 +1105,9 @@
           <w:rFonts w:ascii="Arial" w:hAnsi="Arial"/>
           <w:b/>
           <w:bCs/>
-          <w:sz w:val="24"/>
-          <w:szCs w:val="24"/>
           <w:color w:val="0F172A"/>
+          <w:sz w:val="24"/>
+          <w:szCs w:val="24"/>
         </w:rPr>
         <w:t xml:space="preserve">• </w:t>
       </w:r>
@@ -975,7 +1117,7 @@
           <w:sz w:val="24"/>
           <w:szCs w:val="24"/>
         </w:rPr>
-        <w:t xml:space="preserve">Chuyển màn hình: Khi đúng tài khoản, hiển thị SnackBar thông báo thành công và gọi Navigator.pushReplacement(context, MaterialPageRoute(builder: (_) =&gt; const MainScreen())) để chuyển sang màn hình danh sách và loại bỏ màn hình đăng nhập khỏi ngăn xếp.</w:t>
+        <w:t>Chuyển màn hình: Khi đúng tài khoản, hiển thị SnackBar thông báo thành công và gọi Navigator.pushReplacement(context, MaterialPageRoute(builder: (_) =&gt; const MainScreen())) để chuyển sang màn hình danh sách và loại bỏ màn hình đăng nhập khỏi ngăn xếp.</w:t>
       </w:r>
     </w:p>
     <w:p>
@@ -985,32 +1127,32 @@
       <w:r>
         <w:rPr>
           <w:rFonts w:ascii="Arial" w:hAnsi="Arial" w:cs="Arial"/>
-          <w:sz w:val="24"/>
-          <w:szCs w:val="24"/>
           <w:b/>
           <w:bCs/>
           <w:color w:val="0F172A"/>
-        </w:rPr>
-        <w:t xml:space="preserve">Đoạn mã tiêu biểu (lib/screens/login_screen.dart):</w:t>
-      </w:r>
-    </w:p>
-    <w:p>
-      <w:pPr>
+          <w:sz w:val="24"/>
+          <w:szCs w:val="24"/>
+        </w:rPr>
+        <w:t>Đoạn mã tiêu biểu (lib/screens/login_screen.dart):</w:t>
+      </w:r>
+    </w:p>
+    <w:p>
+      <w:pPr>
+        <w:pBdr>
+          <w:left w:val="single" w:color="3B82F6" w:sz="18" w:space="8"/>
+        </w:pBdr>
+        <w:shd w:val="clear" w:color="auto" w:fill="F1F5F9"/>
         <w:spacing w:before="140" w:after="140"/>
-        <w:shd w:val="clear" w:color="auto" w:fill="F1F5F9"/>
         <w:ind w:left="360" w:right="360"/>
-        <w:pBdr>
-          <w:left w:val="single" w:sz="18" w:space="8" w:color="3B82F6"/>
-        </w:pBdr>
       </w:pPr>
       <w:r>
         <w:rPr>
           <w:rFonts w:ascii="Consolas" w:hAnsi="Consolas"/>
+          <w:color w:val="0F172A"/>
           <w:sz w:val="20"/>
           <w:szCs w:val="20"/>
-          <w:color w:val="0F172A"/>
-        </w:rPr>
-        <w:t xml:space="preserve">void _handleLogin() {
+        </w:rPr>
+        <w:t>void _handleLogin() {
   final username = _usernameController.text.trim();
   final password = _passwordController.text.trim();
   if (username.isEmpty || password.isEmpty) {
@@ -1035,26 +1177,26 @@
       <w:r>
         <w:rPr>
           <w:rFonts w:ascii="Arial" w:hAnsi="Arial" w:cs="Arial"/>
+          <w:b/>
+          <w:bCs/>
+          <w:color w:val="1E429F"/>
           <w:sz w:val="28"/>
           <w:szCs w:val="28"/>
-          <w:b/>
-          <w:bCs/>
-          <w:color w:val="1E429F"/>
-        </w:rPr>
-        <w:t xml:space="preserve">2.2. Màn hình 2: Danh sách liên hệ &amp; Thống kê (MainScreen)</w:t>
-      </w:r>
-    </w:p>
-    <w:p>
-      <w:pPr>
+        </w:rPr>
+        <w:t>2.2. Màn hình 2: Danh sách liên hệ &amp; Thống kê (MainScreen)</w:t>
+      </w:r>
+    </w:p>
+    <w:p>
+      <w:pPr>
+        <w:spacing w:before="180" w:after="80"/>
         <w:jc w:val="center"/>
-        <w:spacing w:before="180" w:after="80"/>
       </w:pPr>
       <w:r>
         <w:drawing>
-          <wp:inline xmlns:wp="http://schemas.openxmlformats.org/drawingml/2006/wordprocessingDrawing" distT="0" distB="0" distL="0" distR="0">
-            <wp:extent cx="2400000" cy="4800000"/>
-            <wp:effectExtent t="0" r="0" b="0" l="0"/>
-            <wp:docPr id="rId11" name="image_rId11"/>
+          <wp:inline distT="0" distB="0" distL="114300" distR="114300">
+            <wp:extent cx="1943100" cy="4381500"/>
+            <wp:effectExtent l="0" t="0" r="0" b="0"/>
+            <wp:docPr id="9" name="Picture 3"/>
             <wp:cNvGraphicFramePr>
               <a:graphicFrameLocks xmlns:a="http://schemas.openxmlformats.org/drawingml/2006/main" noChangeAspect="1"/>
             </wp:cNvGraphicFramePr>
@@ -1062,13 +1204,13 @@
               <a:graphicData uri="http://schemas.openxmlformats.org/drawingml/2006/picture">
                 <pic:pic xmlns:pic="http://schemas.openxmlformats.org/drawingml/2006/picture">
                   <pic:nvPicPr>
-                    <pic:cNvPr id="0" name=""/>
+                    <pic:cNvPr id="9" name="Picture 3"/>
                     <pic:cNvPicPr>
-                      <a:picLocks noChangeAspect="1" noChangeArrowheads="1"/>
+                      <a:picLocks noChangeAspect="1"/>
                     </pic:cNvPicPr>
                   </pic:nvPicPr>
                   <pic:blipFill>
-                    <a:blip xmlns:r="http://schemas.openxmlformats.org/officeDocument/2006/relationships" r:embed="rId11"/>
+                    <a:blip r:embed="rId8"/>
                     <a:stretch>
                       <a:fillRect/>
                     </a:stretch>
@@ -1076,11 +1218,15 @@
                   <pic:spPr>
                     <a:xfrm>
                       <a:off x="0" y="0"/>
-                      <a:ext cx="2400000" cy="4800000"/>
+                      <a:ext cx="1943100" cy="4381500"/>
                     </a:xfrm>
                     <a:prstGeom prst="rect">
                       <a:avLst/>
                     </a:prstGeom>
+                    <a:noFill/>
+                    <a:ln>
+                      <a:noFill/>
+                    </a:ln>
                   </pic:spPr>
                 </pic:pic>
               </a:graphicData>
@@ -1097,13 +1243,13 @@
       <w:r>
         <w:rPr>
           <w:rFonts w:ascii="Arial" w:hAnsi="Arial" w:cs="Arial"/>
-          <w:sz w:val="20"/>
-          <w:szCs w:val="20"/>
           <w:i/>
           <w:iCs/>
           <w:color w:val="64748B"/>
-        </w:rPr>
-        <w:t xml:space="preserve">Hình 3. Giao diện Danh sách liên hệ kèm Khối thống kê (MainScreen)</w:t>
+          <w:sz w:val="20"/>
+          <w:szCs w:val="20"/>
+        </w:rPr>
+        <w:t>Hình 3. Giao diện Danh sách liên hệ kèm Khối thống kê (MainScreen)</w:t>
       </w:r>
     </w:p>
     <w:p>
@@ -1113,13 +1259,13 @@
       <w:r>
         <w:rPr>
           <w:rFonts w:ascii="Arial" w:hAnsi="Arial" w:cs="Arial"/>
-          <w:sz w:val="24"/>
-          <w:szCs w:val="24"/>
           <w:b/>
           <w:bCs/>
           <w:color w:val="0F172A"/>
-        </w:rPr>
-        <w:t xml:space="preserve">Mô tả nội dung kỹ thuật đã thực hiện:</w:t>
+          <w:sz w:val="24"/>
+          <w:szCs w:val="24"/>
+        </w:rPr>
+        <w:t>Mô tả nội dung kỹ thuật đã thực hiện:</w:t>
       </w:r>
     </w:p>
     <w:p>
@@ -1136,9 +1282,9 @@
           <w:rFonts w:ascii="Arial" w:hAnsi="Arial"/>
           <w:b/>
           <w:bCs/>
-          <w:sz w:val="24"/>
-          <w:szCs w:val="24"/>
           <w:color w:val="0F172A"/>
+          <w:sz w:val="24"/>
+          <w:szCs w:val="24"/>
         </w:rPr>
         <w:t xml:space="preserve">• </w:t>
       </w:r>
@@ -1148,7 +1294,7 @@
           <w:sz w:val="24"/>
           <w:szCs w:val="24"/>
         </w:rPr>
-        <w:t xml:space="preserve">Widget đã tạo: AppBar xanh thương hiệu hiển thị tên bài tập và MSSV B24DCCC157; Banner thống kê đặt trong Container bo góc 14dp với nền xanh E1EFFE có icon ngôi sao vàng hiển thị 'Tổng số: X | Yêu thích: Y'; ListView.builder cuộn danh sách liên hệ; Widget tùy biến ContactItem; Thanh đáy cố định chứa nút ElevatedButton THÊM LIÊN HỆ.</w:t>
+        <w:t>Widget đã tạo: AppBar xanh thương hiệu hiển thị tên bài tập và MSSV B24DCCC157; Banner thống kê đặt trong Container bo góc 14dp với nền xanh E1EFFE có icon ngôi sao vàng hiển thị 'Tổng số: X | Yêu thích: Y'; ListView.builder cuộn danh sách liên hệ; Widget tùy biến ContactItem; Thanh đáy cố định chứa nút ElevatedButton THÊM LIÊN HỆ.</w:t>
       </w:r>
     </w:p>
     <w:p>
@@ -1165,9 +1311,9 @@
           <w:rFonts w:ascii="Arial" w:hAnsi="Arial"/>
           <w:b/>
           <w:bCs/>
-          <w:sz w:val="24"/>
-          <w:szCs w:val="24"/>
           <w:color w:val="0F172A"/>
+          <w:sz w:val="24"/>
+          <w:szCs w:val="24"/>
         </w:rPr>
         <w:t xml:space="preserve">• </w:t>
       </w:r>
@@ -1177,7 +1323,7 @@
           <w:sz w:val="24"/>
           <w:szCs w:val="24"/>
         </w:rPr>
-        <w:t xml:space="preserve">Thiết kế ContactItem: Mỗi thẻ liên hệ gồm Avatar hình tròn tự sinh màu theo chữ cái đầu của tên (contact.initialLetter), Họ và tên (chữ in đậm 16sp), Số điện thoại và Tag Badge Nhóm (Gia đình, Bạn bè, Công việc, Khác), Biểu tượng ngôi sao vàng (Icons.star_rounded nếu yêu thích, star_border_rounded nếu không).</w:t>
+        <w:t>Thiết kế ContactItem: Mỗi thẻ liên hệ gồm Avatar hình tròn tự sinh màu theo chữ cái đầu của tên (contact.initialLetter), Họ và tên (chữ in đậm 16sp), Số điện thoại và Tag Badge Nhóm (Gia đình, Bạn bè, Công việc, Khác), Biểu tượng ngôi sao vàng (Icons.star_rounded nếu yêu thích, star_border_rounded nếu không).</w:t>
       </w:r>
     </w:p>
     <w:p>
@@ -1194,9 +1340,9 @@
           <w:rFonts w:ascii="Arial" w:hAnsi="Arial"/>
           <w:b/>
           <w:bCs/>
-          <w:sz w:val="24"/>
-          <w:szCs w:val="24"/>
           <w:color w:val="0F172A"/>
+          <w:sz w:val="24"/>
+          <w:szCs w:val="24"/>
         </w:rPr>
         <w:t xml:space="preserve">• </w:t>
       </w:r>
@@ -1206,7 +1352,7 @@
           <w:sz w:val="24"/>
           <w:szCs w:val="24"/>
         </w:rPr>
-        <w:t xml:space="preserve">Khởi tạo 3 liên hệ mẫu ban đầu: ContactRepository nạp sẵn 3 đối tượng Contact theo đúng đề bài: (1) Nguyễn Văn An - 0901234567 - Bạn bè - Không yêu thích; (2) Trần Thị Bình - 0912345678 - Gia đình - Có yêu thích; (3) Lê Minh Châu - 0987654321 - Công việc - Không yêu thích.</w:t>
+        <w:t>Khởi tạo 3 liên hệ mẫu ban đầu: ContactRepository nạp sẵn 3 đối tượng Contact theo đúng đề bài: (1) Nguyễn Văn An - 0901234567 - Bạn bè - Không yêu thích; (2) Trần Thị Bình - 0912345678 - Gia đình - Có yêu thích; (3) Lê Minh Châu - 0987654321 - Công việc - Không yêu thích.</w:t>
       </w:r>
     </w:p>
     <w:p>
@@ -1223,9 +1369,9 @@
           <w:rFonts w:ascii="Arial" w:hAnsi="Arial"/>
           <w:b/>
           <w:bCs/>
-          <w:sz w:val="24"/>
-          <w:szCs w:val="24"/>
           <w:color w:val="0F172A"/>
+          <w:sz w:val="24"/>
+          <w:szCs w:val="24"/>
         </w:rPr>
         <w:t xml:space="preserve">• </w:t>
       </w:r>
@@ -1235,7 +1381,7 @@
           <w:sz w:val="24"/>
           <w:szCs w:val="24"/>
         </w:rPr>
-        <w:t xml:space="preserve">Tính toán và cập nhật thống kê: Sử dụng 2 getter _repository.totalCount và _repository.favoriteCount. Khi quay lại màn hình từ AddContactScreen hoặc ContactDetailScreen, hàm _refreshList() gọi setState() để tự động làm mới số liệu và danh sách.</w:t>
+        <w:t>Tính toán và cập nhật thống kê: Sử dụng 2 getter _repository.totalCount và _repository.favoriteCount. Khi quay lại màn hình từ AddContactScreen hoặc ContactDetailScreen, hàm _refreshList() gọi setState() để tự động làm mới số liệu và danh sách.</w:t>
       </w:r>
     </w:p>
     <w:p>
@@ -1252,9 +1398,9 @@
           <w:rFonts w:ascii="Arial" w:hAnsi="Arial"/>
           <w:b/>
           <w:bCs/>
-          <w:sz w:val="24"/>
-          <w:szCs w:val="24"/>
           <w:color w:val="0F172A"/>
+          <w:sz w:val="24"/>
+          <w:szCs w:val="24"/>
         </w:rPr>
         <w:t xml:space="preserve">• </w:t>
       </w:r>
@@ -1264,7 +1410,7 @@
           <w:sz w:val="24"/>
           <w:szCs w:val="24"/>
         </w:rPr>
-        <w:t xml:space="preserve">Xử lý sự kiện: Nhấn nút THÊM LIÊN HỆ mở AddContactScreen; nhấn vào một liên hệ mở ContactDetailScreen(contactId) kèm async/await để cập nhật state sau khi pop.</w:t>
+        <w:t>Xử lý sự kiện: Nhấn nút THÊM LIÊN HỆ mở AddContactScreen; nhấn vào một liên hệ mở ContactDetailScreen(contactId) kèm async/await để cập nhật state sau khi pop.</w:t>
       </w:r>
     </w:p>
     <w:p>
@@ -1274,32 +1420,32 @@
       <w:r>
         <w:rPr>
           <w:rFonts w:ascii="Arial" w:hAnsi="Arial" w:cs="Arial"/>
-          <w:sz w:val="24"/>
-          <w:szCs w:val="24"/>
           <w:b/>
           <w:bCs/>
           <w:color w:val="0F172A"/>
-        </w:rPr>
-        <w:t xml:space="preserve">Đoạn mã tiêu biểu (lib/screens/main_screen.dart):</w:t>
-      </w:r>
-    </w:p>
-    <w:p>
-      <w:pPr>
+          <w:sz w:val="24"/>
+          <w:szCs w:val="24"/>
+        </w:rPr>
+        <w:t>Đoạn mã tiêu biểu (lib/screens/main_screen.dart):</w:t>
+      </w:r>
+    </w:p>
+    <w:p>
+      <w:pPr>
+        <w:pBdr>
+          <w:left w:val="single" w:color="3B82F6" w:sz="18" w:space="8"/>
+        </w:pBdr>
+        <w:shd w:val="clear" w:color="auto" w:fill="F1F5F9"/>
         <w:spacing w:before="140" w:after="140"/>
-        <w:shd w:val="clear" w:color="auto" w:fill="F1F5F9"/>
         <w:ind w:left="360" w:right="360"/>
-        <w:pBdr>
-          <w:left w:val="single" w:sz="18" w:space="8" w:color="3B82F6"/>
-        </w:pBdr>
       </w:pPr>
       <w:r>
         <w:rPr>
           <w:rFonts w:ascii="Consolas" w:hAnsi="Consolas"/>
+          <w:color w:val="0F172A"/>
           <w:sz w:val="20"/>
           <w:szCs w:val="20"/>
-          <w:color w:val="0F172A"/>
-        </w:rPr>
-        <w:t xml:space="preserve">final total = _repository.totalCount;
+        </w:rPr>
+        <w:t>final total = _repository.totalCount;
 final favorites = _repository.favoriteCount;
 // Banner thống kê
 Text('Tổng số: $total   |   Yêu thích: $favorites',
@@ -1320,26 +1466,26 @@
       <w:r>
         <w:rPr>
           <w:rFonts w:ascii="Arial" w:hAnsi="Arial" w:cs="Arial"/>
+          <w:b/>
+          <w:bCs/>
+          <w:color w:val="1E429F"/>
           <w:sz w:val="28"/>
           <w:szCs w:val="28"/>
-          <w:b/>
-          <w:bCs/>
-          <w:color w:val="1E429F"/>
-        </w:rPr>
-        <w:t xml:space="preserve">2.3. Màn hình 3: Thêm liên hệ mới (AddContactScreen)</w:t>
-      </w:r>
-    </w:p>
-    <w:p>
-      <w:pPr>
+        </w:rPr>
+        <w:t>2.3. Màn hình 3: Thêm liên hệ mới (AddContactScreen)</w:t>
+      </w:r>
+    </w:p>
+    <w:p>
+      <w:pPr>
+        <w:spacing w:before="180" w:after="80"/>
         <w:jc w:val="center"/>
-        <w:spacing w:before="180" w:after="80"/>
       </w:pPr>
       <w:r>
         <w:drawing>
-          <wp:inline xmlns:wp="http://schemas.openxmlformats.org/drawingml/2006/wordprocessingDrawing" distT="0" distB="0" distL="0" distR="0">
-            <wp:extent cx="2400000" cy="4800000"/>
-            <wp:effectExtent t="0" r="0" b="0" l="0"/>
-            <wp:docPr id="rId12" name="image_rId12"/>
+          <wp:inline distT="0" distB="0" distL="114300" distR="114300">
+            <wp:extent cx="2057400" cy="4533900"/>
+            <wp:effectExtent l="0" t="0" r="0" b="0"/>
+            <wp:docPr id="10" name="Picture 4"/>
             <wp:cNvGraphicFramePr>
               <a:graphicFrameLocks xmlns:a="http://schemas.openxmlformats.org/drawingml/2006/main" noChangeAspect="1"/>
             </wp:cNvGraphicFramePr>
@@ -1347,13 +1493,13 @@
               <a:graphicData uri="http://schemas.openxmlformats.org/drawingml/2006/picture">
                 <pic:pic xmlns:pic="http://schemas.openxmlformats.org/drawingml/2006/picture">
                   <pic:nvPicPr>
-                    <pic:cNvPr id="0" name=""/>
+                    <pic:cNvPr id="10" name="Picture 4"/>
                     <pic:cNvPicPr>
-                      <a:picLocks noChangeAspect="1" noChangeArrowheads="1"/>
+                      <a:picLocks noChangeAspect="1"/>
                     </pic:cNvPicPr>
                   </pic:nvPicPr>
                   <pic:blipFill>
-                    <a:blip xmlns:r="http://schemas.openxmlformats.org/officeDocument/2006/relationships" r:embed="rId12"/>
+                    <a:blip r:embed="rId9"/>
                     <a:stretch>
                       <a:fillRect/>
                     </a:stretch>
@@ -1361,11 +1507,15 @@
                   <pic:spPr>
                     <a:xfrm>
                       <a:off x="0" y="0"/>
-                      <a:ext cx="2400000" cy="4800000"/>
+                      <a:ext cx="2057400" cy="4533900"/>
                     </a:xfrm>
                     <a:prstGeom prst="rect">
                       <a:avLst/>
                     </a:prstGeom>
+                    <a:noFill/>
+                    <a:ln>
+                      <a:noFill/>
+                    </a:ln>
                   </pic:spPr>
                 </pic:pic>
               </a:graphicData>
@@ -1382,26 +1532,26 @@
       <w:r>
         <w:rPr>
           <w:rFonts w:ascii="Arial" w:hAnsi="Arial" w:cs="Arial"/>
-          <w:sz w:val="20"/>
-          <w:szCs w:val="20"/>
           <w:i/>
           <w:iCs/>
           <w:color w:val="64748B"/>
-        </w:rPr>
-        <w:t xml:space="preserve">Hình 4. Giao diện Form thêm liên hệ mới (AddContactScreen)</w:t>
-      </w:r>
-    </w:p>
-    <w:p>
-      <w:pPr>
+          <w:sz w:val="20"/>
+          <w:szCs w:val="20"/>
+        </w:rPr>
+        <w:t>Hình 4. Giao diện Form thêm liên hệ mới (AddContactScreen)</w:t>
+      </w:r>
+    </w:p>
+    <w:p>
+      <w:pPr>
+        <w:spacing w:before="180" w:after="80"/>
         <w:jc w:val="center"/>
-        <w:spacing w:before="180" w:after="80"/>
       </w:pPr>
       <w:r>
         <w:drawing>
-          <wp:inline xmlns:wp="http://schemas.openxmlformats.org/drawingml/2006/wordprocessingDrawing" distT="0" distB="0" distL="0" distR="0">
-            <wp:extent cx="2400000" cy="4800000"/>
-            <wp:effectExtent t="0" r="0" b="0" l="0"/>
-            <wp:docPr id="rId12b" name="image_rId12b"/>
+          <wp:inline distT="0" distB="0" distL="114300" distR="114300">
+            <wp:extent cx="2095500" cy="4457700"/>
+            <wp:effectExtent l="0" t="0" r="0" b="0"/>
+            <wp:docPr id="11" name="Picture 5"/>
             <wp:cNvGraphicFramePr>
               <a:graphicFrameLocks xmlns:a="http://schemas.openxmlformats.org/drawingml/2006/main" noChangeAspect="1"/>
             </wp:cNvGraphicFramePr>
@@ -1409,13 +1559,13 @@
               <a:graphicData uri="http://schemas.openxmlformats.org/drawingml/2006/picture">
                 <pic:pic xmlns:pic="http://schemas.openxmlformats.org/drawingml/2006/picture">
                   <pic:nvPicPr>
-                    <pic:cNvPr id="0" name=""/>
+                    <pic:cNvPr id="11" name="Picture 5"/>
                     <pic:cNvPicPr>
-                      <a:picLocks noChangeAspect="1" noChangeArrowheads="1"/>
+                      <a:picLocks noChangeAspect="1"/>
                     </pic:cNvPicPr>
                   </pic:nvPicPr>
                   <pic:blipFill>
-                    <a:blip xmlns:r="http://schemas.openxmlformats.org/officeDocument/2006/relationships" r:embed="rId12b"/>
+                    <a:blip r:embed="rId10"/>
                     <a:stretch>
                       <a:fillRect/>
                     </a:stretch>
@@ -1423,11 +1573,15 @@
                   <pic:spPr>
                     <a:xfrm>
                       <a:off x="0" y="0"/>
-                      <a:ext cx="2400000" cy="4800000"/>
+                      <a:ext cx="2095500" cy="4457700"/>
                     </a:xfrm>
                     <a:prstGeom prst="rect">
                       <a:avLst/>
                     </a:prstGeom>
+                    <a:noFill/>
+                    <a:ln>
+                      <a:noFill/>
+                    </a:ln>
                   </pic:spPr>
                 </pic:pic>
               </a:graphicData>
@@ -1444,13 +1598,13 @@
       <w:r>
         <w:rPr>
           <w:rFonts w:ascii="Arial" w:hAnsi="Arial" w:cs="Arial"/>
-          <w:sz w:val="20"/>
-          <w:szCs w:val="20"/>
           <w:i/>
           <w:iCs/>
           <w:color w:val="64748B"/>
-        </w:rPr>
-        <w:t xml:space="preserve">Hình 5. Giao diện Thêm liên hệ khi báo lỗi validation (SĐT không hợp lệ / Trống họ tên)</w:t>
+          <w:sz w:val="20"/>
+          <w:szCs w:val="20"/>
+        </w:rPr>
+        <w:t>Hình 5. Giao diện Thêm liên hệ khi báo lỗi validation (SĐT không hợp lệ / Trống họ tên)</w:t>
       </w:r>
     </w:p>
     <w:p>
@@ -1460,13 +1614,13 @@
       <w:r>
         <w:rPr>
           <w:rFonts w:ascii="Arial" w:hAnsi="Arial" w:cs="Arial"/>
-          <w:sz w:val="24"/>
-          <w:szCs w:val="24"/>
           <w:b/>
           <w:bCs/>
           <w:color w:val="0F172A"/>
-        </w:rPr>
-        <w:t xml:space="preserve">Mô tả nội dung kỹ thuật đã thực hiện:</w:t>
+          <w:sz w:val="24"/>
+          <w:szCs w:val="24"/>
+        </w:rPr>
+        <w:t>Mô tả nội dung kỹ thuật đã thực hiện:</w:t>
       </w:r>
     </w:p>
     <w:p>
@@ -1483,9 +1637,9 @@
           <w:rFonts w:ascii="Arial" w:hAnsi="Arial"/>
           <w:b/>
           <w:bCs/>
-          <w:sz w:val="24"/>
-          <w:szCs w:val="24"/>
           <w:color w:val="0F172A"/>
+          <w:sz w:val="24"/>
+          <w:szCs w:val="24"/>
         </w:rPr>
         <w:t xml:space="preserve">• </w:t>
       </w:r>
@@ -1495,7 +1649,7 @@
           <w:sz w:val="24"/>
           <w:szCs w:val="24"/>
         </w:rPr>
-        <w:t xml:space="preserve">Widget đã tạo: Form cuộn SingleChildScrollView gồm 7 trường: TextField Họ và tên; TextField Số điện thoại (kiểu keyboard phone, maxLength=10); DropdownButtonFormField chọn Nhóm (Gia đình, Bạn bè, Công việc, Khác); SegmentedButton chọn Giới tính (Nam, Nữ, Khác có icon minh họa); CheckboxListTile Yêu thích màu vàng; TextField Ghi chú 3 dòng; Nút LƯU LIÊN HỆ.</w:t>
+        <w:t>Widget đã tạo: Form cuộn SingleChildScrollView gồm 7 trường: TextField Họ và tên; TextField Số điện thoại (kiểu keyboard phone, maxLength=10); DropdownButtonFormField chọn Nhóm (Gia đình, Bạn bè, Công việc, Khác); SegmentedButton chọn Giới tính (Nam, Nữ, Khác có icon minh họa); CheckboxListTile Yêu thích màu vàng; TextField Ghi chú 3 dòng; Nút LƯU LIÊN HỆ.</w:t>
       </w:r>
     </w:p>
     <w:p>
@@ -1512,9 +1666,9 @@
           <w:rFonts w:ascii="Arial" w:hAnsi="Arial"/>
           <w:b/>
           <w:bCs/>
-          <w:sz w:val="24"/>
-          <w:szCs w:val="24"/>
           <w:color w:val="0F172A"/>
+          <w:sz w:val="24"/>
+          <w:szCs w:val="24"/>
         </w:rPr>
         <w:t xml:space="preserve">• </w:t>
       </w:r>
@@ -1524,7 +1678,7 @@
           <w:sz w:val="24"/>
           <w:szCs w:val="24"/>
         </w:rPr>
-        <w:t xml:space="preserve">Validation Họ và tên: Kiểm tra name.isEmpty -&gt; gán _nameError = 'Họ và tên không được để trống!' và hiển thị ngay dưới ô nhập.</w:t>
+        <w:t>Validation Họ và tên: Kiểm tra name.isEmpty -&gt; gán _nameError = 'Họ và tên không được để trống!' và hiển thị ngay dưới ô nhập.</w:t>
       </w:r>
     </w:p>
     <w:p>
@@ -1541,9 +1695,9 @@
           <w:rFonts w:ascii="Arial" w:hAnsi="Arial"/>
           <w:b/>
           <w:bCs/>
-          <w:sz w:val="24"/>
-          <w:szCs w:val="24"/>
           <w:color w:val="0F172A"/>
+          <w:sz w:val="24"/>
+          <w:szCs w:val="24"/>
         </w:rPr>
         <w:t xml:space="preserve">• </w:t>
       </w:r>
@@ -1553,7 +1707,7 @@
           <w:sz w:val="24"/>
           <w:szCs w:val="24"/>
         </w:rPr>
-        <w:t xml:space="preserve">Validation Số điện thoại: Dùng biểu thức chính quy RegExp(r'^0[0-9]{9}$') để kiểm tra chính xác 10 chữ số và bắt đầu bằng số 0. Nếu không khớp -&gt; gán _phoneError = 'Số điện thoại phải gồm 10 chữ số và bắt đầu bằng số 0!'.</w:t>
+        <w:t>Validation Số điện thoại: Dùng biểu thức chính quy RegExp(r'^0[0-9]{9}$') để kiểm tra chính xác 10 chữ số và bắt đầu bằng số 0. Nếu không khớp -&gt; gán _phoneError = 'Số điện thoại phải gồm 10 chữ số và bắt đầu bằng số 0!'.</w:t>
       </w:r>
     </w:p>
     <w:p>
@@ -1570,9 +1724,9 @@
           <w:rFonts w:ascii="Arial" w:hAnsi="Arial"/>
           <w:b/>
           <w:bCs/>
-          <w:sz w:val="24"/>
-          <w:szCs w:val="24"/>
           <w:color w:val="0F172A"/>
+          <w:sz w:val="24"/>
+          <w:szCs w:val="24"/>
         </w:rPr>
         <w:t xml:space="preserve">• </w:t>
       </w:r>
@@ -1582,7 +1736,7 @@
           <w:sz w:val="24"/>
           <w:szCs w:val="24"/>
         </w:rPr>
-        <w:t xml:space="preserve">Kiểm tra chống trùng lặp SĐT: Gọi hàm _repository.isPhoneExists(phone). Nếu số đã tồn tại -&gt; gán _phoneError = 'Số điện thoại đã tồn tại trong danh bạ!' và chặn lưu.</w:t>
+        <w:t>Kiểm tra chống trùng lặp SĐT: Gọi hàm _repository.isPhoneExists(phone). Nếu số đã tồn tại -&gt; gán _phoneError = 'Số điện thoại đã tồn tại trong danh bạ!' và chặn lưu.</w:t>
       </w:r>
     </w:p>
     <w:p>
@@ -1599,9 +1753,9 @@
           <w:rFonts w:ascii="Arial" w:hAnsi="Arial"/>
           <w:b/>
           <w:bCs/>
-          <w:sz w:val="24"/>
-          <w:szCs w:val="24"/>
           <w:color w:val="0F172A"/>
+          <w:sz w:val="24"/>
+          <w:szCs w:val="24"/>
         </w:rPr>
         <w:t xml:space="preserve">• </w:t>
       </w:r>
@@ -1611,7 +1765,7 @@
           <w:sz w:val="24"/>
           <w:szCs w:val="24"/>
         </w:rPr>
-        <w:t xml:space="preserve">Lưu liên hệ: Khởi tạo Contact mới, gọi _repository.addContact(newContact), hiển thị SnackBar thông báo thành công và gọi Navigator.pop(context) quay về danh sách.</w:t>
+        <w:t>Lưu liên hệ: Khởi tạo Contact mới, gọi _repository.addContact(newContact), hiển thị SnackBar thông báo thành công và gọi Navigator.pop(context) quay về danh sách.</w:t>
       </w:r>
     </w:p>
     <w:p>
@@ -1621,32 +1775,32 @@
       <w:r>
         <w:rPr>
           <w:rFonts w:ascii="Arial" w:hAnsi="Arial" w:cs="Arial"/>
-          <w:sz w:val="24"/>
-          <w:szCs w:val="24"/>
           <w:b/>
           <w:bCs/>
           <w:color w:val="0F172A"/>
-        </w:rPr>
-        <w:t xml:space="preserve">Đoạn mã tiêu biểu (lib/screens/add_contact_screen.dart):</w:t>
-      </w:r>
-    </w:p>
-    <w:p>
-      <w:pPr>
+          <w:sz w:val="24"/>
+          <w:szCs w:val="24"/>
+        </w:rPr>
+        <w:t>Đoạn mã tiêu biểu (lib/screens/add_contact_screen.dart):</w:t>
+      </w:r>
+    </w:p>
+    <w:p>
+      <w:pPr>
+        <w:pBdr>
+          <w:left w:val="single" w:color="3B82F6" w:sz="18" w:space="8"/>
+        </w:pBdr>
+        <w:shd w:val="clear" w:color="auto" w:fill="F1F5F9"/>
         <w:spacing w:before="140" w:after="140"/>
-        <w:shd w:val="clear" w:color="auto" w:fill="F1F5F9"/>
         <w:ind w:left="360" w:right="360"/>
-        <w:pBdr>
-          <w:left w:val="single" w:sz="18" w:space="8" w:color="3B82F6"/>
-        </w:pBdr>
       </w:pPr>
       <w:r>
         <w:rPr>
           <w:rFonts w:ascii="Consolas" w:hAnsi="Consolas"/>
+          <w:color w:val="0F172A"/>
           <w:sz w:val="20"/>
           <w:szCs w:val="20"/>
-          <w:color w:val="0F172A"/>
-        </w:rPr>
-        <w:t xml:space="preserve">void _handleSave() {
+        </w:rPr>
+        <w:t>void _handleSave() {
   final name = _nameController.text.trim();
   final phone = _phoneController.text.trim();
   if (name.isEmpty) {
@@ -1673,26 +1827,26 @@
       <w:r>
         <w:rPr>
           <w:rFonts w:ascii="Arial" w:hAnsi="Arial" w:cs="Arial"/>
+          <w:b/>
+          <w:bCs/>
+          <w:color w:val="1E429F"/>
           <w:sz w:val="28"/>
           <w:szCs w:val="28"/>
-          <w:b/>
-          <w:bCs/>
-          <w:color w:val="1E429F"/>
-        </w:rPr>
-        <w:t xml:space="preserve">2.4. Màn hình 4: Chi tiết liên hệ (ContactDetailScreen)</w:t>
-      </w:r>
-    </w:p>
-    <w:p>
-      <w:pPr>
+        </w:rPr>
+        <w:t>2.4. Màn hình 4: Chi tiết liên hệ (ContactDetailScreen)</w:t>
+      </w:r>
+    </w:p>
+    <w:p>
+      <w:pPr>
+        <w:spacing w:before="180" w:after="80"/>
         <w:jc w:val="center"/>
-        <w:spacing w:before="180" w:after="80"/>
       </w:pPr>
       <w:r>
         <w:drawing>
-          <wp:inline xmlns:wp="http://schemas.openxmlformats.org/drawingml/2006/wordprocessingDrawing" distT="0" distB="0" distL="0" distR="0">
-            <wp:extent cx="2400000" cy="4800000"/>
-            <wp:effectExtent t="0" r="0" b="0" l="0"/>
-            <wp:docPr id="rId13" name="image_rId13"/>
+          <wp:inline distT="0" distB="0" distL="114300" distR="114300">
+            <wp:extent cx="2047875" cy="4448175"/>
+            <wp:effectExtent l="0" t="0" r="0" b="0"/>
+            <wp:docPr id="12" name="Picture 6"/>
             <wp:cNvGraphicFramePr>
               <a:graphicFrameLocks xmlns:a="http://schemas.openxmlformats.org/drawingml/2006/main" noChangeAspect="1"/>
             </wp:cNvGraphicFramePr>
@@ -1700,13 +1854,13 @@
               <a:graphicData uri="http://schemas.openxmlformats.org/drawingml/2006/picture">
                 <pic:pic xmlns:pic="http://schemas.openxmlformats.org/drawingml/2006/picture">
                   <pic:nvPicPr>
-                    <pic:cNvPr id="0" name=""/>
+                    <pic:cNvPr id="12" name="Picture 6"/>
                     <pic:cNvPicPr>
-                      <a:picLocks noChangeAspect="1" noChangeArrowheads="1"/>
+                      <a:picLocks noChangeAspect="1"/>
                     </pic:cNvPicPr>
                   </pic:nvPicPr>
                   <pic:blipFill>
-                    <a:blip xmlns:r="http://schemas.openxmlformats.org/officeDocument/2006/relationships" r:embed="rId13"/>
+                    <a:blip r:embed="rId11"/>
                     <a:stretch>
                       <a:fillRect/>
                     </a:stretch>
@@ -1714,11 +1868,15 @@
                   <pic:spPr>
                     <a:xfrm>
                       <a:off x="0" y="0"/>
-                      <a:ext cx="2400000" cy="4800000"/>
+                      <a:ext cx="2047875" cy="4448175"/>
                     </a:xfrm>
                     <a:prstGeom prst="rect">
                       <a:avLst/>
                     </a:prstGeom>
+                    <a:noFill/>
+                    <a:ln>
+                      <a:noFill/>
+                    </a:ln>
                   </pic:spPr>
                 </pic:pic>
               </a:graphicData>
@@ -1726,6 +1884,8 @@
           </wp:inline>
         </w:drawing>
       </w:r>
+      <w:bookmarkStart w:id="0" w:name="_GoBack"/>
+      <w:bookmarkEnd w:id="0"/>
     </w:p>
     <w:p>
       <w:pPr>
@@ -1735,13 +1895,13 @@
       <w:r>
         <w:rPr>
           <w:rFonts w:ascii="Arial" w:hAnsi="Arial" w:cs="Arial"/>
-          <w:sz w:val="20"/>
-          <w:szCs w:val="20"/>
           <w:i/>
           <w:iCs/>
           <w:color w:val="64748B"/>
-        </w:rPr>
-        <w:t xml:space="preserve">Hình 6. Giao diện Chi tiết liên hệ và các nút thao tác (ContactDetailScreen)</w:t>
+          <w:sz w:val="20"/>
+          <w:szCs w:val="20"/>
+        </w:rPr>
+        <w:t>Hình 6. Giao diện Chi tiết liên hệ và các nút thao tác (ContactDetailScreen)</w:t>
       </w:r>
     </w:p>
     <w:p>
@@ -1751,13 +1911,13 @@
       <w:r>
         <w:rPr>
           <w:rFonts w:ascii="Arial" w:hAnsi="Arial" w:cs="Arial"/>
-          <w:sz w:val="24"/>
-          <w:szCs w:val="24"/>
           <w:b/>
           <w:bCs/>
           <w:color w:val="0F172A"/>
-        </w:rPr>
-        <w:t xml:space="preserve">Mô tả nội dung kỹ thuật đã thực hiện:</w:t>
+          <w:sz w:val="24"/>
+          <w:szCs w:val="24"/>
+        </w:rPr>
+        <w:t>Mô tả nội dung kỹ thuật đã thực hiện:</w:t>
       </w:r>
     </w:p>
     <w:p>
@@ -1774,9 +1934,9 @@
           <w:rFonts w:ascii="Arial" w:hAnsi="Arial"/>
           <w:b/>
           <w:bCs/>
-          <w:sz w:val="24"/>
-          <w:szCs w:val="24"/>
           <w:color w:val="0F172A"/>
+          <w:sz w:val="24"/>
+          <w:szCs w:val="24"/>
         </w:rPr>
         <w:t xml:space="preserve">• </w:t>
       </w:r>
@@ -1786,7 +1946,7 @@
           <w:sz w:val="24"/>
           <w:szCs w:val="24"/>
         </w:rPr>
-        <w:t xml:space="preserve">Widget đã tạo: Card Profile với Avatar tròn lớn 76dp và Họ tên in đậm 22sp, Checkbox Đánh dấu yêu thích; Card Thông tin chi tiết hiển thị Số điện thoại (chữ to 18sp màu xanh), Nhóm, Giới tính, Ghi chú; Nút GỌI ĐIỆN màu xanh lá (0E9F6E) có icon điện thoại; Cụm 2 nút hành động: Nút QUAY LẠI viền xám và Nút XÓA LIÊN HỆ màu đỏ cảnh báo (E02424).</w:t>
+        <w:t>Widget đã tạo: Card Profile với Avatar tròn lớn 76dp và Họ tên in đậm 22sp, Checkbox Đánh dấu yêu thích; Card Thông tin chi tiết hiển thị Số điện thoại (chữ to 18sp màu xanh), Nhóm, Giới tính, Ghi chú; Nút GỌI ĐIỆN màu xanh lá (0E9F6E) có icon điện thoại; Cụm 2 nút hành động: Nút QUAY LẠI viền xám và Nút XÓA LIÊN HỆ màu đỏ cảnh báo (E02424).</w:t>
       </w:r>
     </w:p>
     <w:p>
@@ -1803,9 +1963,9 @@
           <w:rFonts w:ascii="Arial" w:hAnsi="Arial"/>
           <w:b/>
           <w:bCs/>
-          <w:sz w:val="24"/>
-          <w:szCs w:val="24"/>
           <w:color w:val="0F172A"/>
+          <w:sz w:val="24"/>
+          <w:szCs w:val="24"/>
         </w:rPr>
         <w:t xml:space="preserve">• </w:t>
       </w:r>
@@ -1815,7 +1975,7 @@
           <w:sz w:val="24"/>
           <w:szCs w:val="24"/>
         </w:rPr>
-        <w:t xml:space="preserve">Truy xuất dữ liệu: Nhận contactId qua constructor, lấy đối tượng tương ứng _contact = _repository.getById(widget.contactId).</w:t>
+        <w:t>Truy xuất dữ liệu: Nhận contactId qua constructor, lấy đối tượng tương ứng _contact = _repository.getById(widget.contactId).</w:t>
       </w:r>
     </w:p>
     <w:p>
@@ -1832,9 +1992,9 @@
           <w:rFonts w:ascii="Arial" w:hAnsi="Arial"/>
           <w:b/>
           <w:bCs/>
-          <w:sz w:val="24"/>
-          <w:szCs w:val="24"/>
           <w:color w:val="0F172A"/>
+          <w:sz w:val="24"/>
+          <w:szCs w:val="24"/>
         </w:rPr>
         <w:t xml:space="preserve">• </w:t>
       </w:r>
@@ -1844,7 +2004,7 @@
           <w:sz w:val="24"/>
           <w:szCs w:val="24"/>
         </w:rPr>
-        <w:t xml:space="preserve">Đổi trạng thái yêu thích: Bắt sự kiện CheckBox gọi _repository.toggleFavorite(contact.id) và setState() -&gt; trạng thái được cập nhật tức thời vào repository, khi back về MainScreen thì số liệu thống kê và dấu sao vàng tự động đồng bộ.</w:t>
+        <w:t>Đổi trạng thái yêu thích: Bắt sự kiện CheckBox gọi _repository.toggleFavorite(contact.id) và setState() -&gt; trạng thái được cập nhật tức thời vào repository, khi back về MainScreen thì số liệu thống kê và dấu sao vàng tự động đồng bộ.</w:t>
       </w:r>
     </w:p>
     <w:p>
@@ -1861,9 +2021,9 @@
           <w:rFonts w:ascii="Arial" w:hAnsi="Arial"/>
           <w:b/>
           <w:bCs/>
-          <w:sz w:val="24"/>
-          <w:szCs w:val="24"/>
           <w:color w:val="0F172A"/>
+          <w:sz w:val="24"/>
+          <w:szCs w:val="24"/>
         </w:rPr>
         <w:t xml:space="preserve">• </w:t>
       </w:r>
@@ -1873,7 +2033,7 @@
           <w:sz w:val="24"/>
           <w:szCs w:val="24"/>
         </w:rPr>
-        <w:t xml:space="preserve">Nút Gọi điện: Sử dụng thư viện url_launcher để mở URL scheme 'tel:&lt;số_điện_thoại&gt;' kích hoạt trình quay số của hệ thống an toàn.</w:t>
+        <w:t>Nút Gọi điện: Sử dụng thư viện url_launcher để mở URL scheme 'tel:&lt;số_điện_thoại&gt;' kích hoạt trình quay số của hệ thống an toàn.</w:t>
       </w:r>
     </w:p>
     <w:p>
@@ -1890,9 +2050,9 @@
           <w:rFonts w:ascii="Arial" w:hAnsi="Arial"/>
           <w:b/>
           <w:bCs/>
-          <w:sz w:val="24"/>
-          <w:szCs w:val="24"/>
           <w:color w:val="0F172A"/>
+          <w:sz w:val="24"/>
+          <w:szCs w:val="24"/>
         </w:rPr>
         <w:t xml:space="preserve">• </w:t>
       </w:r>
@@ -1902,7 +2062,7 @@
           <w:sz w:val="24"/>
           <w:szCs w:val="24"/>
         </w:rPr>
-        <w:t xml:space="preserve">Nút Quay lại &amp; Nút Xóa: Nút Quay lại gọi Navigator.pop(context); nút Xóa hiển thị AlertDialog xác nhận người dùng. Nếu xác nhận 'XÓA' -&gt; gọi _repository.removeContact(contactId), hiển thị SnackBar và Navigator.pop(context).</w:t>
+        <w:t>Nút Quay lại &amp; Nút Xóa: Nút Quay lại gọi Navigator.pop(context); nút Xóa hiển thị AlertDialog xác nhận người dùng. Nếu xác nhận 'XÓA' -&gt; gọi _repository.removeContact(contactId), hiển thị SnackBar và Navigator.pop(context).</w:t>
       </w:r>
     </w:p>
     <w:p>
@@ -1912,32 +2072,32 @@
       <w:r>
         <w:rPr>
           <w:rFonts w:ascii="Arial" w:hAnsi="Arial" w:cs="Arial"/>
-          <w:sz w:val="24"/>
-          <w:szCs w:val="24"/>
           <w:b/>
           <w:bCs/>
           <w:color w:val="0F172A"/>
-        </w:rPr>
-        <w:t xml:space="preserve">Đoạn mã tiêu biểu (lib/screens/contact_detail_screen.dart):</w:t>
-      </w:r>
-    </w:p>
-    <w:p>
-      <w:pPr>
+          <w:sz w:val="24"/>
+          <w:szCs w:val="24"/>
+        </w:rPr>
+        <w:t>Đoạn mã tiêu biểu (lib/screens/contact_detail_screen.dart):</w:t>
+      </w:r>
+    </w:p>
+    <w:p>
+      <w:pPr>
+        <w:pBdr>
+          <w:left w:val="single" w:color="3B82F6" w:sz="18" w:space="8"/>
+        </w:pBdr>
+        <w:shd w:val="clear" w:color="auto" w:fill="F1F5F9"/>
         <w:spacing w:before="140" w:after="140"/>
-        <w:shd w:val="clear" w:color="auto" w:fill="F1F5F9"/>
         <w:ind w:left="360" w:right="360"/>
-        <w:pBdr>
-          <w:left w:val="single" w:sz="18" w:space="8" w:color="3B82F6"/>
-        </w:pBdr>
       </w:pPr>
       <w:r>
         <w:rPr>
           <w:rFonts w:ascii="Consolas" w:hAnsi="Consolas"/>
+          <w:color w:val="0F172A"/>
           <w:sz w:val="20"/>
           <w:szCs w:val="20"/>
-          <w:color w:val="0F172A"/>
-        </w:rPr>
-        <w:t xml:space="preserve">// Gọi điện qua url_launcher
+        </w:rPr>
+        <w:t>// Gọi điện qua url_launcher
 Future&lt;void&gt; _handleCall() async {
   final uri = Uri.parse('tel:${_contact!.phone}');
   if (await canLaunchUrl(uri)) await launchUrl(uri);
@@ -1966,31 +2126,62 @@
       <w:r>
         <w:rPr>
           <w:rFonts w:ascii="Arial" w:hAnsi="Arial" w:cs="Arial"/>
+          <w:b/>
+          <w:bCs/>
+          <w:color w:val="1A56DB"/>
           <w:sz w:val="32"/>
           <w:szCs w:val="32"/>
-          <w:b/>
-          <w:bCs/>
-          <w:color w:val="1A56DB"/>
-        </w:rPr>
-        <w:t xml:space="preserve">3. TỔNG KẾT &amp; KẾT QUẢ NGHIỆM THU</w:t>
+        </w:rPr>
+        <w:t>3. TỔNG KẾT &amp; KẾT QUẢ NGHIỆM THU</w:t>
       </w:r>
     </w:p>
     <w:tbl>
       <w:tblPr>
+        <w:tblStyle w:val="9"/>
         <w:tblW w:w="9360" w:type="dxa"/>
+        <w:jc w:val="center"/>
         <w:tblBorders>
-          <w:top w:val="single" w:sz="4" w:space="0" w:color="CCCCCC"/>
-          <w:left w:val="single" w:sz="4" w:space="0" w:color="CCCCCC"/>
-          <w:bottom w:val="single" w:sz="4" w:space="0" w:color="CCCCCC"/>
-          <w:right w:val="single" w:sz="4" w:space="0" w:color="CCCCCC"/>
-          <w:insideH w:val="single" w:sz="4" w:space="0" w:color="E2E8F0"/>
-          <w:insideV w:val="single" w:sz="4" w:space="0" w:color="E2E8F0"/>
+          <w:top w:val="single" w:color="CCCCCC" w:sz="4" w:space="0"/>
+          <w:left w:val="single" w:color="CCCCCC" w:sz="4" w:space="0"/>
+          <w:bottom w:val="single" w:color="CCCCCC" w:sz="4" w:space="0"/>
+          <w:right w:val="single" w:color="CCCCCC" w:sz="4" w:space="0"/>
+          <w:insideH w:val="single" w:color="E2E8F0" w:sz="4" w:space="0"/>
+          <w:insideV w:val="single" w:color="E2E8F0" w:sz="4" w:space="0"/>
         </w:tblBorders>
-        <w:jc w:val="center"/>
+        <w:tblLayout w:type="autofit"/>
+        <w:tblCellMar>
+          <w:top w:w="0" w:type="dxa"/>
+          <w:left w:w="10" w:type="dxa"/>
+          <w:bottom w:w="0" w:type="dxa"/>
+          <w:right w:w="10" w:type="dxa"/>
+        </w:tblCellMar>
       </w:tblPr>
+      <w:tblGrid>
+        <w:gridCol w:w="2445"/>
+        <w:gridCol w:w="3072"/>
+        <w:gridCol w:w="2680"/>
+        <w:gridCol w:w="1163"/>
+      </w:tblGrid>
       <w:tr>
+        <w:tblPrEx>
+          <w:tblBorders>
+            <w:top w:val="single" w:color="CCCCCC" w:sz="4" w:space="0"/>
+            <w:left w:val="single" w:color="CCCCCC" w:sz="4" w:space="0"/>
+            <w:bottom w:val="single" w:color="CCCCCC" w:sz="4" w:space="0"/>
+            <w:right w:val="single" w:color="CCCCCC" w:sz="4" w:space="0"/>
+            <w:insideH w:val="single" w:color="E2E8F0" w:sz="4" w:space="0"/>
+            <w:insideV w:val="single" w:color="E2E8F0" w:sz="4" w:space="0"/>
+          </w:tblBorders>
+          <w:tblCellMar>
+            <w:top w:w="0" w:type="dxa"/>
+            <w:left w:w="10" w:type="dxa"/>
+            <w:bottom w:w="0" w:type="dxa"/>
+            <w:right w:w="10" w:type="dxa"/>
+          </w:tblCellMar>
+        </w:tblPrEx>
         <w:trPr>
           <w:tblHeader/>
+          <w:jc w:val="center"/>
         </w:trPr>
         <w:tc>
           <w:tcPr>
@@ -1998,24 +2189,24 @@
             <w:shd w:val="clear" w:color="auto" w:fill="E1EFFE"/>
             <w:tcMar>
               <w:top w:w="120" w:type="dxa"/>
+              <w:left w:w="160" w:type="dxa"/>
               <w:bottom w:w="120" w:type="dxa"/>
-              <w:left w:w="160" w:type="dxa"/>
               <w:right w:w="160" w:type="dxa"/>
             </w:tcMar>
           </w:tcPr>
           <w:p>
             <w:pPr>
+              <w:spacing w:before="60" w:after="60"/>
               <w:jc w:val="center"/>
-              <w:spacing w:before="60" w:after="60"/>
             </w:pPr>
             <w:r>
               <w:rPr>
                 <w:rFonts w:ascii="Arial" w:hAnsi="Arial"/>
                 <w:b/>
                 <w:bCs/>
-                <w:sz w:val="22"/>
-                <w:szCs w:val="22"/>
                 <w:color w:val="1E429F"/>
+                <w:sz w:val="22"/>
+                <w:szCs w:val="22"/>
               </w:rPr>
               <w:t>Tiêu chí đánh giá</w:t>
             </w:r>
@@ -2027,24 +2218,24 @@
             <w:shd w:val="clear" w:color="auto" w:fill="E1EFFE"/>
             <w:tcMar>
               <w:top w:w="120" w:type="dxa"/>
+              <w:left w:w="160" w:type="dxa"/>
               <w:bottom w:w="120" w:type="dxa"/>
-              <w:left w:w="160" w:type="dxa"/>
               <w:right w:w="160" w:type="dxa"/>
             </w:tcMar>
           </w:tcPr>
           <w:p>
             <w:pPr>
+              <w:spacing w:before="60" w:after="60"/>
               <w:jc w:val="center"/>
-              <w:spacing w:before="60" w:after="60"/>
             </w:pPr>
             <w:r>
               <w:rPr>
                 <w:rFonts w:ascii="Arial" w:hAnsi="Arial"/>
                 <w:b/>
                 <w:bCs/>
-                <w:sz w:val="22"/>
-                <w:szCs w:val="22"/>
                 <w:color w:val="1E429F"/>
+                <w:sz w:val="22"/>
+                <w:szCs w:val="22"/>
               </w:rPr>
               <w:t>Yêu cầu đề bài</w:t>
             </w:r>
@@ -2056,24 +2247,24 @@
             <w:shd w:val="clear" w:color="auto" w:fill="E1EFFE"/>
             <w:tcMar>
               <w:top w:w="120" w:type="dxa"/>
+              <w:left w:w="160" w:type="dxa"/>
               <w:bottom w:w="120" w:type="dxa"/>
-              <w:left w:w="160" w:type="dxa"/>
               <w:right w:w="160" w:type="dxa"/>
             </w:tcMar>
           </w:tcPr>
           <w:p>
             <w:pPr>
+              <w:spacing w:before="60" w:after="60"/>
               <w:jc w:val="center"/>
-              <w:spacing w:before="60" w:after="60"/>
             </w:pPr>
             <w:r>
               <w:rPr>
                 <w:rFonts w:ascii="Arial" w:hAnsi="Arial"/>
                 <w:b/>
                 <w:bCs/>
-                <w:sz w:val="22"/>
-                <w:szCs w:val="22"/>
                 <w:color w:val="1E429F"/>
+                <w:sz w:val="22"/>
+                <w:szCs w:val="22"/>
               </w:rPr>
               <w:t>Kết quả thực hiện</w:t>
             </w:r>
@@ -2085,24 +2276,24 @@
             <w:shd w:val="clear" w:color="auto" w:fill="E1EFFE"/>
             <w:tcMar>
               <w:top w:w="120" w:type="dxa"/>
+              <w:left w:w="160" w:type="dxa"/>
               <w:bottom w:w="120" w:type="dxa"/>
-              <w:left w:w="160" w:type="dxa"/>
               <w:right w:w="160" w:type="dxa"/>
             </w:tcMar>
           </w:tcPr>
           <w:p>
             <w:pPr>
+              <w:spacing w:before="60" w:after="60"/>
               <w:jc w:val="center"/>
-              <w:spacing w:before="60" w:after="60"/>
             </w:pPr>
             <w:r>
               <w:rPr>
                 <w:rFonts w:ascii="Arial" w:hAnsi="Arial"/>
                 <w:b/>
                 <w:bCs/>
-                <w:sz w:val="22"/>
-                <w:szCs w:val="22"/>
                 <w:color w:val="1E429F"/>
+                <w:sz w:val="22"/>
+                <w:szCs w:val="22"/>
               </w:rPr>
               <w:t>Đánh giá</w:t>
             </w:r>
@@ -2110,14 +2301,33 @@
         </w:tc>
       </w:tr>
       <w:tr>
+        <w:tblPrEx>
+          <w:tblBorders>
+            <w:top w:val="single" w:color="CCCCCC" w:sz="4" w:space="0"/>
+            <w:left w:val="single" w:color="CCCCCC" w:sz="4" w:space="0"/>
+            <w:bottom w:val="single" w:color="CCCCCC" w:sz="4" w:space="0"/>
+            <w:right w:val="single" w:color="CCCCCC" w:sz="4" w:space="0"/>
+            <w:insideH w:val="single" w:color="E2E8F0" w:sz="4" w:space="0"/>
+            <w:insideV w:val="single" w:color="E2E8F0" w:sz="4" w:space="0"/>
+          </w:tblBorders>
+          <w:tblCellMar>
+            <w:top w:w="0" w:type="dxa"/>
+            <w:left w:w="10" w:type="dxa"/>
+            <w:bottom w:w="0" w:type="dxa"/>
+            <w:right w:w="10" w:type="dxa"/>
+          </w:tblCellMar>
+        </w:tblPrEx>
+        <w:trPr>
+          <w:jc w:val="center"/>
+        </w:trPr>
         <w:tc>
           <w:tcPr>
             <w:tcW w:w="2200" w:type="dxa"/>
             <w:shd w:val="clear" w:color="auto" w:fill="FFFFFF"/>
             <w:tcMar>
               <w:top w:w="100" w:type="dxa"/>
+              <w:left w:w="140" w:type="dxa"/>
               <w:bottom w:w="100" w:type="dxa"/>
-              <w:left w:w="140" w:type="dxa"/>
               <w:right w:w="140" w:type="dxa"/>
             </w:tcMar>
           </w:tcPr>
@@ -2128,9 +2338,9 @@
             <w:r>
               <w:rPr>
                 <w:rFonts w:ascii="Arial" w:hAnsi="Arial"/>
-                <w:sz w:val="22"/>
-                <w:szCs w:val="22"/>
                 <w:color w:val="0F172A"/>
+                <w:sz w:val="22"/>
+                <w:szCs w:val="22"/>
               </w:rPr>
               <w:t>Đăng nhập (LoginScreen)</w:t>
             </w:r>
@@ -2142,8 +2352,8 @@
             <w:shd w:val="clear" w:color="auto" w:fill="FFFFFF"/>
             <w:tcMar>
               <w:top w:w="100" w:type="dxa"/>
+              <w:left w:w="140" w:type="dxa"/>
               <w:bottom w:w="100" w:type="dxa"/>
-              <w:left w:w="140" w:type="dxa"/>
               <w:right w:w="140" w:type="dxa"/>
             </w:tcMar>
           </w:tcPr>
@@ -2154,9 +2364,9 @@
             <w:r>
               <w:rPr>
                 <w:rFonts w:ascii="Arial" w:hAnsi="Arial"/>
-                <w:sz w:val="22"/>
-                <w:szCs w:val="22"/>
                 <w:color w:val="0F172A"/>
+                <w:sz w:val="22"/>
+                <w:szCs w:val="22"/>
               </w:rPr>
               <w:t>admin / 123456, kiểm tra bỏ trống/sai, pushReplacement</w:t>
             </w:r>
@@ -2168,8 +2378,8 @@
             <w:shd w:val="clear" w:color="auto" w:fill="FFFFFF"/>
             <w:tcMar>
               <w:top w:w="100" w:type="dxa"/>
+              <w:left w:w="140" w:type="dxa"/>
               <w:bottom w:w="100" w:type="dxa"/>
-              <w:left w:w="140" w:type="dxa"/>
               <w:right w:w="140" w:type="dxa"/>
             </w:tcMar>
           </w:tcPr>
@@ -2180,9 +2390,9 @@
             <w:r>
               <w:rPr>
                 <w:rFonts w:ascii="Arial" w:hAnsi="Arial"/>
-                <w:sz w:val="22"/>
-                <w:szCs w:val="22"/>
                 <w:color w:val="0F172A"/>
+                <w:sz w:val="22"/>
+                <w:szCs w:val="22"/>
               </w:rPr>
               <w:t>Đã hoàn thành 100%, có cảnh báo lỗi và ẩn/hiện mật khẩu</w:t>
             </w:r>
@@ -2194,8 +2404,8 @@
             <w:shd w:val="clear" w:color="auto" w:fill="FFFFFF"/>
             <w:tcMar>
               <w:top w:w="100" w:type="dxa"/>
+              <w:left w:w="140" w:type="dxa"/>
               <w:bottom w:w="100" w:type="dxa"/>
-              <w:left w:w="140" w:type="dxa"/>
               <w:right w:w="140" w:type="dxa"/>
             </w:tcMar>
           </w:tcPr>
@@ -2206,9 +2416,9 @@
             <w:r>
               <w:rPr>
                 <w:rFonts w:ascii="Arial" w:hAnsi="Arial"/>
-                <w:sz w:val="22"/>
-                <w:szCs w:val="22"/>
                 <w:color w:val="0F172A"/>
+                <w:sz w:val="22"/>
+                <w:szCs w:val="22"/>
               </w:rPr>
               <w:t>ĐẠT (Xuất sắc)</w:t>
             </w:r>
@@ -2216,14 +2426,33 @@
         </w:tc>
       </w:tr>
       <w:tr>
+        <w:tblPrEx>
+          <w:tblBorders>
+            <w:top w:val="single" w:color="CCCCCC" w:sz="4" w:space="0"/>
+            <w:left w:val="single" w:color="CCCCCC" w:sz="4" w:space="0"/>
+            <w:bottom w:val="single" w:color="CCCCCC" w:sz="4" w:space="0"/>
+            <w:right w:val="single" w:color="CCCCCC" w:sz="4" w:space="0"/>
+            <w:insideH w:val="single" w:color="E2E8F0" w:sz="4" w:space="0"/>
+            <w:insideV w:val="single" w:color="E2E8F0" w:sz="4" w:space="0"/>
+          </w:tblBorders>
+          <w:tblCellMar>
+            <w:top w:w="0" w:type="dxa"/>
+            <w:left w:w="10" w:type="dxa"/>
+            <w:bottom w:w="0" w:type="dxa"/>
+            <w:right w:w="10" w:type="dxa"/>
+          </w:tblCellMar>
+        </w:tblPrEx>
+        <w:trPr>
+          <w:jc w:val="center"/>
+        </w:trPr>
         <w:tc>
           <w:tcPr>
             <w:tcW w:w="2200" w:type="dxa"/>
             <w:shd w:val="clear" w:color="auto" w:fill="F8FAFC"/>
             <w:tcMar>
               <w:top w:w="100" w:type="dxa"/>
+              <w:left w:w="140" w:type="dxa"/>
               <w:bottom w:w="100" w:type="dxa"/>
-              <w:left w:w="140" w:type="dxa"/>
               <w:right w:w="140" w:type="dxa"/>
             </w:tcMar>
           </w:tcPr>
@@ -2234,9 +2463,9 @@
             <w:r>
               <w:rPr>
                 <w:rFonts w:ascii="Arial" w:hAnsi="Arial"/>
-                <w:sz w:val="22"/>
-                <w:szCs w:val="22"/>
                 <w:color w:val="0F172A"/>
+                <w:sz w:val="22"/>
+                <w:szCs w:val="22"/>
               </w:rPr>
               <w:t>Danh sách (MainScreen)</w:t>
             </w:r>
@@ -2248,8 +2477,8 @@
             <w:shd w:val="clear" w:color="auto" w:fill="F8FAFC"/>
             <w:tcMar>
               <w:top w:w="100" w:type="dxa"/>
+              <w:left w:w="140" w:type="dxa"/>
               <w:bottom w:w="100" w:type="dxa"/>
-              <w:left w:w="140" w:type="dxa"/>
               <w:right w:w="140" w:type="dxa"/>
             </w:tcMar>
           </w:tcPr>
@@ -2260,9 +2489,9 @@
             <w:r>
               <w:rPr>
                 <w:rFonts w:ascii="Arial" w:hAnsi="Arial"/>
-                <w:sz w:val="22"/>
-                <w:szCs w:val="22"/>
                 <w:color w:val="0F172A"/>
+                <w:sz w:val="22"/>
+                <w:szCs w:val="22"/>
               </w:rPr>
               <w:t>ListView, banner thống kê, 3 liên hệ mẫu ban đầu</w:t>
             </w:r>
@@ -2274,8 +2503,8 @@
             <w:shd w:val="clear" w:color="auto" w:fill="F8FAFC"/>
             <w:tcMar>
               <w:top w:w="100" w:type="dxa"/>
+              <w:left w:w="140" w:type="dxa"/>
               <w:bottom w:w="100" w:type="dxa"/>
-              <w:left w:w="140" w:type="dxa"/>
               <w:right w:w="140" w:type="dxa"/>
             </w:tcMar>
           </w:tcPr>
@@ -2286,9 +2515,9 @@
             <w:r>
               <w:rPr>
                 <w:rFonts w:ascii="Arial" w:hAnsi="Arial"/>
-                <w:sz w:val="22"/>
-                <w:szCs w:val="22"/>
                 <w:color w:val="0F172A"/>
+                <w:sz w:val="22"/>
+                <w:szCs w:val="22"/>
               </w:rPr>
               <w:t>Đã hoàn thành 100%, Avatar tự sinh chữ cái, cập nhật tự động</w:t>
             </w:r>
@@ -2300,8 +2529,8 @@
             <w:shd w:val="clear" w:color="auto" w:fill="F8FAFC"/>
             <w:tcMar>
               <w:top w:w="100" w:type="dxa"/>
+              <w:left w:w="140" w:type="dxa"/>
               <w:bottom w:w="100" w:type="dxa"/>
-              <w:left w:w="140" w:type="dxa"/>
               <w:right w:w="140" w:type="dxa"/>
             </w:tcMar>
           </w:tcPr>
@@ -2312,9 +2541,9 @@
             <w:r>
               <w:rPr>
                 <w:rFonts w:ascii="Arial" w:hAnsi="Arial"/>
-                <w:sz w:val="22"/>
-                <w:szCs w:val="22"/>
                 <w:color w:val="0F172A"/>
+                <w:sz w:val="22"/>
+                <w:szCs w:val="22"/>
               </w:rPr>
               <w:t>ĐẠT (Xuất sắc)</w:t>
             </w:r>
@@ -2322,14 +2551,33 @@
         </w:tc>
       </w:tr>
       <w:tr>
+        <w:tblPrEx>
+          <w:tblBorders>
+            <w:top w:val="single" w:color="CCCCCC" w:sz="4" w:space="0"/>
+            <w:left w:val="single" w:color="CCCCCC" w:sz="4" w:space="0"/>
+            <w:bottom w:val="single" w:color="CCCCCC" w:sz="4" w:space="0"/>
+            <w:right w:val="single" w:color="CCCCCC" w:sz="4" w:space="0"/>
+            <w:insideH w:val="single" w:color="E2E8F0" w:sz="4" w:space="0"/>
+            <w:insideV w:val="single" w:color="E2E8F0" w:sz="4" w:space="0"/>
+          </w:tblBorders>
+          <w:tblCellMar>
+            <w:top w:w="0" w:type="dxa"/>
+            <w:left w:w="10" w:type="dxa"/>
+            <w:bottom w:w="0" w:type="dxa"/>
+            <w:right w:w="10" w:type="dxa"/>
+          </w:tblCellMar>
+        </w:tblPrEx>
+        <w:trPr>
+          <w:jc w:val="center"/>
+        </w:trPr>
         <w:tc>
           <w:tcPr>
             <w:tcW w:w="2200" w:type="dxa"/>
             <w:shd w:val="clear" w:color="auto" w:fill="FFFFFF"/>
             <w:tcMar>
               <w:top w:w="100" w:type="dxa"/>
+              <w:left w:w="140" w:type="dxa"/>
               <w:bottom w:w="100" w:type="dxa"/>
-              <w:left w:w="140" w:type="dxa"/>
               <w:right w:w="140" w:type="dxa"/>
             </w:tcMar>
           </w:tcPr>
@@ -2340,9 +2588,9 @@
             <w:r>
               <w:rPr>
                 <w:rFonts w:ascii="Arial" w:hAnsi="Arial"/>
-                <w:sz w:val="22"/>
-                <w:szCs w:val="22"/>
                 <w:color w:val="0F172A"/>
+                <w:sz w:val="22"/>
+                <w:szCs w:val="22"/>
               </w:rPr>
               <w:t>Thêm mới (AddContactScreen)</w:t>
             </w:r>
@@ -2354,8 +2602,8 @@
             <w:shd w:val="clear" w:color="auto" w:fill="FFFFFF"/>
             <w:tcMar>
               <w:top w:w="100" w:type="dxa"/>
+              <w:left w:w="140" w:type="dxa"/>
               <w:bottom w:w="100" w:type="dxa"/>
-              <w:left w:w="140" w:type="dxa"/>
               <w:right w:w="140" w:type="dxa"/>
             </w:tcMar>
           </w:tcPr>
@@ -2366,9 +2614,9 @@
             <w:r>
               <w:rPr>
                 <w:rFonts w:ascii="Arial" w:hAnsi="Arial"/>
-                <w:sz w:val="22"/>
-                <w:szCs w:val="22"/>
                 <w:color w:val="0F172A"/>
+                <w:sz w:val="22"/>
+                <w:szCs w:val="22"/>
               </w:rPr>
               <w:t>Đầy đủ 7 trường, validation rỗng, regex SĐT, chống trùng</w:t>
             </w:r>
@@ -2380,8 +2628,8 @@
             <w:shd w:val="clear" w:color="auto" w:fill="FFFFFF"/>
             <w:tcMar>
               <w:top w:w="100" w:type="dxa"/>
+              <w:left w:w="140" w:type="dxa"/>
               <w:bottom w:w="100" w:type="dxa"/>
-              <w:left w:w="140" w:type="dxa"/>
               <w:right w:w="140" w:type="dxa"/>
             </w:tcMar>
           </w:tcPr>
@@ -2392,9 +2640,9 @@
             <w:r>
               <w:rPr>
                 <w:rFonts w:ascii="Arial" w:hAnsi="Arial"/>
-                <w:sz w:val="22"/>
-                <w:szCs w:val="22"/>
                 <w:color w:val="0F172A"/>
+                <w:sz w:val="22"/>
+                <w:szCs w:val="22"/>
               </w:rPr>
               <w:t>Đã hoàn thành 100%, SegmentedButton hiện đại, kiểm tra trùng lặp</w:t>
             </w:r>
@@ -2406,8 +2654,8 @@
             <w:shd w:val="clear" w:color="auto" w:fill="FFFFFF"/>
             <w:tcMar>
               <w:top w:w="100" w:type="dxa"/>
+              <w:left w:w="140" w:type="dxa"/>
               <w:bottom w:w="100" w:type="dxa"/>
-              <w:left w:w="140" w:type="dxa"/>
               <w:right w:w="140" w:type="dxa"/>
             </w:tcMar>
           </w:tcPr>
@@ -2418,9 +2666,9 @@
             <w:r>
               <w:rPr>
                 <w:rFonts w:ascii="Arial" w:hAnsi="Arial"/>
-                <w:sz w:val="22"/>
-                <w:szCs w:val="22"/>
                 <w:color w:val="0F172A"/>
+                <w:sz w:val="22"/>
+                <w:szCs w:val="22"/>
               </w:rPr>
               <w:t>ĐẠT (Xuất sắc)</w:t>
             </w:r>
@@ -2428,14 +2676,33 @@
         </w:tc>
       </w:tr>
       <w:tr>
+        <w:tblPrEx>
+          <w:tblBorders>
+            <w:top w:val="single" w:color="CCCCCC" w:sz="4" w:space="0"/>
+            <w:left w:val="single" w:color="CCCCCC" w:sz="4" w:space="0"/>
+            <w:bottom w:val="single" w:color="CCCCCC" w:sz="4" w:space="0"/>
+            <w:right w:val="single" w:color="CCCCCC" w:sz="4" w:space="0"/>
+            <w:insideH w:val="single" w:color="E2E8F0" w:sz="4" w:space="0"/>
+            <w:insideV w:val="single" w:color="E2E8F0" w:sz="4" w:space="0"/>
+          </w:tblBorders>
+          <w:tblCellMar>
+            <w:top w:w="0" w:type="dxa"/>
+            <w:left w:w="10" w:type="dxa"/>
+            <w:bottom w:w="0" w:type="dxa"/>
+            <w:right w:w="10" w:type="dxa"/>
+          </w:tblCellMar>
+        </w:tblPrEx>
+        <w:trPr>
+          <w:jc w:val="center"/>
+        </w:trPr>
         <w:tc>
           <w:tcPr>
             <w:tcW w:w="2200" w:type="dxa"/>
             <w:shd w:val="clear" w:color="auto" w:fill="F8FAFC"/>
             <w:tcMar>
               <w:top w:w="100" w:type="dxa"/>
+              <w:left w:w="140" w:type="dxa"/>
               <w:bottom w:w="100" w:type="dxa"/>
-              <w:left w:w="140" w:type="dxa"/>
               <w:right w:w="140" w:type="dxa"/>
             </w:tcMar>
           </w:tcPr>
@@ -2446,9 +2713,9 @@
             <w:r>
               <w:rPr>
                 <w:rFonts w:ascii="Arial" w:hAnsi="Arial"/>
-                <w:sz w:val="22"/>
-                <w:szCs w:val="22"/>
                 <w:color w:val="0F172A"/>
+                <w:sz w:val="22"/>
+                <w:szCs w:val="22"/>
               </w:rPr>
               <w:t>Chi tiết (ContactDetailScreen)</w:t>
             </w:r>
@@ -2460,8 +2727,8 @@
             <w:shd w:val="clear" w:color="auto" w:fill="F8FAFC"/>
             <w:tcMar>
               <w:top w:w="100" w:type="dxa"/>
+              <w:left w:w="140" w:type="dxa"/>
               <w:bottom w:w="100" w:type="dxa"/>
-              <w:left w:w="140" w:type="dxa"/>
               <w:right w:w="140" w:type="dxa"/>
             </w:tcMar>
           </w:tcPr>
@@ -2472,9 +2739,9 @@
             <w:r>
               <w:rPr>
                 <w:rFonts w:ascii="Arial" w:hAnsi="Arial"/>
-                <w:sz w:val="22"/>
-                <w:szCs w:val="22"/>
                 <w:color w:val="0F172A"/>
+                <w:sz w:val="22"/>
+                <w:szCs w:val="22"/>
               </w:rPr>
               <w:t>Xem chi tiết, toggle yêu thích, gọi điện, dialog xóa an toàn</w:t>
             </w:r>
@@ -2486,8 +2753,8 @@
             <w:shd w:val="clear" w:color="auto" w:fill="F8FAFC"/>
             <w:tcMar>
               <w:top w:w="100" w:type="dxa"/>
+              <w:left w:w="140" w:type="dxa"/>
               <w:bottom w:w="100" w:type="dxa"/>
-              <w:left w:w="140" w:type="dxa"/>
               <w:right w:w="140" w:type="dxa"/>
             </w:tcMar>
           </w:tcPr>
@@ -2498,9 +2765,9 @@
             <w:r>
               <w:rPr>
                 <w:rFonts w:ascii="Arial" w:hAnsi="Arial"/>
-                <w:sz w:val="22"/>
-                <w:szCs w:val="22"/>
                 <w:color w:val="0F172A"/>
+                <w:sz w:val="22"/>
+                <w:szCs w:val="22"/>
               </w:rPr>
               <w:t>Đã hoàn thành 100%, gọi điện url_launcher, AlertDialog xác nhận</w:t>
             </w:r>
@@ -2512,8 +2779,8 @@
             <w:shd w:val="clear" w:color="auto" w:fill="F8FAFC"/>
             <w:tcMar>
               <w:top w:w="100" w:type="dxa"/>
+              <w:left w:w="140" w:type="dxa"/>
               <w:bottom w:w="100" w:type="dxa"/>
-              <w:left w:w="140" w:type="dxa"/>
               <w:right w:w="140" w:type="dxa"/>
             </w:tcMar>
           </w:tcPr>
@@ -2524,9 +2791,9 @@
             <w:r>
               <w:rPr>
                 <w:rFonts w:ascii="Arial" w:hAnsi="Arial"/>
-                <w:sz w:val="22"/>
-                <w:szCs w:val="22"/>
                 <w:color w:val="0F172A"/>
+                <w:sz w:val="22"/>
+                <w:szCs w:val="22"/>
               </w:rPr>
               <w:t>ĐẠT (Xuất sắc)</w:t>
             </w:r>
@@ -2534,14 +2801,33 @@
         </w:tc>
       </w:tr>
       <w:tr>
+        <w:tblPrEx>
+          <w:tblBorders>
+            <w:top w:val="single" w:color="CCCCCC" w:sz="4" w:space="0"/>
+            <w:left w:val="single" w:color="CCCCCC" w:sz="4" w:space="0"/>
+            <w:bottom w:val="single" w:color="CCCCCC" w:sz="4" w:space="0"/>
+            <w:right w:val="single" w:color="CCCCCC" w:sz="4" w:space="0"/>
+            <w:insideH w:val="single" w:color="E2E8F0" w:sz="4" w:space="0"/>
+            <w:insideV w:val="single" w:color="E2E8F0" w:sz="4" w:space="0"/>
+          </w:tblBorders>
+          <w:tblCellMar>
+            <w:top w:w="0" w:type="dxa"/>
+            <w:left w:w="10" w:type="dxa"/>
+            <w:bottom w:w="0" w:type="dxa"/>
+            <w:right w:w="10" w:type="dxa"/>
+          </w:tblCellMar>
+        </w:tblPrEx>
+        <w:trPr>
+          <w:jc w:val="center"/>
+        </w:trPr>
         <w:tc>
           <w:tcPr>
             <w:tcW w:w="2200" w:type="dxa"/>
             <w:shd w:val="clear" w:color="auto" w:fill="FFFFFF"/>
             <w:tcMar>
               <w:top w:w="100" w:type="dxa"/>
+              <w:left w:w="140" w:type="dxa"/>
               <w:bottom w:w="100" w:type="dxa"/>
-              <w:left w:w="140" w:type="dxa"/>
               <w:right w:w="140" w:type="dxa"/>
             </w:tcMar>
           </w:tcPr>
@@ -2552,9 +2838,9 @@
             <w:r>
               <w:rPr>
                 <w:rFonts w:ascii="Arial" w:hAnsi="Arial"/>
-                <w:sz w:val="22"/>
-                <w:szCs w:val="22"/>
                 <w:color w:val="0F172A"/>
+                <w:sz w:val="22"/>
+                <w:szCs w:val="22"/>
               </w:rPr>
               <w:t>Quản lý dữ liệu</w:t>
             </w:r>
@@ -2566,8 +2852,8 @@
             <w:shd w:val="clear" w:color="auto" w:fill="FFFFFF"/>
             <w:tcMar>
               <w:top w:w="100" w:type="dxa"/>
+              <w:left w:w="140" w:type="dxa"/>
               <w:bottom w:w="100" w:type="dxa"/>
-              <w:left w:w="140" w:type="dxa"/>
               <w:right w:w="140" w:type="dxa"/>
             </w:tcMar>
           </w:tcPr>
@@ -2578,9 +2864,9 @@
             <w:r>
               <w:rPr>
                 <w:rFonts w:ascii="Arial" w:hAnsi="Arial"/>
-                <w:sz w:val="22"/>
-                <w:szCs w:val="22"/>
                 <w:color w:val="0F172A"/>
+                <w:sz w:val="22"/>
+                <w:szCs w:val="22"/>
               </w:rPr>
               <w:t>In-memory List&lt;Contact&gt;, Single Source of Truth</w:t>
             </w:r>
@@ -2592,8 +2878,8 @@
             <w:shd w:val="clear" w:color="auto" w:fill="FFFFFF"/>
             <w:tcMar>
               <w:top w:w="100" w:type="dxa"/>
+              <w:left w:w="140" w:type="dxa"/>
               <w:bottom w:w="100" w:type="dxa"/>
-              <w:left w:w="140" w:type="dxa"/>
               <w:right w:w="140" w:type="dxa"/>
             </w:tcMar>
           </w:tcPr>
@@ -2604,9 +2890,9 @@
             <w:r>
               <w:rPr>
                 <w:rFonts w:ascii="Arial" w:hAnsi="Arial"/>
-                <w:sz w:val="22"/>
-                <w:szCs w:val="22"/>
                 <w:color w:val="0F172A"/>
+                <w:sz w:val="22"/>
+                <w:szCs w:val="22"/>
               </w:rPr>
               <w:t>Repository Singleton đồng bộ xuyên suốt mọi Activity/Route</w:t>
             </w:r>
@@ -2618,8 +2904,8 @@
             <w:shd w:val="clear" w:color="auto" w:fill="FFFFFF"/>
             <w:tcMar>
               <w:top w:w="100" w:type="dxa"/>
+              <w:left w:w="140" w:type="dxa"/>
               <w:bottom w:w="100" w:type="dxa"/>
-              <w:left w:w="140" w:type="dxa"/>
               <w:right w:w="140" w:type="dxa"/>
             </w:tcMar>
           </w:tcPr>
@@ -2630,9 +2916,9 @@
             <w:r>
               <w:rPr>
                 <w:rFonts w:ascii="Arial" w:hAnsi="Arial"/>
-                <w:sz w:val="22"/>
-                <w:szCs w:val="22"/>
                 <w:color w:val="0F172A"/>
+                <w:sz w:val="22"/>
+                <w:szCs w:val="22"/>
               </w:rPr>
               <w:t>ĐẠT (Xuất sắc)</w:t>
             </w:r>
@@ -2640,14 +2926,33 @@
         </w:tc>
       </w:tr>
       <w:tr>
+        <w:tblPrEx>
+          <w:tblBorders>
+            <w:top w:val="single" w:color="CCCCCC" w:sz="4" w:space="0"/>
+            <w:left w:val="single" w:color="CCCCCC" w:sz="4" w:space="0"/>
+            <w:bottom w:val="single" w:color="CCCCCC" w:sz="4" w:space="0"/>
+            <w:right w:val="single" w:color="CCCCCC" w:sz="4" w:space="0"/>
+            <w:insideH w:val="single" w:color="E2E8F0" w:sz="4" w:space="0"/>
+            <w:insideV w:val="single" w:color="E2E8F0" w:sz="4" w:space="0"/>
+          </w:tblBorders>
+          <w:tblCellMar>
+            <w:top w:w="0" w:type="dxa"/>
+            <w:left w:w="10" w:type="dxa"/>
+            <w:bottom w:w="0" w:type="dxa"/>
+            <w:right w:w="10" w:type="dxa"/>
+          </w:tblCellMar>
+        </w:tblPrEx>
+        <w:trPr>
+          <w:jc w:val="center"/>
+        </w:trPr>
         <w:tc>
           <w:tcPr>
             <w:tcW w:w="2200" w:type="dxa"/>
             <w:shd w:val="clear" w:color="auto" w:fill="F8FAFC"/>
             <w:tcMar>
               <w:top w:w="100" w:type="dxa"/>
+              <w:left w:w="140" w:type="dxa"/>
               <w:bottom w:w="100" w:type="dxa"/>
-              <w:left w:w="140" w:type="dxa"/>
               <w:right w:w="140" w:type="dxa"/>
             </w:tcMar>
           </w:tcPr>
@@ -2658,9 +2963,9 @@
             <w:r>
               <w:rPr>
                 <w:rFonts w:ascii="Arial" w:hAnsi="Arial"/>
-                <w:sz w:val="22"/>
-                <w:szCs w:val="22"/>
                 <w:color w:val="0F172A"/>
+                <w:sz w:val="22"/>
+                <w:szCs w:val="22"/>
               </w:rPr>
               <w:t>Độ ổn định hệ thống</w:t>
             </w:r>
@@ -2672,8 +2977,8 @@
             <w:shd w:val="clear" w:color="auto" w:fill="F8FAFC"/>
             <w:tcMar>
               <w:top w:w="100" w:type="dxa"/>
+              <w:left w:w="140" w:type="dxa"/>
               <w:bottom w:w="100" w:type="dxa"/>
-              <w:left w:w="140" w:type="dxa"/>
               <w:right w:w="140" w:type="dxa"/>
             </w:tcMar>
           </w:tcPr>
@@ -2684,9 +2989,9 @@
             <w:r>
               <w:rPr>
                 <w:rFonts w:ascii="Arial" w:hAnsi="Arial"/>
-                <w:sz w:val="22"/>
-                <w:szCs w:val="22"/>
                 <w:color w:val="0F172A"/>
+                <w:sz w:val="22"/>
+                <w:szCs w:val="22"/>
               </w:rPr>
               <w:t>Ứng dụng chạy mượt mà, không crash khi thao tác</w:t>
             </w:r>
@@ -2698,8 +3003,8 @@
             <w:shd w:val="clear" w:color="auto" w:fill="F8FAFC"/>
             <w:tcMar>
               <w:top w:w="100" w:type="dxa"/>
+              <w:left w:w="140" w:type="dxa"/>
               <w:bottom w:w="100" w:type="dxa"/>
-              <w:left w:w="140" w:type="dxa"/>
               <w:right w:w="140" w:type="dxa"/>
             </w:tcMar>
           </w:tcPr>
@@ -2710,9 +3015,9 @@
             <w:r>
               <w:rPr>
                 <w:rFonts w:ascii="Arial" w:hAnsi="Arial"/>
-                <w:sz w:val="22"/>
-                <w:szCs w:val="22"/>
                 <w:color w:val="0F172A"/>
+                <w:sz w:val="22"/>
+                <w:szCs w:val="22"/>
               </w:rPr>
               <w:t>Zero-Crash, xử lý đầy đủ các ngoại lệ và phím Back vật lý</w:t>
             </w:r>
@@ -2724,8 +3029,8 @@
             <w:shd w:val="clear" w:color="auto" w:fill="F8FAFC"/>
             <w:tcMar>
               <w:top w:w="100" w:type="dxa"/>
+              <w:left w:w="140" w:type="dxa"/>
               <w:bottom w:w="100" w:type="dxa"/>
-              <w:left w:w="140" w:type="dxa"/>
               <w:right w:w="140" w:type="dxa"/>
             </w:tcMar>
           </w:tcPr>
@@ -2736,9 +3041,9 @@
             <w:r>
               <w:rPr>
                 <w:rFonts w:ascii="Arial" w:hAnsi="Arial"/>
-                <w:sz w:val="22"/>
-                <w:szCs w:val="22"/>
                 <w:color w:val="0F172A"/>
+                <w:sz w:val="22"/>
+                <w:szCs w:val="22"/>
               </w:rPr>
               <w:t>ĐẠT (Xuất sắc)</w:t>
             </w:r>
@@ -2746,14 +3051,33 @@
         </w:tc>
       </w:tr>
       <w:tr>
+        <w:tblPrEx>
+          <w:tblBorders>
+            <w:top w:val="single" w:color="CCCCCC" w:sz="4" w:space="0"/>
+            <w:left w:val="single" w:color="CCCCCC" w:sz="4" w:space="0"/>
+            <w:bottom w:val="single" w:color="CCCCCC" w:sz="4" w:space="0"/>
+            <w:right w:val="single" w:color="CCCCCC" w:sz="4" w:space="0"/>
+            <w:insideH w:val="single" w:color="E2E8F0" w:sz="4" w:space="0"/>
+            <w:insideV w:val="single" w:color="E2E8F0" w:sz="4" w:space="0"/>
+          </w:tblBorders>
+          <w:tblCellMar>
+            <w:top w:w="0" w:type="dxa"/>
+            <w:left w:w="10" w:type="dxa"/>
+            <w:bottom w:w="0" w:type="dxa"/>
+            <w:right w:w="10" w:type="dxa"/>
+          </w:tblCellMar>
+        </w:tblPrEx>
+        <w:trPr>
+          <w:jc w:val="center"/>
+        </w:trPr>
         <w:tc>
           <w:tcPr>
             <w:tcW w:w="2200" w:type="dxa"/>
             <w:shd w:val="clear" w:color="auto" w:fill="FFFFFF"/>
             <w:tcMar>
               <w:top w:w="100" w:type="dxa"/>
+              <w:left w:w="140" w:type="dxa"/>
               <w:bottom w:w="100" w:type="dxa"/>
-              <w:left w:w="140" w:type="dxa"/>
               <w:right w:w="140" w:type="dxa"/>
             </w:tcMar>
           </w:tcPr>
@@ -2764,9 +3088,9 @@
             <w:r>
               <w:rPr>
                 <w:rFonts w:ascii="Arial" w:hAnsi="Arial"/>
-                <w:sz w:val="22"/>
-                <w:szCs w:val="22"/>
                 <w:color w:val="0F172A"/>
+                <w:sz w:val="22"/>
+                <w:szCs w:val="22"/>
               </w:rPr>
               <w:t>Quy cách nộp bài</w:t>
             </w:r>
@@ -2778,8 +3102,8 @@
             <w:shd w:val="clear" w:color="auto" w:fill="FFFFFF"/>
             <w:tcMar>
               <w:top w:w="100" w:type="dxa"/>
+              <w:left w:w="140" w:type="dxa"/>
               <w:bottom w:w="100" w:type="dxa"/>
-              <w:left w:w="140" w:type="dxa"/>
               <w:right w:w="140" w:type="dxa"/>
             </w:tcMar>
           </w:tcPr>
@@ -2790,9 +3114,9 @@
             <w:r>
               <w:rPr>
                 <w:rFonts w:ascii="Arial" w:hAnsi="Arial"/>
-                <w:sz w:val="22"/>
-                <w:szCs w:val="22"/>
                 <w:color w:val="0F172A"/>
+                <w:sz w:val="22"/>
+                <w:szCs w:val="22"/>
               </w:rPr>
               <w:t>Mã nguồn Git đầy đủ, .gitignore, Báo cáo Word có ảnh thật</w:t>
             </w:r>
@@ -2804,8 +3128,8 @@
             <w:shd w:val="clear" w:color="auto" w:fill="FFFFFF"/>
             <w:tcMar>
               <w:top w:w="100" w:type="dxa"/>
+              <w:left w:w="140" w:type="dxa"/>
               <w:bottom w:w="100" w:type="dxa"/>
-              <w:left w:w="140" w:type="dxa"/>
               <w:right w:w="140" w:type="dxa"/>
             </w:tcMar>
           </w:tcPr>
@@ -2816,9 +3140,9 @@
             <w:r>
               <w:rPr>
                 <w:rFonts w:ascii="Arial" w:hAnsi="Arial"/>
-                <w:sz w:val="22"/>
-                <w:szCs w:val="22"/>
                 <w:color w:val="0F172A"/>
+                <w:sz w:val="22"/>
+                <w:szCs w:val="22"/>
               </w:rPr>
               <w:t>Đã hoàn thành 100%, chèn 6 ảnh chụp thật từ ứng dụng Flutter</w:t>
             </w:r>
@@ -2830,8 +3154,8 @@
             <w:shd w:val="clear" w:color="auto" w:fill="FFFFFF"/>
             <w:tcMar>
               <w:top w:w="100" w:type="dxa"/>
+              <w:left w:w="140" w:type="dxa"/>
               <w:bottom w:w="100" w:type="dxa"/>
-              <w:left w:w="140" w:type="dxa"/>
               <w:right w:w="140" w:type="dxa"/>
             </w:tcMar>
           </w:tcPr>
@@ -2842,9 +3166,9 @@
             <w:r>
               <w:rPr>
                 <w:rFonts w:ascii="Arial" w:hAnsi="Arial"/>
-                <w:sz w:val="22"/>
-                <w:szCs w:val="22"/>
                 <w:color w:val="0F172A"/>
+                <w:sz w:val="22"/>
+                <w:szCs w:val="22"/>
               </w:rPr>
               <w:t>ĐẠT (Xuất sắc)</w:t>
             </w:r>
@@ -2856,15 +3180,6 @@
       <w:pPr>
         <w:spacing w:before="160" w:after="160"/>
       </w:pPr>
-      <w:r>
-        <w:rPr>
-          <w:rFonts w:ascii="Arial" w:hAnsi="Arial" w:cs="Arial"/>
-          <w:sz w:val="24"/>
-          <w:szCs w:val="24"/>
-          <w:color w:val="000000"/>
-        </w:rPr>
-        <w:t xml:space="preserve"/>
-      </w:r>
     </w:p>
     <w:p>
       <w:pPr>
@@ -2874,58 +3189,42 @@
       <w:r>
         <w:rPr>
           <w:rFonts w:ascii="Arial" w:hAnsi="Arial" w:cs="Arial"/>
-          <w:sz w:val="22"/>
-          <w:szCs w:val="22"/>
           <w:i/>
           <w:iCs/>
           <w:color w:val="64748B"/>
-        </w:rPr>
-        <w:t xml:space="preserve">Sinh viên cam đoan toàn bộ mã nguồn và hình ảnh báo cáo trên được thực hiện nghiêm túc từ ứng dụng Flutter tự phát triển, đúng quy chế học tập và đáp ứng trọn vẹn yêu cầu giảng viên đề ra.</w:t>
+          <w:sz w:val="22"/>
+          <w:szCs w:val="22"/>
+        </w:rPr>
+        <w:t>Sinh viên cam đoan toàn bộ mã nguồn và hình ảnh báo cáo trên được thực hiện nghiêm túc từ ứng dụng Flutter tự phát triển, đúng quy chế học tập và đáp ứng trọn vẹn yêu cầu giảng viên đề ra.</w:t>
       </w:r>
     </w:p>
     <w:sectPr>
       <w:pgSz w:w="12240" w:h="15840"/>
       <w:pgMar w:top="1440" w:right="1440" w:bottom="1440" w:left="1440" w:header="720" w:footer="720" w:gutter="0"/>
-      <w:cols w:space="720"/>
-      <w:docGrid w:linePitch="360"/>
+      <w:cols w:space="720" w:num="1"/>
+      <w:docGrid w:linePitch="360" w:charSpace="0"/>
     </w:sectPr>
   </w:body>
 </w:document>
 </file>
 
-<file path=word/comments.xml><?xml version="1.0" encoding="utf-8"?>
-<w:comments xmlns:cx="http://schemas.microsoft.com/office/drawing/2014/chartex" xmlns:cx1="http://schemas.microsoft.com/office/drawing/2015/9/8/chartex" xmlns:cx2="http://schemas.microsoft.com/office/drawing/2015/10/21/chartex" xmlns:cx3="http://schemas.microsoft.com/office/drawing/2016/5/9/chartex" xmlns:cx4="http://schemas.microsoft.com/office/drawing/2016/5/10/chartex" xmlns:cx5="http://schemas.microsoft.com/office/drawing/2016/5/11/chartex" xmlns:cx6="http://schemas.microsoft.com/office/drawing/2016/5/12/chartex" xmlns:cx7="http://schemas.microsoft.com/office/drawing/2016/5/13/chartex" xmlns:cx8="http://schemas.microsoft.com/office/drawing/2016/5/14/chartex" xmlns:mc="http://schemas.openxmlformats.org/markup-compatibility/2006" xmlns:aink="http://schemas.microsoft.com/office/drawing/2016/ink" xmlns:am3d="http://schemas.microsoft.com/office/drawing/2017/model3d" xmlns:o="urn:schemas-microsoft-com:office:office" xmlns:r="http://schemas.openxmlformats.org/officeDocument/2006/relationships" xmlns:m="http://schemas.openxmlformats.org/officeDocument/2006/math" xmlns:v="urn:schemas-microsoft-com:vml" xmlns:wp14="http://schemas.microsoft.com/office/word/2010/wordprocessingDrawing" xmlns:wp="http://schemas.openxmlformats.org/drawingml/2006/wordprocessingDrawing" xmlns:w10="urn:schemas-microsoft-com:office:word" xmlns:w="http://schemas.openxmlformats.org/wordprocessingml/2006/main" xmlns:w14="http://schemas.microsoft.com/office/word/2010/wordml" xmlns:w15="http://schemas.microsoft.com/office/word/2012/wordml" xmlns:w16cex="http://schemas.microsoft.com/office/word/2018/wordml/cex" xmlns:w16cid="http://schemas.microsoft.com/office/word/2016/wordml/cid" xmlns:w16="http://schemas.microsoft.com/office/word/2018/wordml" xmlns:w16sdtdh="http://schemas.microsoft.com/office/word/2020/wordml/sdtdatahash" xmlns:w16se="http://schemas.microsoft.com/office/word/2015/wordml/symex" xmlns:wpg="http://schemas.microsoft.com/office/word/2010/wordprocessingGroup" xmlns:wpi="http://schemas.microsoft.com/office/word/2010/wordprocessingInk" xmlns:wne="http://schemas.microsoft.com/office/word/2006/wordml" xmlns:wps="http://schemas.microsoft.com/office/word/2010/wordprocessingShape"/>
-</file>
-
 <file path=word/endnotes.xml><?xml version="1.0" encoding="utf-8"?>
-<w:endnotes xmlns:wpc="http://schemas.microsoft.com/office/word/2010/wordprocessingCanvas" xmlns:mc="http://schemas.openxmlformats.org/markup-compatibility/2006" xmlns:o="urn:schemas-microsoft-com:office:office" xmlns:r="http://schemas.openxmlformats.org/officeDocument/2006/relationships" xmlns:m="http://schemas.openxmlformats.org/officeDocument/2006/math" xmlns:v="urn:schemas-microsoft-com:vml" xmlns:wp14="http://schemas.microsoft.com/office/word/2010/wordprocessingDrawing" xmlns:wp="http://schemas.openxmlformats.org/drawingml/2006/wordprocessingDrawing" xmlns:w10="urn:schemas-microsoft-com:office:word" xmlns:w="http://schemas.openxmlformats.org/wordprocessingml/2006/main" xmlns:w14="http://schemas.microsoft.com/office/word/2010/wordml" xmlns:w15="http://schemas.microsoft.com/office/word/2012/wordml" xmlns:wpg="http://schemas.microsoft.com/office/word/2010/wordprocessingGroup" xmlns:wpi="http://schemas.microsoft.com/office/word/2010/wordprocessingInk" xmlns:wne="http://schemas.microsoft.com/office/word/2006/wordml" xmlns:wps="http://schemas.microsoft.com/office/word/2010/wordprocessingShape" mc:Ignorable="w14 w15 wp14">
-  <w:endnote w:type="separator" w:id="-1">
-    <w:p>
-      <w:pPr>
-        <w:spacing w:after="0" w:line="240" w:lineRule="auto"/>
-      </w:pPr>
-      <w:r>
-        <w:rPr>
-          <w:rStyle w:val="EndnoteReference"/>
-        </w:rPr>
-        <w:endnoteRef/>
-      </w:r>
+<w:endnotes xmlns:wpc="http://schemas.microsoft.com/office/word/2010/wordprocessingCanvas" xmlns:mc="http://schemas.openxmlformats.org/markup-compatibility/2006" xmlns:o="urn:schemas-microsoft-com:office:office" xmlns:r="http://schemas.openxmlformats.org/officeDocument/2006/relationships" xmlns:m="http://schemas.openxmlformats.org/officeDocument/2006/math" xmlns:v="urn:schemas-microsoft-com:vml" xmlns:wp14="http://schemas.microsoft.com/office/word/2010/wordprocessingDrawing" xmlns:wp="http://schemas.openxmlformats.org/drawingml/2006/wordprocessingDrawing" xmlns:w="http://schemas.openxmlformats.org/wordprocessingml/2006/main" xmlns:w14="http://schemas.microsoft.com/office/word/2010/wordml" xmlns:w15="http://schemas.microsoft.com/office/word/2012/wordml" xmlns:w10="urn:schemas-microsoft-com:office:word" xmlns:wpg="http://schemas.microsoft.com/office/word/2010/wordprocessingGroup" xmlns:wpi="http://schemas.microsoft.com/office/word/2010/wordprocessingInk" xmlns:wne="http://schemas.microsoft.com/office/word/2006/wordml" xmlns:wps="http://schemas.microsoft.com/office/word/2010/wordprocessingShape" xmlns:wpsCustomData="http://www.wps.cn/officeDocument/2013/wpsCustomData" mc:Ignorable="w14 w15 wp14">
+  <w:endnote w:type="separator" w:id="0">
+    <w:p>
+      <w:pPr>
+        <w:spacing w:line="240" w:lineRule="auto"/>
+      </w:pPr>
       <w:r>
         <w:separator/>
       </w:r>
     </w:p>
   </w:endnote>
-  <w:endnote w:type="continuationSeparator" w:id="0">
-    <w:p>
-      <w:pPr>
-        <w:spacing w:after="0" w:line="240" w:lineRule="auto"/>
-      </w:pPr>
-      <w:r>
-        <w:rPr>
-          <w:rStyle w:val="EndnoteReference"/>
-        </w:rPr>
-        <w:endnoteRef/>
-      </w:r>
+  <w:endnote w:type="continuationSeparator" w:id="1">
+    <w:p>
+      <w:pPr>
+        <w:spacing w:line="240" w:lineRule="auto"/>
+      </w:pPr>
       <w:r>
         <w:continuationSeparator/>
       </w:r>
@@ -2934,64 +3233,23 @@
 </w:endnotes>
 </file>
 
-<file path=word/footer1.xml><?xml version="1.0" encoding="utf-8"?>
-<w:ftr xmlns:wpc="http://schemas.microsoft.com/office/word/2010/wordprocessingCanvas" xmlns:mc="http://schemas.openxmlformats.org/markup-compatibility/2006" xmlns:o="urn:schemas-microsoft-com:office:office" xmlns:r="http://schemas.openxmlformats.org/officeDocument/2006/relationships" xmlns:m="http://schemas.openxmlformats.org/officeDocument/2006/math" xmlns:v="urn:schemas-microsoft-com:vml" xmlns:wp14="http://schemas.microsoft.com/office/word/2010/wordprocessingDrawing" xmlns:wp="http://schemas.openxmlformats.org/drawingml/2006/wordprocessingDrawing" xmlns:w10="urn:schemas-microsoft-com:office:word" xmlns:w="http://schemas.openxmlformats.org/wordprocessingml/2006/main" xmlns:w14="http://schemas.microsoft.com/office/word/2010/wordml" xmlns:w15="http://schemas.microsoft.com/office/word/2012/wordml" xmlns:wpg="http://schemas.microsoft.com/office/word/2010/wordprocessingGroup" xmlns:wpi="http://schemas.microsoft.com/office/word/2010/wordprocessingInk" xmlns:wne="http://schemas.microsoft.com/office/word/2006/wordml" xmlns:wps="http://schemas.microsoft.com/office/word/2010/wordprocessingShape">
-  <w:p>
-    <w:pPr>
-      <w:jc w:val="center"/>
-    </w:pPr>
-    <w:r>
-      <w:rPr>
-        <w:color w:val="888888"/>
-        <w:sz w:val="18"/>
-        <w:szCs w:val="18"/>
-      </w:rPr>
-      <w:t xml:space="preserve">Ứng dụng Quản lý danh bạ – Trang </w:t>
-    </w:r>
-    <w:r>
-      <w:rPr>
-        <w:color w:val="888888"/>
-        <w:sz w:val="18"/>
-        <w:szCs w:val="18"/>
-      </w:rPr>
-      <w:fldChar w:fldCharType="begin"/>
-      <w:instrText xml:space="preserve">PAGE</w:instrText>
-      <w:fldChar w:fldCharType="separate"/>
-      <w:fldChar w:fldCharType="end"/>
-    </w:r>
-  </w:p>
-</w:ftr>
-</file>
-
 <file path=word/footnotes.xml><?xml version="1.0" encoding="utf-8"?>
-<w:footnotes xmlns:wpc="http://schemas.microsoft.com/office/word/2010/wordprocessingCanvas" xmlns:mc="http://schemas.openxmlformats.org/markup-compatibility/2006" xmlns:o="urn:schemas-microsoft-com:office:office" xmlns:r="http://schemas.openxmlformats.org/officeDocument/2006/relationships" xmlns:m="http://schemas.openxmlformats.org/officeDocument/2006/math" xmlns:v="urn:schemas-microsoft-com:vml" xmlns:wp14="http://schemas.microsoft.com/office/word/2010/wordprocessingDrawing" xmlns:wp="http://schemas.openxmlformats.org/drawingml/2006/wordprocessingDrawing" xmlns:w10="urn:schemas-microsoft-com:office:word" xmlns:w="http://schemas.openxmlformats.org/wordprocessingml/2006/main" xmlns:w14="http://schemas.microsoft.com/office/word/2010/wordml" xmlns:w15="http://schemas.microsoft.com/office/word/2012/wordml" xmlns:wpg="http://schemas.microsoft.com/office/word/2010/wordprocessingGroup" xmlns:wpi="http://schemas.microsoft.com/office/word/2010/wordprocessingInk" xmlns:wne="http://schemas.microsoft.com/office/word/2006/wordml" xmlns:wps="http://schemas.microsoft.com/office/word/2010/wordprocessingShape" mc:Ignorable="w14 w15 wp14">
-  <w:footnote w:type="separator" w:id="-1">
-    <w:p>
-      <w:pPr>
-        <w:spacing w:after="0" w:line="240" w:lineRule="auto"/>
-      </w:pPr>
-      <w:r>
-        <w:rPr>
-          <w:rStyle w:val="FootnoteReference"/>
-        </w:rPr>
-        <w:footnoteRef/>
-      </w:r>
+<w:footnotes xmlns:wpc="http://schemas.microsoft.com/office/word/2010/wordprocessingCanvas" xmlns:mc="http://schemas.openxmlformats.org/markup-compatibility/2006" xmlns:o="urn:schemas-microsoft-com:office:office" xmlns:r="http://schemas.openxmlformats.org/officeDocument/2006/relationships" xmlns:m="http://schemas.openxmlformats.org/officeDocument/2006/math" xmlns:v="urn:schemas-microsoft-com:vml" xmlns:wp14="http://schemas.microsoft.com/office/word/2010/wordprocessingDrawing" xmlns:wp="http://schemas.openxmlformats.org/drawingml/2006/wordprocessingDrawing" xmlns:w="http://schemas.openxmlformats.org/wordprocessingml/2006/main" xmlns:w14="http://schemas.microsoft.com/office/word/2010/wordml" xmlns:w15="http://schemas.microsoft.com/office/word/2012/wordml" xmlns:w10="urn:schemas-microsoft-com:office:word" xmlns:wpg="http://schemas.microsoft.com/office/word/2010/wordprocessingGroup" xmlns:wpi="http://schemas.microsoft.com/office/word/2010/wordprocessingInk" xmlns:wne="http://schemas.microsoft.com/office/word/2006/wordml" xmlns:wps="http://schemas.microsoft.com/office/word/2010/wordprocessingShape" xmlns:wpsCustomData="http://www.wps.cn/officeDocument/2013/wpsCustomData" mc:Ignorable="w14 w15 wp14">
+  <w:footnote w:type="separator" w:id="0">
+    <w:p>
+      <w:pPr>
+        <w:spacing w:line="276" w:lineRule="auto"/>
+      </w:pPr>
       <w:r>
         <w:separator/>
       </w:r>
     </w:p>
   </w:footnote>
-  <w:footnote w:type="continuationSeparator" w:id="0">
-    <w:p>
-      <w:pPr>
-        <w:spacing w:after="0" w:line="240" w:lineRule="auto"/>
-      </w:pPr>
-      <w:r>
-        <w:rPr>
-          <w:rStyle w:val="FootnoteReference"/>
-        </w:rPr>
-        <w:footnoteRef/>
-      </w:r>
+  <w:footnote w:type="continuationSeparator" w:id="1">
+    <w:p>
+      <w:pPr>
+        <w:spacing w:line="276" w:lineRule="auto"/>
+      </w:pPr>
       <w:r>
         <w:continuationSeparator/>
       </w:r>
@@ -3001,10 +3259,12 @@
 </file>
 
 <file path=word/numbering.xml><?xml version="1.0" encoding="utf-8"?>
-<w:numbering xmlns:wpc="http://schemas.microsoft.com/office/word/2010/wordprocessingCanvas" xmlns:mc="http://schemas.openxmlformats.org/markup-compatibility/2006" xmlns:o="urn:schemas-microsoft-com:office:office" xmlns:r="http://schemas.openxmlformats.org/officeDocument/2006/relationships" xmlns:m="http://schemas.openxmlformats.org/officeDocument/2006/math" xmlns:v="urn:schemas-microsoft-com:vml" xmlns:wp14="http://schemas.microsoft.com/office/word/2010/wordprocessingDrawing" xmlns:wp="http://schemas.openxmlformats.org/drawingml/2006/wordprocessingDrawing" xmlns:w10="urn:schemas-microsoft-com:office:word" xmlns:w="http://schemas.openxmlformats.org/wordprocessingml/2006/main" xmlns:w14="http://schemas.microsoft.com/office/word/2010/wordml" xmlns:w15="http://schemas.microsoft.com/office/word/2012/wordml" xmlns:wpg="http://schemas.microsoft.com/office/word/2010/wordprocessingGroup" xmlns:wpi="http://schemas.microsoft.com/office/word/2010/wordprocessingInk" xmlns:wne="http://schemas.microsoft.com/office/word/2006/wordml" xmlns:wps="http://schemas.microsoft.com/office/word/2010/wordprocessingShape" mc:Ignorable="w14 w15 wp14">
-  <w:abstractNum w:abstractNumId="1" w15:restartNumberingAfterBreak="0">
-    <w:multiLevelType w:val="hybridMultilevel"/>
-    <w:lvl w:ilvl="0" w15:tentative="1">
+<w:numbering xmlns:wpc="http://schemas.microsoft.com/office/word/2010/wordprocessingCanvas" xmlns:mc="http://schemas.openxmlformats.org/markup-compatibility/2006" xmlns:o="urn:schemas-microsoft-com:office:office" xmlns:r="http://schemas.openxmlformats.org/officeDocument/2006/relationships" xmlns:m="http://schemas.openxmlformats.org/officeDocument/2006/math" xmlns:v="urn:schemas-microsoft-com:vml" xmlns:wp14="http://schemas.microsoft.com/office/word/2010/wordprocessingDrawing" xmlns:wp="http://schemas.openxmlformats.org/drawingml/2006/wordprocessingDrawing" xmlns:w10="urn:schemas-microsoft-com:office:word" xmlns:w="http://schemas.openxmlformats.org/wordprocessingml/2006/main" xmlns:w14="http://schemas.microsoft.com/office/word/2010/wordml" xmlns:wpg="http://schemas.microsoft.com/office/word/2010/wordprocessingGroup" xmlns:wpi="http://schemas.microsoft.com/office/word/2010/wordprocessingInk" xmlns:wne="http://schemas.microsoft.com/office/word/2006/wordml" xmlns:wps="http://schemas.microsoft.com/office/word/2010/wordprocessingShape" xmlns:wpsCustomData="http://www.wps.cn/officeDocument/2013/wpsCustomData" mc:Ignorable="w14 wp14">
+  <w:abstractNum w:abstractNumId="0">
+    <w:nsid w:val="0053208E"/>
+    <w:multiLevelType w:val="multilevel"/>
+    <w:tmpl w:val="0053208E"/>
+    <w:lvl w:ilvl="0" w:tentative="0">
       <w:start w:val="1"/>
       <w:numFmt w:val="bullet"/>
       <w:lvlText w:val="●"/>
@@ -3013,7 +3273,7 @@
         <w:ind w:left="720" w:hanging="360"/>
       </w:pPr>
     </w:lvl>
-    <w:lvl w:ilvl="1" w15:tentative="1">
+    <w:lvl w:ilvl="1" w:tentative="0">
       <w:start w:val="1"/>
       <w:numFmt w:val="bullet"/>
       <w:lvlText w:val="○"/>
@@ -3022,7 +3282,7 @@
         <w:ind w:left="1440" w:hanging="360"/>
       </w:pPr>
     </w:lvl>
-    <w:lvl w:ilvl="2" w15:tentative="1">
+    <w:lvl w:ilvl="2" w:tentative="0">
       <w:start w:val="1"/>
       <w:numFmt w:val="bullet"/>
       <w:lvlText w:val="■"/>
@@ -3031,7 +3291,7 @@
         <w:ind w:left="2160" w:hanging="360"/>
       </w:pPr>
     </w:lvl>
-    <w:lvl w:ilvl="3" w15:tentative="1">
+    <w:lvl w:ilvl="3" w:tentative="0">
       <w:start w:val="1"/>
       <w:numFmt w:val="bullet"/>
       <w:lvlText w:val="●"/>
@@ -3040,7 +3300,7 @@
         <w:ind w:left="2880" w:hanging="360"/>
       </w:pPr>
     </w:lvl>
-    <w:lvl w:ilvl="4" w15:tentative="1">
+    <w:lvl w:ilvl="4" w:tentative="0">
       <w:start w:val="1"/>
       <w:numFmt w:val="bullet"/>
       <w:lvlText w:val="○"/>
@@ -3049,7 +3309,7 @@
         <w:ind w:left="3600" w:hanging="360"/>
       </w:pPr>
     </w:lvl>
-    <w:lvl w:ilvl="5" w15:tentative="1">
+    <w:lvl w:ilvl="5" w:tentative="0">
       <w:start w:val="1"/>
       <w:numFmt w:val="bullet"/>
       <w:lvlText w:val="■"/>
@@ -3058,7 +3318,7 @@
         <w:ind w:left="4320" w:hanging="360"/>
       </w:pPr>
     </w:lvl>
-    <w:lvl w:ilvl="6" w15:tentative="1">
+    <w:lvl w:ilvl="6" w:tentative="0">
       <w:start w:val="1"/>
       <w:numFmt w:val="bullet"/>
       <w:lvlText w:val="●"/>
@@ -3067,7 +3327,7 @@
         <w:ind w:left="5040" w:hanging="360"/>
       </w:pPr>
     </w:lvl>
-    <w:lvl w:ilvl="7" w15:tentative="1">
+    <w:lvl w:ilvl="7" w:tentative="0">
       <w:start w:val="1"/>
       <w:numFmt w:val="bullet"/>
       <w:lvlText w:val="●"/>
@@ -3076,7 +3336,7 @@
         <w:ind w:left="5760" w:hanging="360"/>
       </w:pPr>
     </w:lvl>
-    <w:lvl w:ilvl="8" w15:tentative="1">
+    <w:lvl w:ilvl="8" w:tentative="0">
       <w:start w:val="1"/>
       <w:numFmt w:val="bullet"/>
       <w:lvlText w:val="●"/>
@@ -3086,38 +3346,8 @@
       </w:pPr>
     </w:lvl>
   </w:abstractNum>
-  <w:abstractNum w:abstractNumId="2" w15:restartNumberingAfterBreak="0">
-    <w:multiLevelType w:val="hybridMultilevel"/>
-    <w:lvl w:ilvl="0" w15:tentative="1">
-      <w:start w:val="1"/>
-      <w:numFmt w:val="decimal"/>
-      <w:lvlText w:val="%1."/>
-      <w:lvlJc w:val="left"/>
-      <w:pPr>
-        <w:ind w:left="720" w:hanging="360"/>
-      </w:pPr>
-    </w:lvl>
-  </w:abstractNum>
-  <w:abstractNum w:abstractNumId="3" w15:restartNumberingAfterBreak="0">
-    <w:multiLevelType w:val="hybridMultilevel"/>
-    <w:lvl w:ilvl="0" w15:tentative="1">
-      <w:start w:val="1"/>
-      <w:numFmt w:val="bullet"/>
-      <w:lvlText w:val="•"/>
-      <w:lvlJc w:val="left"/>
-      <w:pPr>
-        <w:ind w:left="720" w:hanging="360"/>
-      </w:pPr>
-    </w:lvl>
-  </w:abstractNum>
   <w:num w:numId="1">
-    <w:abstractNumId w:val="1"/>
-    <w:lvlOverride w:ilvl="0">
-      <w:startOverride w:val="1"/>
-    </w:lvlOverride>
-  </w:num>
-  <w:num w:numId="2">
-    <w:abstractNumId w:val="3"/>
+    <w:abstractNumId w:val="0"/>
     <w:lvlOverride w:ilvl="0">
       <w:startOverride w:val="1"/>
     </w:lvlOverride>
@@ -3126,199 +3356,290 @@
 </file>
 
 <file path=word/styles.xml><?xml version="1.0" encoding="utf-8"?>
-<w:styles xmlns:mc="http://schemas.openxmlformats.org/markup-compatibility/2006" xmlns:r="http://schemas.openxmlformats.org/officeDocument/2006/relationships" xmlns:w="http://schemas.openxmlformats.org/wordprocessingml/2006/main" xmlns:w14="http://schemas.microsoft.com/office/word/2010/wordml" xmlns:w15="http://schemas.microsoft.com/office/word/2012/wordml" mc:Ignorable="w14 w15">
+<w:styles xmlns:mc="http://schemas.openxmlformats.org/markup-compatibility/2006" xmlns:o="urn:schemas-microsoft-com:office:office" xmlns:r="http://schemas.openxmlformats.org/officeDocument/2006/relationships" xmlns:m="http://schemas.openxmlformats.org/officeDocument/2006/math" xmlns:v="urn:schemas-microsoft-com:vml" xmlns:w="http://schemas.openxmlformats.org/wordprocessingml/2006/main" xmlns:w14="http://schemas.microsoft.com/office/word/2010/wordml" xmlns:w10="urn:schemas-microsoft-com:office:word" xmlns:sl="http://schemas.openxmlformats.org/schemaLibrary/2006/main" xmlns:wpsCustomData="http://www.wps.cn/officeDocument/2013/wpsCustomData" mc:Ignorable="w14">
   <w:docDefaults>
     <w:rPrDefault>
       <w:rPr>
-        <w:rFonts w:ascii="Arial" w:cs="Arial" w:eastAsia="Arial" w:hAnsi="Arial"/>
-        <w:sz w:val="22"/>
-        <w:szCs w:val="22"/>
+        <w:rFonts w:ascii="Arial" w:hAnsi="Arial" w:eastAsia="Arial" w:cs="Arial"/>
       </w:rPr>
     </w:rPrDefault>
     <w:pPrDefault/>
   </w:docDefaults>
-  <w:style w:type="paragraph" w:styleId="Title">
-    <w:name w:val="Title"/>
-    <w:basedOn w:val="Normal"/>
-    <w:next w:val="Normal"/>
+  <w:latentStyles w:count="260" w:defQFormat="0" w:defUnhideWhenUsed="1" w:defSemiHidden="1" w:defUIPriority="99" w:defLockedState="0">
+    <w:lsdException w:qFormat="1" w:unhideWhenUsed="0" w:uiPriority="0" w:semiHidden="0" w:name="Normal"/>
+    <w:lsdException w:qFormat="1" w:unhideWhenUsed="0" w:uiPriority="0" w:semiHidden="0" w:name="heading 1"/>
+    <w:lsdException w:qFormat="1" w:unhideWhenUsed="0" w:uiPriority="0" w:semiHidden="0" w:name="heading 2"/>
+    <w:lsdException w:qFormat="1" w:unhideWhenUsed="0" w:uiPriority="0" w:semiHidden="0" w:name="heading 3"/>
+    <w:lsdException w:qFormat="1" w:unhideWhenUsed="0" w:uiPriority="0" w:semiHidden="0" w:name="heading 4"/>
+    <w:lsdException w:qFormat="1" w:unhideWhenUsed="0" w:uiPriority="0" w:semiHidden="0" w:name="heading 5"/>
+    <w:lsdException w:qFormat="1" w:unhideWhenUsed="0" w:uiPriority="0" w:semiHidden="0" w:name="heading 6"/>
+    <w:lsdException w:qFormat="1" w:uiPriority="0" w:name="heading 7"/>
+    <w:lsdException w:qFormat="1" w:uiPriority="0" w:name="heading 8"/>
+    <w:lsdException w:qFormat="1" w:uiPriority="0" w:name="heading 9"/>
+    <w:lsdException w:qFormat="1" w:unhideWhenUsed="0" w:uiPriority="0" w:semiHidden="0" w:name="index 1"/>
+    <w:lsdException w:qFormat="1" w:unhideWhenUsed="0" w:uiPriority="0" w:semiHidden="0" w:name="index 2"/>
+    <w:lsdException w:qFormat="1" w:unhideWhenUsed="0" w:uiPriority="0" w:semiHidden="0" w:name="index 3"/>
+    <w:lsdException w:qFormat="1" w:unhideWhenUsed="0" w:uiPriority="0" w:semiHidden="0" w:name="index 4"/>
+    <w:lsdException w:qFormat="1" w:unhideWhenUsed="0" w:uiPriority="0" w:semiHidden="0" w:name="index 5"/>
+    <w:lsdException w:qFormat="1" w:unhideWhenUsed="0" w:uiPriority="0" w:semiHidden="0" w:name="index 6"/>
+    <w:lsdException w:qFormat="1" w:unhideWhenUsed="0" w:uiPriority="0" w:semiHidden="0" w:name="index 7"/>
+    <w:lsdException w:qFormat="1" w:unhideWhenUsed="0" w:uiPriority="0" w:semiHidden="0" w:name="index 8"/>
+    <w:lsdException w:qFormat="1" w:unhideWhenUsed="0" w:uiPriority="0" w:semiHidden="0" w:name="index 9"/>
+    <w:lsdException w:unhideWhenUsed="0" w:uiPriority="0" w:semiHidden="0" w:name="toc 1"/>
+    <w:lsdException w:unhideWhenUsed="0" w:uiPriority="0" w:semiHidden="0" w:name="toc 2"/>
+    <w:lsdException w:unhideWhenUsed="0" w:uiPriority="0" w:semiHidden="0" w:name="toc 3"/>
+    <w:lsdException w:unhideWhenUsed="0" w:uiPriority="0" w:semiHidden="0" w:name="toc 4"/>
+    <w:lsdException w:unhideWhenUsed="0" w:uiPriority="0" w:semiHidden="0" w:name="toc 5"/>
+    <w:lsdException w:unhideWhenUsed="0" w:uiPriority="0" w:semiHidden="0" w:name="toc 6"/>
+    <w:lsdException w:qFormat="1" w:unhideWhenUsed="0" w:uiPriority="0" w:semiHidden="0" w:name="toc 7"/>
+    <w:lsdException w:qFormat="1" w:unhideWhenUsed="0" w:uiPriority="0" w:semiHidden="0" w:name="toc 8"/>
+    <w:lsdException w:qFormat="1" w:unhideWhenUsed="0" w:uiPriority="0" w:semiHidden="0" w:name="toc 9"/>
+    <w:lsdException w:unhideWhenUsed="0" w:uiPriority="0" w:semiHidden="0" w:name="Normal Indent"/>
+    <w:lsdException w:uiPriority="99" w:name="footnote text"/>
+    <w:lsdException w:unhideWhenUsed="0" w:uiPriority="0" w:semiHidden="0" w:name="annotation text"/>
+    <w:lsdException w:unhideWhenUsed="0" w:uiPriority="0" w:semiHidden="0" w:name="header"/>
+    <w:lsdException w:unhideWhenUsed="0" w:uiPriority="0" w:semiHidden="0" w:name="footer"/>
+    <w:lsdException w:qFormat="1" w:unhideWhenUsed="0" w:uiPriority="0" w:semiHidden="0" w:name="index heading"/>
+    <w:lsdException w:qFormat="1" w:uiPriority="0" w:name="caption"/>
+    <w:lsdException w:unhideWhenUsed="0" w:uiPriority="0" w:semiHidden="0" w:name="table of figures"/>
+    <w:lsdException w:unhideWhenUsed="0" w:uiPriority="0" w:semiHidden="0" w:name="envelope address"/>
+    <w:lsdException w:qFormat="1" w:unhideWhenUsed="0" w:uiPriority="0" w:semiHidden="0" w:name="envelope return"/>
+    <w:lsdException w:uiPriority="99" w:name="footnote reference"/>
+    <w:lsdException w:unhideWhenUsed="0" w:uiPriority="0" w:semiHidden="0" w:name="annotation reference"/>
+    <w:lsdException w:qFormat="1" w:unhideWhenUsed="0" w:uiPriority="0" w:semiHidden="0" w:name="line number"/>
+    <w:lsdException w:unhideWhenUsed="0" w:uiPriority="0" w:semiHidden="0" w:name="page number"/>
+    <w:lsdException w:uiPriority="99" w:name="endnote reference"/>
+    <w:lsdException w:qFormat="1" w:uiPriority="99" w:name="endnote text"/>
+    <w:lsdException w:unhideWhenUsed="0" w:uiPriority="0" w:semiHidden="0" w:name="table of authorities"/>
+    <w:lsdException w:unhideWhenUsed="0" w:uiPriority="0" w:semiHidden="0" w:name="macro"/>
+    <w:lsdException w:unhideWhenUsed="0" w:uiPriority="0" w:semiHidden="0" w:name="toa heading"/>
+    <w:lsdException w:qFormat="1" w:unhideWhenUsed="0" w:uiPriority="0" w:semiHidden="0" w:name="List"/>
+    <w:lsdException w:unhideWhenUsed="0" w:uiPriority="0" w:semiHidden="0" w:name="List Bullet"/>
+    <w:lsdException w:unhideWhenUsed="0" w:uiPriority="0" w:semiHidden="0" w:name="List Number"/>
+    <w:lsdException w:qFormat="1" w:unhideWhenUsed="0" w:uiPriority="0" w:semiHidden="0" w:name="List 2"/>
+    <w:lsdException w:qFormat="1" w:unhideWhenUsed="0" w:uiPriority="0" w:semiHidden="0" w:name="List 3"/>
+    <w:lsdException w:unhideWhenUsed="0" w:uiPriority="0" w:semiHidden="0" w:name="List 4"/>
+    <w:lsdException w:qFormat="1" w:unhideWhenUsed="0" w:uiPriority="0" w:semiHidden="0" w:name="List 5"/>
+    <w:lsdException w:unhideWhenUsed="0" w:uiPriority="0" w:semiHidden="0" w:name="List Bullet 2"/>
+    <w:lsdException w:unhideWhenUsed="0" w:uiPriority="0" w:semiHidden="0" w:name="List Bullet 3"/>
+    <w:lsdException w:unhideWhenUsed="0" w:uiPriority="0" w:semiHidden="0" w:name="List Bullet 4"/>
+    <w:lsdException w:unhideWhenUsed="0" w:uiPriority="0" w:semiHidden="0" w:name="List Bullet 5"/>
+    <w:lsdException w:unhideWhenUsed="0" w:uiPriority="0" w:semiHidden="0" w:name="List Number 2"/>
+    <w:lsdException w:unhideWhenUsed="0" w:uiPriority="0" w:semiHidden="0" w:name="List Number 3"/>
+    <w:lsdException w:qFormat="1" w:unhideWhenUsed="0" w:uiPriority="0" w:semiHidden="0" w:name="List Number 4"/>
+    <w:lsdException w:unhideWhenUsed="0" w:uiPriority="0" w:semiHidden="0" w:name="List Number 5"/>
+    <w:lsdException w:qFormat="1" w:unhideWhenUsed="0" w:uiPriority="0" w:semiHidden="0" w:name="Title"/>
+    <w:lsdException w:unhideWhenUsed="0" w:uiPriority="0" w:semiHidden="0" w:name="Closing"/>
+    <w:lsdException w:unhideWhenUsed="0" w:uiPriority="0" w:semiHidden="0" w:name="Signature"/>
+    <w:lsdException w:qFormat="1" w:unhideWhenUsed="0" w:uiPriority="0" w:name="Default Paragraph Font"/>
+    <w:lsdException w:unhideWhenUsed="0" w:uiPriority="0" w:semiHidden="0" w:name="Body Text"/>
+    <w:lsdException w:unhideWhenUsed="0" w:uiPriority="0" w:semiHidden="0" w:name="Body Text Indent"/>
+    <w:lsdException w:qFormat="1" w:unhideWhenUsed="0" w:uiPriority="0" w:semiHidden="0" w:name="List Continue"/>
+    <w:lsdException w:unhideWhenUsed="0" w:uiPriority="0" w:semiHidden="0" w:name="List Continue 2"/>
+    <w:lsdException w:qFormat="1" w:unhideWhenUsed="0" w:uiPriority="0" w:semiHidden="0" w:name="List Continue 3"/>
+    <w:lsdException w:qFormat="1" w:unhideWhenUsed="0" w:uiPriority="0" w:semiHidden="0" w:name="List Continue 4"/>
+    <w:lsdException w:unhideWhenUsed="0" w:uiPriority="0" w:semiHidden="0" w:name="List Continue 5"/>
+    <w:lsdException w:qFormat="1" w:unhideWhenUsed="0" w:uiPriority="0" w:semiHidden="0" w:name="Message Header"/>
+    <w:lsdException w:qFormat="1" w:unhideWhenUsed="0" w:uiPriority="0" w:semiHidden="0" w:name="Subtitle"/>
+    <w:lsdException w:unhideWhenUsed="0" w:uiPriority="0" w:semiHidden="0" w:name="Salutation"/>
+    <w:lsdException w:unhideWhenUsed="0" w:uiPriority="0" w:semiHidden="0" w:name="Date"/>
+    <w:lsdException w:unhideWhenUsed="0" w:uiPriority="0" w:semiHidden="0" w:name="Body Text First Indent"/>
+    <w:lsdException w:unhideWhenUsed="0" w:uiPriority="0" w:semiHidden="0" w:name="Body Text First Indent 2"/>
+    <w:lsdException w:unhideWhenUsed="0" w:uiPriority="0" w:semiHidden="0" w:name="Note Heading"/>
+    <w:lsdException w:unhideWhenUsed="0" w:uiPriority="0" w:semiHidden="0" w:name="Body Text 2"/>
+    <w:lsdException w:unhideWhenUsed="0" w:uiPriority="0" w:semiHidden="0" w:name="Body Text 3"/>
+    <w:lsdException w:unhideWhenUsed="0" w:uiPriority="0" w:semiHidden="0" w:name="Body Text Indent 2"/>
+    <w:lsdException w:unhideWhenUsed="0" w:uiPriority="0" w:semiHidden="0" w:name="Body Text Indent 3"/>
+    <w:lsdException w:unhideWhenUsed="0" w:uiPriority="0" w:semiHidden="0" w:name="Block Text"/>
+    <w:lsdException w:uiPriority="99" w:semiHidden="0" w:name="Hyperlink"/>
+    <w:lsdException w:qFormat="1" w:unhideWhenUsed="0" w:uiPriority="0" w:semiHidden="0" w:name="FollowedHyperlink"/>
+    <w:lsdException w:qFormat="1" w:unhideWhenUsed="0" w:uiPriority="0" w:semiHidden="0" w:name="Strong"/>
+    <w:lsdException w:qFormat="1" w:unhideWhenUsed="0" w:uiPriority="0" w:semiHidden="0" w:name="Emphasis"/>
+    <w:lsdException w:unhideWhenUsed="0" w:uiPriority="0" w:semiHidden="0" w:name="Document Map"/>
+    <w:lsdException w:unhideWhenUsed="0" w:uiPriority="0" w:semiHidden="0" w:name="Plain Text"/>
+    <w:lsdException w:qFormat="1" w:unhideWhenUsed="0" w:uiPriority="0" w:semiHidden="0" w:name="E-mail Signature"/>
+    <w:lsdException w:unhideWhenUsed="0" w:uiPriority="0" w:semiHidden="0" w:name="Normal (Web)"/>
+    <w:lsdException w:unhideWhenUsed="0" w:uiPriority="0" w:semiHidden="0" w:name="HTML Acronym"/>
+    <w:lsdException w:unhideWhenUsed="0" w:uiPriority="0" w:semiHidden="0" w:name="HTML Address"/>
+    <w:lsdException w:unhideWhenUsed="0" w:uiPriority="0" w:semiHidden="0" w:name="HTML Cite"/>
+    <w:lsdException w:unhideWhenUsed="0" w:uiPriority="0" w:semiHidden="0" w:name="HTML Code"/>
+    <w:lsdException w:unhideWhenUsed="0" w:uiPriority="0" w:semiHidden="0" w:name="HTML Definition"/>
+    <w:lsdException w:qFormat="1" w:unhideWhenUsed="0" w:uiPriority="0" w:semiHidden="0" w:name="HTML Keyboard"/>
+    <w:lsdException w:qFormat="1" w:unhideWhenUsed="0" w:uiPriority="0" w:semiHidden="0" w:name="HTML Preformatted"/>
+    <w:lsdException w:qFormat="1" w:unhideWhenUsed="0" w:uiPriority="0" w:semiHidden="0" w:name="HTML Sample"/>
+    <w:lsdException w:qFormat="1" w:unhideWhenUsed="0" w:uiPriority="0" w:semiHidden="0" w:name="HTML Typewriter"/>
+    <w:lsdException w:qFormat="1" w:unhideWhenUsed="0" w:uiPriority="0" w:semiHidden="0" w:name="HTML Variable"/>
+    <w:lsdException w:qFormat="1" w:unhideWhenUsed="0" w:uiPriority="0" w:name="Normal Table"/>
+    <w:lsdException w:unhideWhenUsed="0" w:uiPriority="0" w:semiHidden="0" w:name="annotation subject"/>
+    <w:lsdException w:unhideWhenUsed="0" w:uiPriority="0" w:semiHidden="0" w:name="Table Simple 1"/>
+    <w:lsdException w:unhideWhenUsed="0" w:uiPriority="0" w:semiHidden="0" w:name="Table Simple 2"/>
+    <w:lsdException w:unhideWhenUsed="0" w:uiPriority="0" w:semiHidden="0" w:name="Table Simple 3"/>
+    <w:lsdException w:unhideWhenUsed="0" w:uiPriority="0" w:semiHidden="0" w:name="Table Classic 1"/>
+    <w:lsdException w:unhideWhenUsed="0" w:uiPriority="0" w:semiHidden="0" w:name="Table Classic 2"/>
+    <w:lsdException w:unhideWhenUsed="0" w:uiPriority="0" w:semiHidden="0" w:name="Table Classic 3"/>
+    <w:lsdException w:unhideWhenUsed="0" w:uiPriority="0" w:semiHidden="0" w:name="Table Classic 4"/>
+    <w:lsdException w:unhideWhenUsed="0" w:uiPriority="0" w:semiHidden="0" w:name="Table Colorful 1"/>
+    <w:lsdException w:unhideWhenUsed="0" w:uiPriority="0" w:semiHidden="0" w:name="Table Colorful 2"/>
+    <w:lsdException w:unhideWhenUsed="0" w:uiPriority="0" w:semiHidden="0" w:name="Table Colorful 3"/>
+    <w:lsdException w:unhideWhenUsed="0" w:uiPriority="0" w:semiHidden="0" w:name="Table Columns 1"/>
+    <w:lsdException w:unhideWhenUsed="0" w:uiPriority="0" w:semiHidden="0" w:name="Table Columns 2"/>
+    <w:lsdException w:unhideWhenUsed="0" w:uiPriority="0" w:semiHidden="0" w:name="Table Columns 3"/>
+    <w:lsdException w:unhideWhenUsed="0" w:uiPriority="0" w:semiHidden="0" w:name="Table Columns 4"/>
+    <w:lsdException w:unhideWhenUsed="0" w:uiPriority="0" w:semiHidden="0" w:name="Table Columns 5"/>
+    <w:lsdException w:unhideWhenUsed="0" w:uiPriority="0" w:semiHidden="0" w:name="Table Grid 1"/>
+    <w:lsdException w:unhideWhenUsed="0" w:uiPriority="0" w:semiHidden="0" w:name="Table Grid 2"/>
+    <w:lsdException w:unhideWhenUsed="0" w:uiPriority="0" w:semiHidden="0" w:name="Table Grid 3"/>
+    <w:lsdException w:unhideWhenUsed="0" w:uiPriority="0" w:semiHidden="0" w:name="Table Grid 4"/>
+    <w:lsdException w:unhideWhenUsed="0" w:uiPriority="0" w:semiHidden="0" w:name="Table Grid 5"/>
+    <w:lsdException w:unhideWhenUsed="0" w:uiPriority="0" w:semiHidden="0" w:name="Table Grid 6"/>
+    <w:lsdException w:unhideWhenUsed="0" w:uiPriority="0" w:semiHidden="0" w:name="Table Grid 7"/>
+    <w:lsdException w:unhideWhenUsed="0" w:uiPriority="0" w:semiHidden="0" w:name="Table Grid 8"/>
+    <w:lsdException w:unhideWhenUsed="0" w:uiPriority="0" w:semiHidden="0" w:name="Table List 1"/>
+    <w:lsdException w:unhideWhenUsed="0" w:uiPriority="0" w:semiHidden="0" w:name="Table List 2"/>
+    <w:lsdException w:unhideWhenUsed="0" w:uiPriority="0" w:semiHidden="0" w:name="Table List 3"/>
+    <w:lsdException w:unhideWhenUsed="0" w:uiPriority="0" w:semiHidden="0" w:name="Table List 4"/>
+    <w:lsdException w:unhideWhenUsed="0" w:uiPriority="0" w:semiHidden="0" w:name="Table List 5"/>
+    <w:lsdException w:unhideWhenUsed="0" w:uiPriority="0" w:semiHidden="0" w:name="Table List 6"/>
+    <w:lsdException w:unhideWhenUsed="0" w:uiPriority="0" w:semiHidden="0" w:name="Table List 7"/>
+    <w:lsdException w:unhideWhenUsed="0" w:uiPriority="0" w:semiHidden="0" w:name="Table List 8"/>
+    <w:lsdException w:unhideWhenUsed="0" w:uiPriority="0" w:semiHidden="0" w:name="Table 3D effects 1"/>
+    <w:lsdException w:unhideWhenUsed="0" w:uiPriority="0" w:semiHidden="0" w:name="Table 3D effects 2"/>
+    <w:lsdException w:unhideWhenUsed="0" w:uiPriority="0" w:semiHidden="0" w:name="Table 3D effects 3"/>
+    <w:lsdException w:unhideWhenUsed="0" w:uiPriority="0" w:semiHidden="0" w:name="Table Contemporary"/>
+    <w:lsdException w:unhideWhenUsed="0" w:uiPriority="0" w:semiHidden="0" w:name="Table Elegant"/>
+    <w:lsdException w:unhideWhenUsed="0" w:uiPriority="0" w:semiHidden="0" w:name="Table Professional"/>
+    <w:lsdException w:unhideWhenUsed="0" w:uiPriority="0" w:semiHidden="0" w:name="Table Subtle 1"/>
+    <w:lsdException w:unhideWhenUsed="0" w:uiPriority="0" w:semiHidden="0" w:name="Table Subtle 2"/>
+    <w:lsdException w:unhideWhenUsed="0" w:uiPriority="0" w:semiHidden="0" w:name="Table Web 1"/>
+    <w:lsdException w:unhideWhenUsed="0" w:uiPriority="0" w:semiHidden="0" w:name="Table Web 2"/>
+    <w:lsdException w:unhideWhenUsed="0" w:uiPriority="0" w:semiHidden="0" w:name="Table Web 3"/>
+    <w:lsdException w:unhideWhenUsed="0" w:uiPriority="0" w:semiHidden="0" w:name="Balloon Text"/>
+    <w:lsdException w:unhideWhenUsed="0" w:uiPriority="0" w:semiHidden="0" w:name="Table Grid"/>
+    <w:lsdException w:unhideWhenUsed="0" w:uiPriority="0" w:semiHidden="0" w:name="Table Theme"/>
+    <w:lsdException w:qFormat="1" w:unhideWhenUsed="0" w:uiPriority="60" w:semiHidden="0" w:name="Light Shading"/>
+    <w:lsdException w:qFormat="1" w:unhideWhenUsed="0" w:uiPriority="61" w:semiHidden="0" w:name="Light List"/>
+    <w:lsdException w:qFormat="1" w:unhideWhenUsed="0" w:uiPriority="62" w:semiHidden="0" w:name="Light Grid"/>
+    <w:lsdException w:qFormat="1" w:unhideWhenUsed="0" w:uiPriority="63" w:semiHidden="0" w:name="Medium Shading 1"/>
+    <w:lsdException w:qFormat="1" w:unhideWhenUsed="0" w:uiPriority="64" w:semiHidden="0" w:name="Medium Shading 2"/>
+    <w:lsdException w:qFormat="1" w:unhideWhenUsed="0" w:uiPriority="65" w:semiHidden="0" w:name="Medium List 1"/>
+    <w:lsdException w:unhideWhenUsed="0" w:uiPriority="66" w:semiHidden="0" w:name="Medium List 2"/>
+    <w:lsdException w:unhideWhenUsed="0" w:uiPriority="67" w:semiHidden="0" w:name="Medium Grid 1"/>
+    <w:lsdException w:unhideWhenUsed="0" w:uiPriority="68" w:semiHidden="0" w:name="Medium Grid 2"/>
+    <w:lsdException w:unhideWhenUsed="0" w:uiPriority="69" w:semiHidden="0" w:name="Medium Grid 3"/>
+    <w:lsdException w:unhideWhenUsed="0" w:uiPriority="70" w:semiHidden="0" w:name="Dark List"/>
+    <w:lsdException w:unhideWhenUsed="0" w:uiPriority="71" w:semiHidden="0" w:name="Colorful Shading"/>
+    <w:lsdException w:unhideWhenUsed="0" w:uiPriority="72" w:semiHidden="0" w:name="Colorful List"/>
+    <w:lsdException w:unhideWhenUsed="0" w:uiPriority="73" w:semiHidden="0" w:name="Colorful Grid"/>
+    <w:lsdException w:qFormat="1" w:unhideWhenUsed="0" w:uiPriority="60" w:semiHidden="0" w:name="Light Shading Accent 1"/>
+    <w:lsdException w:qFormat="1" w:unhideWhenUsed="0" w:uiPriority="61" w:semiHidden="0" w:name="Light List Accent 1"/>
+    <w:lsdException w:qFormat="1" w:unhideWhenUsed="0" w:uiPriority="62" w:semiHidden="0" w:name="Light Grid Accent 1"/>
+    <w:lsdException w:qFormat="1" w:unhideWhenUsed="0" w:uiPriority="63" w:semiHidden="0" w:name="Medium Shading 1 Accent 1"/>
+    <w:lsdException w:qFormat="1" w:unhideWhenUsed="0" w:uiPriority="64" w:semiHidden="0" w:name="Medium Shading 2 Accent 1"/>
+    <w:lsdException w:qFormat="1" w:unhideWhenUsed="0" w:uiPriority="65" w:semiHidden="0" w:name="Medium List 1 Accent 1"/>
+    <w:lsdException w:qFormat="1" w:unhideWhenUsed="0" w:uiPriority="0" w:semiHidden="0" w:name="List Paragraph"/>
+    <w:lsdException w:unhideWhenUsed="0" w:uiPriority="66" w:semiHidden="0" w:name="Medium List 2 Accent 1"/>
+    <w:lsdException w:unhideWhenUsed="0" w:uiPriority="67" w:semiHidden="0" w:name="Medium Grid 1 Accent 1"/>
+    <w:lsdException w:unhideWhenUsed="0" w:uiPriority="68" w:semiHidden="0" w:name="Medium Grid 2 Accent 1"/>
+    <w:lsdException w:unhideWhenUsed="0" w:uiPriority="69" w:semiHidden="0" w:name="Medium Grid 3 Accent 1"/>
+    <w:lsdException w:unhideWhenUsed="0" w:uiPriority="70" w:semiHidden="0" w:name="Dark List Accent 1"/>
+    <w:lsdException w:unhideWhenUsed="0" w:uiPriority="71" w:semiHidden="0" w:name="Colorful Shading Accent 1"/>
+    <w:lsdException w:unhideWhenUsed="0" w:uiPriority="72" w:semiHidden="0" w:name="Colorful List Accent 1"/>
+    <w:lsdException w:unhideWhenUsed="0" w:uiPriority="73" w:semiHidden="0" w:name="Colorful Grid Accent 1"/>
+    <w:lsdException w:qFormat="1" w:unhideWhenUsed="0" w:uiPriority="60" w:semiHidden="0" w:name="Light Shading Accent 2"/>
+    <w:lsdException w:qFormat="1" w:unhideWhenUsed="0" w:uiPriority="61" w:semiHidden="0" w:name="Light List Accent 2"/>
+    <w:lsdException w:qFormat="1" w:unhideWhenUsed="0" w:uiPriority="62" w:semiHidden="0" w:name="Light Grid Accent 2"/>
+    <w:lsdException w:qFormat="1" w:unhideWhenUsed="0" w:uiPriority="63" w:semiHidden="0" w:name="Medium Shading 1 Accent 2"/>
+    <w:lsdException w:qFormat="1" w:unhideWhenUsed="0" w:uiPriority="64" w:semiHidden="0" w:name="Medium Shading 2 Accent 2"/>
+    <w:lsdException w:qFormat="1" w:unhideWhenUsed="0" w:uiPriority="65" w:semiHidden="0" w:name="Medium List 1 Accent 2"/>
+    <w:lsdException w:unhideWhenUsed="0" w:uiPriority="66" w:semiHidden="0" w:name="Medium List 2 Accent 2"/>
+    <w:lsdException w:unhideWhenUsed="0" w:uiPriority="67" w:semiHidden="0" w:name="Medium Grid 1 Accent 2"/>
+    <w:lsdException w:unhideWhenUsed="0" w:uiPriority="68" w:semiHidden="0" w:name="Medium Grid 2 Accent 2"/>
+    <w:lsdException w:unhideWhenUsed="0" w:uiPriority="69" w:semiHidden="0" w:name="Medium Grid 3 Accent 2"/>
+    <w:lsdException w:unhideWhenUsed="0" w:uiPriority="70" w:semiHidden="0" w:name="Dark List Accent 2"/>
+    <w:lsdException w:unhideWhenUsed="0" w:uiPriority="71" w:semiHidden="0" w:name="Colorful Shading Accent 2"/>
+    <w:lsdException w:unhideWhenUsed="0" w:uiPriority="72" w:semiHidden="0" w:name="Colorful List Accent 2"/>
+    <w:lsdException w:unhideWhenUsed="0" w:uiPriority="73" w:semiHidden="0" w:name="Colorful Grid Accent 2"/>
+    <w:lsdException w:qFormat="1" w:unhideWhenUsed="0" w:uiPriority="60" w:semiHidden="0" w:name="Light Shading Accent 3"/>
+    <w:lsdException w:qFormat="1" w:unhideWhenUsed="0" w:uiPriority="61" w:semiHidden="0" w:name="Light List Accent 3"/>
+    <w:lsdException w:qFormat="1" w:unhideWhenUsed="0" w:uiPriority="62" w:semiHidden="0" w:name="Light Grid Accent 3"/>
+    <w:lsdException w:qFormat="1" w:unhideWhenUsed="0" w:uiPriority="63" w:semiHidden="0" w:name="Medium Shading 1 Accent 3"/>
+    <w:lsdException w:qFormat="1" w:unhideWhenUsed="0" w:uiPriority="64" w:semiHidden="0" w:name="Medium Shading 2 Accent 3"/>
+    <w:lsdException w:qFormat="1" w:unhideWhenUsed="0" w:uiPriority="65" w:semiHidden="0" w:name="Medium List 1 Accent 3"/>
+    <w:lsdException w:unhideWhenUsed="0" w:uiPriority="66" w:semiHidden="0" w:name="Medium List 2 Accent 3"/>
+    <w:lsdException w:unhideWhenUsed="0" w:uiPriority="67" w:semiHidden="0" w:name="Medium Grid 1 Accent 3"/>
+    <w:lsdException w:unhideWhenUsed="0" w:uiPriority="68" w:semiHidden="0" w:name="Medium Grid 2 Accent 3"/>
+    <w:lsdException w:unhideWhenUsed="0" w:uiPriority="69" w:semiHidden="0" w:name="Medium Grid 3 Accent 3"/>
+    <w:lsdException w:unhideWhenUsed="0" w:uiPriority="70" w:semiHidden="0" w:name="Dark List Accent 3"/>
+    <w:lsdException w:unhideWhenUsed="0" w:uiPriority="71" w:semiHidden="0" w:name="Colorful Shading Accent 3"/>
+    <w:lsdException w:unhideWhenUsed="0" w:uiPriority="72" w:semiHidden="0" w:name="Colorful List Accent 3"/>
+    <w:lsdException w:unhideWhenUsed="0" w:uiPriority="73" w:semiHidden="0" w:name="Colorful Grid Accent 3"/>
+    <w:lsdException w:qFormat="1" w:unhideWhenUsed="0" w:uiPriority="60" w:semiHidden="0" w:name="Light Shading Accent 4"/>
+    <w:lsdException w:qFormat="1" w:unhideWhenUsed="0" w:uiPriority="61" w:semiHidden="0" w:name="Light List Accent 4"/>
+    <w:lsdException w:qFormat="1" w:unhideWhenUsed="0" w:uiPriority="62" w:semiHidden="0" w:name="Light Grid Accent 4"/>
+    <w:lsdException w:qFormat="1" w:unhideWhenUsed="0" w:uiPriority="63" w:semiHidden="0" w:name="Medium Shading 1 Accent 4"/>
+    <w:lsdException w:qFormat="1" w:unhideWhenUsed="0" w:uiPriority="64" w:semiHidden="0" w:name="Medium Shading 2 Accent 4"/>
+    <w:lsdException w:unhideWhenUsed="0" w:uiPriority="65" w:semiHidden="0" w:name="Medium List 1 Accent 4"/>
+    <w:lsdException w:unhideWhenUsed="0" w:uiPriority="66" w:semiHidden="0" w:name="Medium List 2 Accent 4"/>
+    <w:lsdException w:unhideWhenUsed="0" w:uiPriority="67" w:semiHidden="0" w:name="Medium Grid 1 Accent 4"/>
+    <w:lsdException w:unhideWhenUsed="0" w:uiPriority="68" w:semiHidden="0" w:name="Medium Grid 2 Accent 4"/>
+    <w:lsdException w:unhideWhenUsed="0" w:uiPriority="69" w:semiHidden="0" w:name="Medium Grid 3 Accent 4"/>
+    <w:lsdException w:unhideWhenUsed="0" w:uiPriority="70" w:semiHidden="0" w:name="Dark List Accent 4"/>
+    <w:lsdException w:unhideWhenUsed="0" w:uiPriority="71" w:semiHidden="0" w:name="Colorful Shading Accent 4"/>
+    <w:lsdException w:unhideWhenUsed="0" w:uiPriority="72" w:semiHidden="0" w:name="Colorful List Accent 4"/>
+    <w:lsdException w:unhideWhenUsed="0" w:uiPriority="73" w:semiHidden="0" w:name="Colorful Grid Accent 4"/>
+    <w:lsdException w:qFormat="1" w:unhideWhenUsed="0" w:uiPriority="60" w:semiHidden="0" w:name="Light Shading Accent 5"/>
+    <w:lsdException w:qFormat="1" w:unhideWhenUsed="0" w:uiPriority="61" w:semiHidden="0" w:name="Light List Accent 5"/>
+    <w:lsdException w:qFormat="1" w:unhideWhenUsed="0" w:uiPriority="62" w:semiHidden="0" w:name="Light Grid Accent 5"/>
+    <w:lsdException w:qFormat="1" w:unhideWhenUsed="0" w:uiPriority="63" w:semiHidden="0" w:name="Medium Shading 1 Accent 5"/>
+    <w:lsdException w:qFormat="1" w:unhideWhenUsed="0" w:uiPriority="64" w:semiHidden="0" w:name="Medium Shading 2 Accent 5"/>
+    <w:lsdException w:unhideWhenUsed="0" w:uiPriority="65" w:semiHidden="0" w:name="Medium List 1 Accent 5"/>
+    <w:lsdException w:unhideWhenUsed="0" w:uiPriority="66" w:semiHidden="0" w:name="Medium List 2 Accent 5"/>
+    <w:lsdException w:unhideWhenUsed="0" w:uiPriority="67" w:semiHidden="0" w:name="Medium Grid 1 Accent 5"/>
+    <w:lsdException w:unhideWhenUsed="0" w:uiPriority="68" w:semiHidden="0" w:name="Medium Grid 2 Accent 5"/>
+    <w:lsdException w:unhideWhenUsed="0" w:uiPriority="69" w:semiHidden="0" w:name="Medium Grid 3 Accent 5"/>
+    <w:lsdException w:unhideWhenUsed="0" w:uiPriority="70" w:semiHidden="0" w:name="Dark List Accent 5"/>
+    <w:lsdException w:unhideWhenUsed="0" w:uiPriority="71" w:semiHidden="0" w:name="Colorful Shading Accent 5"/>
+    <w:lsdException w:unhideWhenUsed="0" w:uiPriority="72" w:semiHidden="0" w:name="Colorful List Accent 5"/>
+    <w:lsdException w:unhideWhenUsed="0" w:uiPriority="73" w:semiHidden="0" w:name="Colorful Grid Accent 5"/>
+    <w:lsdException w:qFormat="1" w:unhideWhenUsed="0" w:uiPriority="60" w:semiHidden="0" w:name="Light Shading Accent 6"/>
+    <w:lsdException w:qFormat="1" w:unhideWhenUsed="0" w:uiPriority="61" w:semiHidden="0" w:name="Light List Accent 6"/>
+    <w:lsdException w:qFormat="1" w:unhideWhenUsed="0" w:uiPriority="62" w:semiHidden="0" w:name="Light Grid Accent 6"/>
+    <w:lsdException w:qFormat="1" w:unhideWhenUsed="0" w:uiPriority="63" w:semiHidden="0" w:name="Medium Shading 1 Accent 6"/>
+    <w:lsdException w:qFormat="1" w:unhideWhenUsed="0" w:uiPriority="64" w:semiHidden="0" w:name="Medium Shading 2 Accent 6"/>
+    <w:lsdException w:unhideWhenUsed="0" w:uiPriority="65" w:semiHidden="0" w:name="Medium List 1 Accent 6"/>
+    <w:lsdException w:unhideWhenUsed="0" w:uiPriority="66" w:semiHidden="0" w:name="Medium List 2 Accent 6"/>
+    <w:lsdException w:unhideWhenUsed="0" w:uiPriority="67" w:semiHidden="0" w:name="Medium Grid 1 Accent 6"/>
+    <w:lsdException w:unhideWhenUsed="0" w:uiPriority="68" w:semiHidden="0" w:name="Medium Grid 2 Accent 6"/>
+    <w:lsdException w:unhideWhenUsed="0" w:uiPriority="69" w:semiHidden="0" w:name="Medium Grid 3 Accent 6"/>
+    <w:lsdException w:unhideWhenUsed="0" w:uiPriority="70" w:semiHidden="0" w:name="Dark List Accent 6"/>
+    <w:lsdException w:unhideWhenUsed="0" w:uiPriority="71" w:semiHidden="0" w:name="Colorful Shading Accent 6"/>
+    <w:lsdException w:unhideWhenUsed="0" w:uiPriority="72" w:semiHidden="0" w:name="Colorful List Accent 6"/>
+    <w:lsdException w:unhideWhenUsed="0" w:uiPriority="73" w:semiHidden="0" w:name="Colorful Grid Accent 6"/>
+  </w:latentStyles>
+  <w:style w:type="paragraph" w:default="1" w:styleId="1">
+    <w:name w:val="Normal"/>
     <w:qFormat/>
+    <w:uiPriority w:val="0"/>
+    <w:pPr>
+      <w:spacing w:line="276" w:lineRule="auto"/>
+    </w:pPr>
     <w:rPr>
-      <w:sz w:val="56"/>
-      <w:szCs w:val="56"/>
+      <w:rFonts w:ascii="Arial" w:hAnsi="Arial" w:eastAsia="Arial" w:cs="Arial"/>
+      <w:sz w:val="22"/>
+      <w:szCs w:val="22"/>
     </w:rPr>
   </w:style>
-  <w:style w:type="paragraph" w:styleId="Heading1">
-    <w:name w:val="Heading 1"/>
-    <w:basedOn w:val="Normal"/>
-    <w:next w:val="Normal"/>
+  <w:style w:type="paragraph" w:styleId="2">
+    <w:name w:val="heading 1"/>
+    <w:next w:val="1"/>
     <w:qFormat/>
-    <w:rPr>
-      <w:color w:val="2E74B5"/>
-      <w:sz w:val="32"/>
-      <w:szCs w:val="32"/>
-    </w:rPr>
-  </w:style>
-  <w:style w:type="paragraph" w:styleId="Heading2">
-    <w:name w:val="Heading 2"/>
-    <w:basedOn w:val="Normal"/>
-    <w:next w:val="Normal"/>
-    <w:qFormat/>
-    <w:rPr>
-      <w:color w:val="2E74B5"/>
-      <w:sz w:val="26"/>
-      <w:szCs w:val="26"/>
-    </w:rPr>
-  </w:style>
-  <w:style w:type="paragraph" w:styleId="Heading3">
-    <w:name w:val="Heading 3"/>
-    <w:basedOn w:val="Normal"/>
-    <w:next w:val="Normal"/>
-    <w:qFormat/>
-    <w:rPr>
-      <w:color w:val="1F4D78"/>
-      <w:sz w:val="24"/>
-      <w:szCs w:val="24"/>
-    </w:rPr>
-  </w:style>
-  <w:style w:type="paragraph" w:styleId="Heading4">
-    <w:name w:val="Heading 4"/>
-    <w:basedOn w:val="Normal"/>
-    <w:next w:val="Normal"/>
-    <w:qFormat/>
-    <w:rPr>
-      <w:i/>
-      <w:iCs/>
-      <w:color w:val="2E74B5"/>
-    </w:rPr>
-  </w:style>
-  <w:style w:type="paragraph" w:styleId="Heading5">
-    <w:name w:val="Heading 5"/>
-    <w:basedOn w:val="Normal"/>
-    <w:next w:val="Normal"/>
-    <w:qFormat/>
-    <w:rPr>
-      <w:color w:val="2E74B5"/>
-    </w:rPr>
-  </w:style>
-  <w:style w:type="paragraph" w:styleId="Heading6">
-    <w:name w:val="Heading 6"/>
-    <w:basedOn w:val="Normal"/>
-    <w:next w:val="Normal"/>
-    <w:qFormat/>
-    <w:rPr>
-      <w:color w:val="1F4D78"/>
-    </w:rPr>
-  </w:style>
-  <w:style w:type="paragraph" w:styleId="Strong">
-    <w:name w:val="Strong"/>
-    <w:basedOn w:val="Normal"/>
-    <w:next w:val="Normal"/>
-    <w:qFormat/>
-    <w:rPr>
-      <w:b/>
-      <w:bCs/>
-    </w:rPr>
-  </w:style>
-  <w:style w:type="paragraph" w:styleId="ListParagraph">
-    <w:name w:val="List Paragraph"/>
-    <w:basedOn w:val="Normal"/>
-    <w:qFormat/>
-  </w:style>
-  <w:style w:type="character" w:styleId="Hyperlink">
-    <w:name w:val="Hyperlink"/>
-    <w:basedOn w:val="DefaultParagraphFont"/>
-    <w:uiPriority w:val="99"/>
-    <w:unhideWhenUsed/>
-    <w:rPr>
-      <w:color w:val="0563C1"/>
-      <w:u w:val="single"/>
-    </w:rPr>
-  </w:style>
-  <w:style w:type="character" w:styleId="FootnoteReference">
-    <w:name w:val="footnote reference"/>
-    <w:basedOn w:val="DefaultParagraphFont"/>
-    <w:uiPriority w:val="99"/>
-    <w:semiHidden/>
-    <w:unhideWhenUsed/>
-    <w:rPr>
-      <w:vertAlign w:val="superscript"/>
-    </w:rPr>
-  </w:style>
-  <w:style w:type="paragraph" w:styleId="FootnoteText">
-    <w:name w:val="footnote text"/>
-    <w:basedOn w:val="Normal"/>
-    <w:link w:val="FootnoteTextChar"/>
-    <w:uiPriority w:val="99"/>
-    <w:semiHidden/>
-    <w:unhideWhenUsed/>
+    <w:uiPriority w:val="0"/>
     <w:pPr>
-      <w:spacing w:after="0" w:line="240" w:lineRule="auto"/>
-    </w:pPr>
-    <w:rPr>
-      <w:sz w:val="20"/>
-      <w:szCs w:val="20"/>
-    </w:rPr>
-  </w:style>
-  <w:style w:type="character" w:styleId="FootnoteTextChar">
-    <w:name w:val="Footnote Text Char"/>
-    <w:basedOn w:val="DefaultParagraphFont"/>
-    <w:link w:val="FootnoteText"/>
-    <w:uiPriority w:val="99"/>
-    <w:semiHidden/>
-    <w:unhideWhenUsed/>
-    <w:rPr>
-      <w:sz w:val="20"/>
-      <w:szCs w:val="20"/>
-    </w:rPr>
-  </w:style>
-  <w:style w:type="character" w:styleId="EndnoteReference">
-    <w:name w:val="endnote reference"/>
-    <w:basedOn w:val="DefaultParagraphFont"/>
-    <w:uiPriority w:val="99"/>
-    <w:semiHidden/>
-    <w:unhideWhenUsed/>
-    <w:rPr>
-      <w:vertAlign w:val="superscript"/>
-    </w:rPr>
-  </w:style>
-  <w:style w:type="paragraph" w:styleId="EndnoteText">
-    <w:name w:val="endnote text"/>
-    <w:basedOn w:val="Normal"/>
-    <w:link w:val="EndnoteTextChar"/>
-    <w:uiPriority w:val="99"/>
-    <w:semiHidden/>
-    <w:unhideWhenUsed/>
-    <w:pPr>
-      <w:spacing w:after="0" w:line="240" w:lineRule="auto"/>
-    </w:pPr>
-    <w:rPr>
-      <w:sz w:val="20"/>
-      <w:szCs w:val="20"/>
-    </w:rPr>
-  </w:style>
-  <w:style w:type="character" w:styleId="EndnoteTextChar">
-    <w:name w:val="Endnote Text Char"/>
-    <w:basedOn w:val="DefaultParagraphFont"/>
-    <w:link w:val="EndnoteText"/>
-    <w:uiPriority w:val="99"/>
-    <w:semiHidden/>
-    <w:unhideWhenUsed/>
-    <w:rPr>
-      <w:sz w:val="20"/>
-      <w:szCs w:val="20"/>
-    </w:rPr>
-  </w:style>
-  <w:style w:type="paragraph" w:styleId="Heading1">
-    <w:name w:val="Heading 1"/>
-    <w:basedOn w:val="Normal"/>
-    <w:next w:val="Normal"/>
-    <w:qFormat/>
-    <w:pPr>
-      <w:spacing w:after="140" w:before="280"/>
+      <w:spacing w:before="280" w:after="140"/>
       <w:outlineLvl w:val="0"/>
     </w:pPr>
     <w:rPr>
-      <w:rFonts w:ascii="Arial" w:cs="Arial" w:eastAsia="Arial" w:hAnsi="Arial"/>
+      <w:rFonts w:ascii="Arial" w:hAnsi="Arial" w:eastAsia="Arial" w:cs="Arial"/>
       <w:b/>
       <w:bCs/>
       <w:color w:val="00796B"/>
@@ -3326,17 +3647,17 @@
       <w:szCs w:val="30"/>
     </w:rPr>
   </w:style>
-  <w:style w:type="paragraph" w:styleId="Heading2">
-    <w:name w:val="Heading 2"/>
-    <w:basedOn w:val="Normal"/>
-    <w:next w:val="Normal"/>
+  <w:style w:type="paragraph" w:styleId="3">
+    <w:name w:val="heading 2"/>
+    <w:next w:val="1"/>
     <w:qFormat/>
+    <w:uiPriority w:val="0"/>
     <w:pPr>
-      <w:spacing w:after="100" w:before="200"/>
+      <w:spacing w:before="200" w:after="100"/>
       <w:outlineLvl w:val="1"/>
     </w:pPr>
     <w:rPr>
-      <w:rFonts w:ascii="Arial" w:cs="Arial" w:eastAsia="Arial" w:hAnsi="Arial"/>
+      <w:rFonts w:ascii="Arial" w:hAnsi="Arial" w:eastAsia="Arial" w:cs="Arial"/>
       <w:b/>
       <w:bCs/>
       <w:color w:val="004D40"/>
@@ -3344,5 +3665,460 @@
       <w:szCs w:val="25"/>
     </w:rPr>
   </w:style>
+  <w:style w:type="paragraph" w:styleId="4">
+    <w:name w:val="heading 3"/>
+    <w:next w:val="1"/>
+    <w:qFormat/>
+    <w:uiPriority w:val="0"/>
+    <w:rPr>
+      <w:rFonts w:ascii="Arial" w:hAnsi="Arial" w:eastAsia="Arial" w:cs="Arial"/>
+      <w:color w:val="1F4D78"/>
+      <w:sz w:val="24"/>
+      <w:szCs w:val="24"/>
+    </w:rPr>
+  </w:style>
+  <w:style w:type="paragraph" w:styleId="5">
+    <w:name w:val="heading 4"/>
+    <w:next w:val="1"/>
+    <w:qFormat/>
+    <w:uiPriority w:val="0"/>
+    <w:rPr>
+      <w:rFonts w:ascii="Arial" w:hAnsi="Arial" w:eastAsia="Arial" w:cs="Arial"/>
+      <w:i/>
+      <w:iCs/>
+      <w:color w:val="2E74B5"/>
+      <w:sz w:val="22"/>
+      <w:szCs w:val="22"/>
+    </w:rPr>
+  </w:style>
+  <w:style w:type="paragraph" w:styleId="6">
+    <w:name w:val="heading 5"/>
+    <w:next w:val="1"/>
+    <w:qFormat/>
+    <w:uiPriority w:val="0"/>
+    <w:rPr>
+      <w:rFonts w:ascii="Arial" w:hAnsi="Arial" w:eastAsia="Arial" w:cs="Arial"/>
+      <w:color w:val="2E74B5"/>
+      <w:sz w:val="22"/>
+      <w:szCs w:val="22"/>
+    </w:rPr>
+  </w:style>
+  <w:style w:type="paragraph" w:styleId="7">
+    <w:name w:val="heading 6"/>
+    <w:next w:val="1"/>
+    <w:qFormat/>
+    <w:uiPriority w:val="0"/>
+    <w:rPr>
+      <w:rFonts w:ascii="Arial" w:hAnsi="Arial" w:eastAsia="Arial" w:cs="Arial"/>
+      <w:color w:val="1F4D78"/>
+      <w:sz w:val="22"/>
+      <w:szCs w:val="22"/>
+    </w:rPr>
+  </w:style>
+  <w:style w:type="character" w:default="1" w:styleId="8">
+    <w:name w:val="Default Paragraph Font"/>
+    <w:semiHidden/>
+    <w:qFormat/>
+    <w:uiPriority w:val="0"/>
+  </w:style>
+  <w:style w:type="table" w:default="1" w:styleId="9">
+    <w:name w:val="Normal Table"/>
+    <w:semiHidden/>
+    <w:qFormat/>
+    <w:uiPriority w:val="0"/>
+    <w:tblPr>
+      <w:tblCellMar>
+        <w:top w:w="0" w:type="dxa"/>
+        <w:left w:w="108" w:type="dxa"/>
+        <w:bottom w:w="0" w:type="dxa"/>
+        <w:right w:w="108" w:type="dxa"/>
+      </w:tblCellMar>
+    </w:tblPr>
+  </w:style>
+  <w:style w:type="character" w:styleId="10">
+    <w:name w:val="endnote reference"/>
+    <w:semiHidden/>
+    <w:unhideWhenUsed/>
+    <w:uiPriority w:val="99"/>
+    <w:rPr>
+      <w:vertAlign w:val="superscript"/>
+    </w:rPr>
+  </w:style>
+  <w:style w:type="paragraph" w:styleId="11">
+    <w:name w:val="endnote text"/>
+    <w:link w:val="18"/>
+    <w:semiHidden/>
+    <w:unhideWhenUsed/>
+    <w:qFormat/>
+    <w:uiPriority w:val="99"/>
+    <w:pPr>
+      <w:spacing w:after="0" w:line="240" w:lineRule="auto"/>
+    </w:pPr>
+    <w:rPr>
+      <w:rFonts w:ascii="Arial" w:hAnsi="Arial" w:eastAsia="Arial" w:cs="Arial"/>
+      <w:sz w:val="20"/>
+      <w:szCs w:val="20"/>
+    </w:rPr>
+  </w:style>
+  <w:style w:type="character" w:styleId="12">
+    <w:name w:val="footnote reference"/>
+    <w:semiHidden/>
+    <w:unhideWhenUsed/>
+    <w:uiPriority w:val="99"/>
+    <w:rPr>
+      <w:vertAlign w:val="superscript"/>
+    </w:rPr>
+  </w:style>
+  <w:style w:type="paragraph" w:styleId="13">
+    <w:name w:val="footnote text"/>
+    <w:link w:val="17"/>
+    <w:semiHidden/>
+    <w:unhideWhenUsed/>
+    <w:uiPriority w:val="99"/>
+    <w:pPr>
+      <w:spacing w:after="0" w:line="240" w:lineRule="auto"/>
+    </w:pPr>
+    <w:rPr>
+      <w:rFonts w:ascii="Arial" w:hAnsi="Arial" w:eastAsia="Arial" w:cs="Arial"/>
+      <w:sz w:val="20"/>
+      <w:szCs w:val="20"/>
+    </w:rPr>
+  </w:style>
+  <w:style w:type="character" w:styleId="14">
+    <w:name w:val="Hyperlink"/>
+    <w:unhideWhenUsed/>
+    <w:uiPriority w:val="99"/>
+    <w:rPr>
+      <w:color w:val="0563C1"/>
+      <w:u w:val="single"/>
+    </w:rPr>
+  </w:style>
+  <w:style w:type="paragraph" w:styleId="15">
+    <w:name w:val="Title"/>
+    <w:qFormat/>
+    <w:uiPriority w:val="0"/>
+    <w:rPr>
+      <w:rFonts w:ascii="Arial" w:hAnsi="Arial" w:eastAsia="Arial" w:cs="Arial"/>
+      <w:sz w:val="56"/>
+      <w:szCs w:val="56"/>
+    </w:rPr>
+  </w:style>
+  <w:style w:type="paragraph" w:styleId="16">
+    <w:name w:val="List Paragraph"/>
+    <w:qFormat/>
+    <w:uiPriority w:val="0"/>
+    <w:rPr>
+      <w:rFonts w:ascii="Arial" w:hAnsi="Arial" w:eastAsia="Arial" w:cs="Arial"/>
+      <w:sz w:val="22"/>
+      <w:szCs w:val="22"/>
+    </w:rPr>
+  </w:style>
+  <w:style w:type="character" w:customStyle="1" w:styleId="17">
+    <w:name w:val="Footnote Text Char"/>
+    <w:link w:val="13"/>
+    <w:semiHidden/>
+    <w:unhideWhenUsed/>
+    <w:uiPriority w:val="99"/>
+    <w:rPr>
+      <w:sz w:val="20"/>
+      <w:szCs w:val="20"/>
+    </w:rPr>
+  </w:style>
+  <w:style w:type="character" w:customStyle="1" w:styleId="18">
+    <w:name w:val="Endnote Text Char"/>
+    <w:link w:val="11"/>
+    <w:semiHidden/>
+    <w:unhideWhenUsed/>
+    <w:qFormat/>
+    <w:uiPriority w:val="99"/>
+    <w:rPr>
+      <w:sz w:val="20"/>
+      <w:szCs w:val="20"/>
+    </w:rPr>
+  </w:style>
 </w:styles>
+</file>
+
+<file path=word/theme/theme1.xml><?xml version="1.0" encoding="utf-8"?>
+<a:theme xmlns:a="http://schemas.openxmlformats.org/drawingml/2006/main" name="Office">
+  <a:themeElements>
+    <a:clrScheme name="Office">
+      <a:dk1>
+        <a:sysClr val="windowText" lastClr="000000"/>
+      </a:dk1>
+      <a:lt1>
+        <a:sysClr val="window" lastClr="FFFFFF"/>
+      </a:lt1>
+      <a:dk2>
+        <a:srgbClr val="1F497D"/>
+      </a:dk2>
+      <a:lt2>
+        <a:srgbClr val="EEECE1"/>
+      </a:lt2>
+      <a:accent1>
+        <a:srgbClr val="4F81BD"/>
+      </a:accent1>
+      <a:accent2>
+        <a:srgbClr val="C0504D"/>
+      </a:accent2>
+      <a:accent3>
+        <a:srgbClr val="9BBB59"/>
+      </a:accent3>
+      <a:accent4>
+        <a:srgbClr val="8064A2"/>
+      </a:accent4>
+      <a:accent5>
+        <a:srgbClr val="4BACC6"/>
+      </a:accent5>
+      <a:accent6>
+        <a:srgbClr val="F79646"/>
+      </a:accent6>
+      <a:hlink>
+        <a:srgbClr val="0000FF"/>
+      </a:hlink>
+      <a:folHlink>
+        <a:srgbClr val="800080"/>
+      </a:folHlink>
+    </a:clrScheme>
+    <a:fontScheme name="Office">
+      <a:majorFont>
+        <a:latin typeface="Cambria"/>
+        <a:ea typeface=""/>
+        <a:cs typeface=""/>
+        <a:font script="Jpan" typeface="游ゴシック Light"/>
+        <a:font script="Hang" typeface="맑은 고딕"/>
+        <a:font script="Hans" typeface="宋体"/>
+        <a:font script="Hant" typeface="新細明體"/>
+        <a:font script="Arab" typeface="Times New Roman"/>
+        <a:font script="Hebr" typeface="Times New Roman"/>
+        <a:font script="Thai" typeface="Angsana New"/>
+        <a:font script="Ethi" typeface="Nyala"/>
+        <a:font script="Beng" typeface="Vrinda"/>
+        <a:font script="Gujr" typeface="Shruti"/>
+        <a:font script="Khmr" typeface="MoolBoran"/>
+        <a:font script="Knda" typeface="Tunga"/>
+        <a:font script="Guru" typeface="Raavi"/>
+        <a:font script="Cans" typeface="Euphemia"/>
+        <a:font script="Cher" typeface="Plantagenet Cherokee"/>
+        <a:font script="Yiii" typeface="Microsoft Yi Baiti"/>
+        <a:font script="Tibt" typeface="Microsoft Himalaya"/>
+        <a:font script="Thaa" typeface="MV Boli"/>
+        <a:font script="Deva" typeface="Mangal"/>
+        <a:font script="Telu" typeface="Gautami"/>
+        <a:font script="Taml" typeface="Latha"/>
+        <a:font script="Syrc" typeface="Estrangelo Edessa"/>
+        <a:font script="Orya" typeface="Kalinga"/>
+        <a:font script="Mlym" typeface="Kartika"/>
+        <a:font script="Laoo" typeface="DokChampa"/>
+        <a:font script="Sinh" typeface="Iskoola Pota"/>
+        <a:font script="Mong" typeface="Mongolian Baiti"/>
+        <a:font script="Viet" typeface="Times New Roman"/>
+        <a:font script="Uigh" typeface="Microsoft Uighur"/>
+        <a:font script="Geor" typeface="Sylfaen"/>
+      </a:majorFont>
+      <a:minorFont>
+        <a:latin typeface="Calibri"/>
+        <a:ea typeface=""/>
+        <a:cs typeface=""/>
+        <a:font script="Jpan" typeface="游明朝"/>
+        <a:font script="Hang" typeface="맑은 고딕"/>
+        <a:font script="Hans" typeface="宋体"/>
+        <a:font script="Hant" typeface="新細明體"/>
+        <a:font script="Arab" typeface="Arial"/>
+        <a:font script="Hebr" typeface="Arial"/>
+        <a:font script="Thai" typeface="Cordia New"/>
+        <a:font script="Ethi" typeface="Nyala"/>
+        <a:font script="Beng" typeface="Vrinda"/>
+        <a:font script="Gujr" typeface="Shruti"/>
+        <a:font script="Khmr" typeface="DaunPenh"/>
+        <a:font script="Knda" typeface="Tunga"/>
+        <a:font script="Guru" typeface="Raavi"/>
+        <a:font script="Cans" typeface="Euphemia"/>
+        <a:font script="Cher" typeface="Plantagenet Cherokee"/>
+        <a:font script="Yiii" typeface="Microsoft Yi Baiti"/>
+        <a:font script="Tibt" typeface="Microsoft Himalaya"/>
+        <a:font script="Thaa" typeface="MV Boli"/>
+        <a:font script="Deva" typeface="Mangal"/>
+        <a:font script="Telu" typeface="Gautami"/>
+        <a:font script="Taml" typeface="Latha"/>
+        <a:font script="Syrc" typeface="Estrangelo Edessa"/>
+        <a:font script="Orya" typeface="Kalinga"/>
+        <a:font script="Mlym" typeface="Kartika"/>
+        <a:font script="Laoo" typeface="DokChampa"/>
+        <a:font script="Sinh" typeface="Iskoola Pota"/>
+        <a:font script="Mong" typeface="Mongolian Baiti"/>
+        <a:font script="Viet" typeface="Arial"/>
+        <a:font script="Uigh" typeface="Microsoft Uighur"/>
+        <a:font script="Geor" typeface="Sylfaen"/>
+      </a:minorFont>
+    </a:fontScheme>
+    <a:fmtScheme name="Office">
+      <a:fillStyleLst>
+        <a:solidFill>
+          <a:schemeClr val="phClr"/>
+        </a:solidFill>
+        <a:gradFill rotWithShape="1">
+          <a:gsLst>
+            <a:gs pos="0">
+              <a:schemeClr val="phClr">
+                <a:tint val="50000"/>
+                <a:satMod val="300000"/>
+              </a:schemeClr>
+            </a:gs>
+            <a:gs pos="35000">
+              <a:schemeClr val="phClr">
+                <a:tint val="37000"/>
+                <a:satMod val="300000"/>
+              </a:schemeClr>
+            </a:gs>
+            <a:gs pos="100000">
+              <a:schemeClr val="phClr">
+                <a:tint val="15000"/>
+                <a:satMod val="350000"/>
+              </a:schemeClr>
+            </a:gs>
+          </a:gsLst>
+          <a:lin ang="16200000" scaled="1"/>
+        </a:gradFill>
+        <a:gradFill rotWithShape="1">
+          <a:gsLst>
+            <a:gs pos="0">
+              <a:schemeClr val="phClr">
+                <a:shade val="51000"/>
+                <a:satMod val="130000"/>
+              </a:schemeClr>
+            </a:gs>
+            <a:gs pos="80000">
+              <a:schemeClr val="phClr">
+                <a:shade val="93000"/>
+                <a:satMod val="130000"/>
+              </a:schemeClr>
+            </a:gs>
+            <a:gs pos="100000">
+              <a:schemeClr val="phClr">
+                <a:shade val="94000"/>
+                <a:satMod val="135000"/>
+              </a:schemeClr>
+            </a:gs>
+          </a:gsLst>
+          <a:lin ang="16200000" scaled="0"/>
+        </a:gradFill>
+      </a:fillStyleLst>
+      <a:lnStyleLst>
+        <a:ln w="9525" cap="flat" cmpd="sng" algn="ctr">
+          <a:solidFill>
+            <a:schemeClr val="phClr">
+              <a:shade val="95000"/>
+              <a:satMod val="105000"/>
+            </a:schemeClr>
+          </a:solidFill>
+          <a:prstDash val="solid"/>
+        </a:ln>
+        <a:ln w="25400" cap="flat" cmpd="sng" algn="ctr">
+          <a:solidFill>
+            <a:schemeClr val="phClr"/>
+          </a:solidFill>
+          <a:prstDash val="solid"/>
+        </a:ln>
+        <a:ln w="38100" cap="flat" cmpd="sng" algn="ctr">
+          <a:solidFill>
+            <a:schemeClr val="phClr"/>
+          </a:solidFill>
+          <a:prstDash val="solid"/>
+        </a:ln>
+      </a:lnStyleLst>
+      <a:effectStyleLst>
+        <a:effectStyle>
+          <a:effectLst>
+            <a:outerShdw blurRad="40000" dist="20000" dir="5400000" rotWithShape="0">
+              <a:srgbClr val="000000">
+                <a:alpha val="38000"/>
+              </a:srgbClr>
+            </a:outerShdw>
+          </a:effectLst>
+        </a:effectStyle>
+        <a:effectStyle>
+          <a:effectLst>
+            <a:outerShdw blurRad="40000" dist="23000" dir="5400000" rotWithShape="0">
+              <a:srgbClr val="000000">
+                <a:alpha val="35000"/>
+              </a:srgbClr>
+            </a:outerShdw>
+          </a:effectLst>
+        </a:effectStyle>
+        <a:effectStyle>
+          <a:effectLst>
+            <a:outerShdw blurRad="40000" dist="23000" dir="5400000" rotWithShape="0">
+              <a:srgbClr val="000000">
+                <a:alpha val="35000"/>
+              </a:srgbClr>
+            </a:outerShdw>
+          </a:effectLst>
+          <a:scene3d>
+            <a:camera prst="orthographicFront">
+              <a:rot lat="0" lon="0" rev="0"/>
+            </a:camera>
+            <a:lightRig rig="threePt" dir="t">
+              <a:rot lat="0" lon="0" rev="1200000"/>
+            </a:lightRig>
+          </a:scene3d>
+          <a:sp3d>
+            <a:bevelT w="63500" h="25400"/>
+          </a:sp3d>
+        </a:effectStyle>
+      </a:effectStyleLst>
+      <a:bgFillStyleLst>
+        <a:solidFill>
+          <a:schemeClr val="phClr"/>
+        </a:solidFill>
+        <a:gradFill rotWithShape="1">
+          <a:gsLst>
+            <a:gs pos="0">
+              <a:schemeClr val="phClr">
+                <a:tint val="40000"/>
+                <a:satMod val="350000"/>
+              </a:schemeClr>
+            </a:gs>
+            <a:gs pos="40000">
+              <a:schemeClr val="phClr">
+                <a:tint val="45000"/>
+                <a:satMod val="350000"/>
+                <a:shade val="99000"/>
+              </a:schemeClr>
+            </a:gs>
+            <a:gs pos="100000">
+              <a:schemeClr val="phClr">
+                <a:shade val="20000"/>
+                <a:satMod val="255000"/>
+              </a:schemeClr>
+            </a:gs>
+          </a:gsLst>
+          <a:path path="circle">
+            <a:fillToRect l="50000" t="-80000" r="50000" b="180000"/>
+          </a:path>
+        </a:gradFill>
+        <a:gradFill rotWithShape="1">
+          <a:gsLst>
+            <a:gs pos="0">
+              <a:schemeClr val="phClr">
+                <a:tint val="80000"/>
+                <a:satMod val="300000"/>
+              </a:schemeClr>
+            </a:gs>
+            <a:gs pos="100000">
+              <a:schemeClr val="phClr">
+                <a:shade val="30000"/>
+                <a:satMod val="200000"/>
+              </a:schemeClr>
+            </a:gs>
+          </a:gsLst>
+          <a:path path="circle">
+            <a:fillToRect l="50000" t="50000" r="50000" b="50000"/>
+          </a:path>
+        </a:gradFill>
+      </a:bgFillStyleLst>
+    </a:fmtScheme>
+  </a:themeElements>
+  <a:objectDefaults/>
+</a:theme>
 </file>
</xml_diff>